<commit_message>
Updated report - background research
</commit_message>
<xml_diff>
--- a/report.docx
+++ b/report.docx
@@ -1359,6 +1359,11 @@
         <w:rPr>
           <w:noProof/>
         </w:rPr>
+      </w:r>
+      <w:r>
+        <w:rPr>
+          <w:noProof/>
+        </w:rPr>
         <w:fldChar w:fldCharType="separate"/>
       </w:r>
       <w:r>
@@ -1870,7 +1875,7 @@
       </w:r>
       <w:bookmarkEnd w:id="3"/>
       <w:r>
-        <w:t>Introduction and Background Research</w:t>
+        <w:t>Introduction</w:t>
       </w:r>
     </w:p>
     <w:p>
@@ -2025,14 +2030,13 @@
         </w:numPr>
       </w:pPr>
       <w:r>
-        <w:t>Introduction</w:t>
+        <w:t>Outline</w:t>
       </w:r>
     </w:p>
     <w:p>
       <w:pPr>
         <w:pStyle w:val="font-claude-response-body"/>
         <w:spacing w:line="360" w:lineRule="auto"/>
-        <w:ind w:left="540"/>
         <w:rPr>
           <w:rFonts w:ascii="Arial" w:hAnsi="Arial" w:cs="Arial"/>
           <w:sz w:val="22"/>
@@ -2061,55 +2065,7 @@
           <w:sz w:val="22"/>
           <w:szCs w:val="22"/>
         </w:rPr>
-        <w:t xml:space="preserve">ome prefer aggressive attacks and material sacrifices, while others </w:t>
-      </w:r>
-      <w:r>
-        <w:rPr>
-          <w:rFonts w:ascii="Arial" w:hAnsi="Arial" w:cs="Arial"/>
-          <w:sz w:val="22"/>
-          <w:szCs w:val="22"/>
-        </w:rPr>
-        <w:t>favour</w:t>
-      </w:r>
-      <w:r>
-        <w:rPr>
-          <w:rFonts w:ascii="Arial" w:hAnsi="Arial" w:cs="Arial"/>
-          <w:sz w:val="22"/>
-          <w:szCs w:val="22"/>
-        </w:rPr>
-        <w:t xml:space="preserve"> patient </w:t>
-      </w:r>
-      <w:r>
-        <w:rPr>
-          <w:rFonts w:ascii="Arial" w:hAnsi="Arial" w:cs="Arial"/>
-          <w:sz w:val="22"/>
-          <w:szCs w:val="22"/>
-        </w:rPr>
-        <w:t>manoeuvring</w:t>
-      </w:r>
-      <w:r>
-        <w:rPr>
-          <w:rFonts w:ascii="Arial" w:hAnsi="Arial" w:cs="Arial"/>
-          <w:sz w:val="22"/>
-          <w:szCs w:val="22"/>
-        </w:rPr>
-        <w:t xml:space="preserve"> and solid defensive structures. However, </w:t>
-      </w:r>
-      <w:r>
-        <w:rPr>
-          <w:rFonts w:ascii="Arial" w:hAnsi="Arial" w:cs="Arial"/>
-          <w:sz w:val="22"/>
-          <w:szCs w:val="22"/>
-        </w:rPr>
-        <w:t>analysing</w:t>
-      </w:r>
-      <w:r>
-        <w:rPr>
-          <w:rFonts w:ascii="Arial" w:hAnsi="Arial" w:cs="Arial"/>
-          <w:sz w:val="22"/>
-          <w:szCs w:val="22"/>
-        </w:rPr>
-        <w:t xml:space="preserve"> a player's style </w:t>
+        <w:t xml:space="preserve">ome prefer aggressive attacks and material sacrifices, while others favour patient manoeuvring and solid defensive structures. However, analysing a player's style </w:t>
       </w:r>
       <w:r>
         <w:rPr>
@@ -2132,7 +2088,6 @@
       <w:pPr>
         <w:pStyle w:val="font-claude-response-body"/>
         <w:spacing w:line="360" w:lineRule="auto"/>
-        <w:ind w:left="540"/>
         <w:rPr>
           <w:rFonts w:ascii="Arial" w:hAnsi="Arial" w:cs="Arial"/>
           <w:sz w:val="22"/>
@@ -2223,80 +2178,85 @@
           <w:sz w:val="22"/>
           <w:szCs w:val="22"/>
         </w:rPr>
-        <w:t xml:space="preserve">where billions of possible positions exist and the "best" move often depends on context rather than fixed rules. This involves designing algorithms that can </w:t>
-      </w:r>
-      <w:r>
-        <w:rPr>
-          <w:rFonts w:ascii="Arial" w:hAnsi="Arial" w:cs="Arial"/>
-          <w:sz w:val="22"/>
-          <w:szCs w:val="22"/>
-        </w:rPr>
-        <w:t>analyse</w:t>
-      </w:r>
-      <w:r>
-        <w:rPr>
-          <w:rFonts w:ascii="Arial" w:hAnsi="Arial" w:cs="Arial"/>
-          <w:sz w:val="22"/>
-          <w:szCs w:val="22"/>
-        </w:rPr>
-        <w:t xml:space="preserve"> thousands of games, identify consistent </w:t>
-      </w:r>
-      <w:r>
-        <w:rPr>
-          <w:rFonts w:ascii="Arial" w:hAnsi="Arial" w:cs="Arial"/>
-          <w:sz w:val="22"/>
-          <w:szCs w:val="22"/>
-        </w:rPr>
-        <w:t>behavioural</w:t>
-      </w:r>
-      <w:r>
-        <w:rPr>
-          <w:rFonts w:ascii="Arial" w:hAnsi="Arial" w:cs="Arial"/>
-          <w:sz w:val="22"/>
-          <w:szCs w:val="22"/>
-        </w:rPr>
-        <w:t xml:space="preserve"> patterns across different situations, and classify them into distinct style categories, all while handling the challenge that the same player might employ different styles in different games.</w:t>
+        <w:t>where billions of possible positions exist and the "best" move often depends on context rather than fixed rules. This involves designing algorithms that can analyse thousands of games, identify consistent behavioural patterns across different situations, and classify them into distinct style categories, all while handling the challenge that the same player might employ different styles in different games.</w:t>
       </w:r>
     </w:p>
     <w:p>
       <w:pPr>
         <w:pStyle w:val="font-claude-response-body"/>
         <w:spacing w:line="360" w:lineRule="auto"/>
+        <w:rPr>
+          <w:rFonts w:ascii="Arial" w:hAnsi="Arial" w:cs="Arial"/>
+          <w:sz w:val="22"/>
+          <w:szCs w:val="22"/>
+        </w:rPr>
+      </w:pPr>
+      <w:r>
+        <w:rPr>
+          <w:rFonts w:ascii="Arial" w:hAnsi="Arial" w:cs="Arial"/>
+          <w:sz w:val="22"/>
+          <w:szCs w:val="22"/>
+        </w:rPr>
+        <w:t>The goal is to create a practical tool that allows average chess players to understand their own playing tendencies without needing expert analysis or deep technical knowledge. This project addresses a real-world need by making style analysis accessible, moving beyond existing chess tools that focus primarily on finding the strongest moves rather than understanding human playing patterns.</w:t>
+      </w:r>
+    </w:p>
+    <w:p/>
+    <w:p>
+      <w:pPr>
+        <w:pStyle w:val="Heading1"/>
+      </w:pPr>
+      <w:r>
+        <w:lastRenderedPageBreak/>
+        <w:t>Chapter 2</w:t>
+      </w:r>
+      <w:r>
+        <w:br/>
+      </w:r>
+      <w:r>
+        <w:t>Background Research</w:t>
+      </w:r>
+    </w:p>
+    <w:p>
+      <w:pPr>
+        <w:pStyle w:val="ListParagraph"/>
         <w:ind w:left="540"/>
         <w:rPr>
-          <w:rFonts w:ascii="Arial" w:hAnsi="Arial" w:cs="Arial"/>
-          <w:sz w:val="22"/>
-          <w:szCs w:val="22"/>
-        </w:rPr>
-      </w:pPr>
-      <w:r>
-        <w:rPr>
-          <w:rFonts w:ascii="Arial" w:hAnsi="Arial" w:cs="Arial"/>
-          <w:sz w:val="22"/>
-          <w:szCs w:val="22"/>
-        </w:rPr>
-        <w:t>The goal is to create a practical tool that allows average chess players to understand their own playing tendencies without needing expert analysis or deep technical knowledge. This project addresses a real-world need by making style analysis accessible, moving beyond existing chess tools that focus primarily on finding the strongest moves rather than understanding human playing patterns.</w:t>
-      </w:r>
-    </w:p>
-    <w:p/>
-    <w:p>
-      <w:pPr>
-        <w:pStyle w:val="Heading2"/>
+          <w:sz w:val="22"/>
+          <w:szCs w:val="18"/>
+        </w:rPr>
+      </w:pPr>
+      <w:r>
+        <w:rPr>
+          <w:sz w:val="22"/>
+          <w:szCs w:val="18"/>
+        </w:rPr>
+        <w:t>The challenge of automatically identifying chess playing styles has been approached from several angles in prior research, each with distinct methodologies and limitations.</w:t>
+      </w:r>
+    </w:p>
+    <w:p>
+      <w:pPr>
+        <w:ind w:left="540"/>
+      </w:pPr>
+    </w:p>
+    <w:p>
+      <w:pPr>
+        <w:pStyle w:val="Heading3"/>
         <w:numPr>
           <w:ilvl w:val="1"/>
-          <w:numId w:val="21"/>
+          <w:numId w:val="22"/>
         </w:numPr>
       </w:pPr>
       <w:r>
-        <w:lastRenderedPageBreak/>
-        <w:t>Background Research</w:t>
+        <w:t xml:space="preserve">Previous </w:t>
+      </w:r>
+      <w:r>
+        <w:t>Clustering and Classification Approaches</w:t>
       </w:r>
     </w:p>
     <w:p>
       <w:pPr>
         <w:pStyle w:val="ListParagraph"/>
-        <w:spacing w:line="360" w:lineRule="auto"/>
-        <w:ind w:left="540"/>
+        <w:ind w:left="0"/>
         <w:rPr>
           <w:sz w:val="22"/>
           <w:szCs w:val="18"/>
@@ -2307,73 +2267,567 @@
           <w:sz w:val="22"/>
           <w:szCs w:val="18"/>
         </w:rPr>
-        <w:t>The challenge of automatically identifying chess playing styles has been approached from several angles in prior research, each with distinct methodologies and limitations.</w:t>
-      </w:r>
-    </w:p>
-    <w:p>
-      <w:pPr>
-        <w:ind w:left="540"/>
+        <w:t xml:space="preserve">Jayasekara (2018) demonstrated that distinct playing styles in chess are computationally differentiable through machine learning techniques. By </w:t>
+      </w:r>
+      <w:r>
+        <w:rPr>
+          <w:sz w:val="22"/>
+          <w:szCs w:val="18"/>
+        </w:rPr>
+        <w:t>analysing</w:t>
+      </w:r>
+      <w:r>
+        <w:rPr>
+          <w:sz w:val="22"/>
+          <w:szCs w:val="18"/>
+        </w:rPr>
+        <w:t xml:space="preserve"> games from top-level players, the research showed that clustering methods could successfully group games according to playing styles, with classification algorithms including Logistic Regression, Naïve Bayes, and Random Forest achieving accurate mappings between extracted features and predetermined style categories. This work established the feasibility of automated style classification and </w:t>
+      </w:r>
+      <w:r>
+        <w:rPr>
+          <w:sz w:val="22"/>
+          <w:szCs w:val="18"/>
+        </w:rPr>
+        <w:t>showed</w:t>
+      </w:r>
+      <w:r>
+        <w:rPr>
+          <w:sz w:val="22"/>
+          <w:szCs w:val="18"/>
+        </w:rPr>
+        <w:t xml:space="preserve"> that Random Forest classifiers are particularly effective for this task. However, Jayasekara's approach relied on assumed playing styles for professional players rather than developing a systematic </w:t>
+      </w:r>
+      <w:r>
+        <w:rPr>
+          <w:sz w:val="22"/>
+          <w:szCs w:val="18"/>
+        </w:rPr>
+        <w:t>labelling</w:t>
+      </w:r>
+      <w:r>
+        <w:rPr>
+          <w:sz w:val="22"/>
+          <w:szCs w:val="18"/>
+        </w:rPr>
+        <w:t xml:space="preserve"> </w:t>
+      </w:r>
+      <w:r>
+        <w:rPr>
+          <w:sz w:val="22"/>
+          <w:szCs w:val="18"/>
+        </w:rPr>
+        <w:t>methodology and</w:t>
+      </w:r>
+      <w:r>
+        <w:rPr>
+          <w:sz w:val="22"/>
+          <w:szCs w:val="18"/>
+        </w:rPr>
+        <w:t xml:space="preserve"> did not address how such systems could be deployed for average players seeking to understand their own styles.</w:t>
+      </w:r>
+    </w:p>
+    <w:p>
+      <w:pPr>
+        <w:pStyle w:val="ListParagraph"/>
+        <w:rPr>
+          <w:sz w:val="22"/>
+          <w:szCs w:val="18"/>
+        </w:rPr>
       </w:pPr>
     </w:p>
     <w:p>
       <w:pPr>
         <w:pStyle w:val="Heading3"/>
         <w:numPr>
-          <w:ilvl w:val="2"/>
-          <w:numId w:val="21"/>
+          <w:ilvl w:val="1"/>
+          <w:numId w:val="22"/>
         </w:numPr>
       </w:pPr>
       <w:r>
-        <w:t xml:space="preserve">Previous </w:t>
-      </w:r>
-      <w:r>
-        <w:t>Clustering and Classification Approaches</w:t>
+        <w:t>Feature Engineering</w:t>
       </w:r>
     </w:p>
     <w:p>
       <w:pPr>
         <w:pStyle w:val="ListParagraph"/>
-      </w:pPr>
-      <w:r>
-        <w:t>Jayasekara (</w:t>
-      </w:r>
-      <w:r>
-        <w:t>2018</w:t>
-      </w:r>
-      <w:r>
-        <w:t>)</w:t>
-      </w:r>
-      <w:r>
-        <w:t xml:space="preserve"> </w:t>
-      </w:r>
-      <w:r>
-        <w:t xml:space="preserve">demonstrated that distinct playing styles in chess are computationally differentiable through machine learning techniques. By </w:t>
-      </w:r>
-      <w:r>
-        <w:t>analysing</w:t>
-      </w:r>
-      <w:r>
-        <w:t xml:space="preserve"> games from top-level players, the research showed that clustering methods could successfully group games according to playing styles, with classification algorithms including Logistic Regression, Naïve Bayes, and Random Forest achieving accurate mappings between extracted features and predetermined style categories. This work established the feasibility of automated style classification and </w:t>
-      </w:r>
-      <w:r>
-        <w:t>showed</w:t>
-      </w:r>
-      <w:r>
-        <w:t xml:space="preserve"> that Random Forest classifiers are particularly effective for this task. However, Jayasekara's approach relied on assumed playing styles for professional players rather than developing a systematic </w:t>
-      </w:r>
-      <w:r>
-        <w:t>labelling</w:t>
-      </w:r>
-      <w:r>
-        <w:t xml:space="preserve"> </w:t>
-      </w:r>
-      <w:proofErr w:type="gramStart"/>
-      <w:r>
-        <w:t>methodology, and</w:t>
-      </w:r>
-      <w:proofErr w:type="gramEnd"/>
-      <w:r>
-        <w:t xml:space="preserve"> did not address how such systems could be deployed for average players seeking to understand their own styles.</w:t>
+        <w:ind w:left="0"/>
+        <w:rPr>
+          <w:sz w:val="22"/>
+          <w:szCs w:val="18"/>
+        </w:rPr>
+      </w:pPr>
+      <w:r>
+        <w:rPr>
+          <w:sz w:val="22"/>
+          <w:szCs w:val="18"/>
+        </w:rPr>
+        <w:t>When applying machine learning to chess style analysis, a fundamental challenge is determining the characteristics in a game are meaningful in relation to playing styles. Feature engineering aims to extract quantifiable attributes from raw game data and will help us in tackling this problem.</w:t>
+      </w:r>
+    </w:p>
+    <w:p>
+      <w:pPr>
+        <w:rPr>
+          <w:sz w:val="22"/>
+          <w:szCs w:val="18"/>
+        </w:rPr>
+      </w:pPr>
+      <w:r>
+        <w:rPr>
+          <w:sz w:val="22"/>
+          <w:szCs w:val="18"/>
+        </w:rPr>
+        <w:t>Traditional chess engines rel</w:t>
+      </w:r>
+      <w:r>
+        <w:rPr>
+          <w:sz w:val="22"/>
+          <w:szCs w:val="18"/>
+        </w:rPr>
+        <w:t>y</w:t>
+      </w:r>
+      <w:r>
+        <w:rPr>
+          <w:sz w:val="22"/>
+          <w:szCs w:val="18"/>
+        </w:rPr>
+        <w:t xml:space="preserve"> heavily on hand-crafted evaluation functions developed by experts. </w:t>
+      </w:r>
+      <w:r>
+        <w:rPr>
+          <w:sz w:val="22"/>
+          <w:szCs w:val="18"/>
+        </w:rPr>
+        <w:t>Silver et al. (2018)</w:t>
+      </w:r>
+      <w:r>
+        <w:rPr>
+          <w:sz w:val="22"/>
+          <w:szCs w:val="18"/>
+        </w:rPr>
+        <w:t xml:space="preserve"> noted that "state-of-the-art programs are based on powerful engines that search many millions of positions, leveraging handcrafted domain expertise and sophisticated domain adaptations.</w:t>
+      </w:r>
+      <w:r>
+        <w:rPr>
+          <w:sz w:val="22"/>
+          <w:szCs w:val="18"/>
+        </w:rPr>
+        <w:t>”</w:t>
+      </w:r>
+      <w:r>
+        <w:rPr>
+          <w:sz w:val="22"/>
+          <w:szCs w:val="18"/>
+        </w:rPr>
+        <w:t xml:space="preserve"> These systems required chess masters to manually encode positional concepts such as </w:t>
+      </w:r>
+      <w:r>
+        <w:rPr>
+          <w:sz w:val="22"/>
+          <w:szCs w:val="18"/>
+        </w:rPr>
+        <w:t>cent</w:t>
+      </w:r>
+      <w:r>
+        <w:rPr>
+          <w:sz w:val="22"/>
+          <w:szCs w:val="18"/>
+        </w:rPr>
+        <w:t>re</w:t>
+      </w:r>
+      <w:r>
+        <w:rPr>
+          <w:sz w:val="22"/>
+          <w:szCs w:val="18"/>
+        </w:rPr>
+        <w:t xml:space="preserve"> control, king safety, and pawn structure into explicit</w:t>
+      </w:r>
+      <w:r>
+        <w:rPr>
+          <w:sz w:val="22"/>
+          <w:szCs w:val="18"/>
+        </w:rPr>
+        <w:t xml:space="preserve">, quantifiable </w:t>
+      </w:r>
+      <w:r>
+        <w:rPr>
+          <w:sz w:val="22"/>
+          <w:szCs w:val="18"/>
+        </w:rPr>
+        <w:t>features. While effective for engine strength, this approach present</w:t>
+      </w:r>
+      <w:r>
+        <w:rPr>
+          <w:sz w:val="22"/>
+          <w:szCs w:val="18"/>
+        </w:rPr>
+        <w:t>s</w:t>
+      </w:r>
+      <w:r>
+        <w:rPr>
+          <w:sz w:val="22"/>
+          <w:szCs w:val="18"/>
+        </w:rPr>
+        <w:t xml:space="preserve"> limitations for style classification, as it </w:t>
+      </w:r>
+      <w:r>
+        <w:rPr>
+          <w:sz w:val="22"/>
+          <w:szCs w:val="18"/>
+        </w:rPr>
+        <w:t>is applied in the context of</w:t>
+      </w:r>
+      <w:r>
+        <w:rPr>
+          <w:sz w:val="22"/>
+          <w:szCs w:val="18"/>
+        </w:rPr>
+        <w:t xml:space="preserve"> objective evaluation over </w:t>
+      </w:r>
+      <w:r>
+        <w:rPr>
+          <w:sz w:val="22"/>
+          <w:szCs w:val="18"/>
+        </w:rPr>
+        <w:t>behavioural</w:t>
+      </w:r>
+      <w:r>
+        <w:rPr>
+          <w:sz w:val="22"/>
+          <w:szCs w:val="18"/>
+        </w:rPr>
+        <w:t xml:space="preserve"> characteri</w:t>
+      </w:r>
+      <w:r>
+        <w:rPr>
+          <w:sz w:val="22"/>
+          <w:szCs w:val="18"/>
+        </w:rPr>
+        <w:t>sa</w:t>
+      </w:r>
+      <w:r>
+        <w:rPr>
+          <w:sz w:val="22"/>
+          <w:szCs w:val="18"/>
+        </w:rPr>
+        <w:t>tion</w:t>
+      </w:r>
+      <w:r>
+        <w:rPr>
+          <w:sz w:val="22"/>
+          <w:szCs w:val="18"/>
+        </w:rPr>
+        <w:t>.</w:t>
+      </w:r>
+      <w:r>
+        <w:rPr>
+          <w:sz w:val="22"/>
+          <w:szCs w:val="18"/>
+        </w:rPr>
+        <w:t xml:space="preserve"> However, despite the different use case, there still exists a subset of features from the ones used in chess engines that can provide play style insights.</w:t>
+      </w:r>
+    </w:p>
+    <w:p>
+      <w:pPr>
+        <w:rPr>
+          <w:sz w:val="22"/>
+          <w:szCs w:val="18"/>
+        </w:rPr>
+      </w:pPr>
+    </w:p>
+    <w:p>
+      <w:pPr>
+        <w:pStyle w:val="Heading3"/>
+        <w:numPr>
+          <w:ilvl w:val="1"/>
+          <w:numId w:val="22"/>
+        </w:numPr>
+      </w:pPr>
+      <w:r>
+        <w:t>Feature Design for Style Classification</w:t>
+      </w:r>
+    </w:p>
+    <w:p>
+      <w:pPr>
+        <w:rPr>
+          <w:sz w:val="22"/>
+          <w:szCs w:val="18"/>
+        </w:rPr>
+      </w:pPr>
+      <w:r>
+        <w:rPr>
+          <w:sz w:val="22"/>
+          <w:szCs w:val="18"/>
+        </w:rPr>
+        <w:t xml:space="preserve">Research specifically targeting playing style has developed features that characterize decision-making tendencies rather than position quality. A predictive modelling study extracted eight distinct features to differentiate styles among elite players including Magnus Carlsen, Hikaru Nakamura, and Garry Kasparov (Aniketh Kalagara, 2024). These features ranged from game length (distinguishing patient players who prefer lengthy strategic battles from those seeking quick tactical victories) to trade frequency (capturing willingness to simplify positions versus maintaining tension). The research successfully trained models to distinguish between players, establishing that behavioural features could serve as effective style discriminators. </w:t>
+      </w:r>
+    </w:p>
+    <w:p>
+      <w:pPr>
+        <w:rPr>
+          <w:sz w:val="22"/>
+          <w:szCs w:val="18"/>
+        </w:rPr>
+      </w:pPr>
+      <w:r>
+        <w:rPr>
+          <w:sz w:val="22"/>
+          <w:szCs w:val="18"/>
+        </w:rPr>
+        <w:t>A key difference to observe here is that the mentioned research focuses on a selected five players, all of whom are well-known grandmasters at the very upper echelons of chess skill, while this project uses games from random players to attempt to create a more relatable model.</w:t>
+      </w:r>
+    </w:p>
+    <w:p>
+      <w:pPr>
+        <w:rPr>
+          <w:sz w:val="22"/>
+          <w:szCs w:val="18"/>
+        </w:rPr>
+      </w:pPr>
+    </w:p>
+    <w:p>
+      <w:pPr>
+        <w:pStyle w:val="Heading3"/>
+      </w:pPr>
+      <w:r>
+        <w:t>2.4</w:t>
+      </w:r>
+      <w:r>
+        <w:tab/>
+      </w:r>
+      <w:r>
+        <w:tab/>
+        <w:t>Learned Representation</w:t>
+      </w:r>
+    </w:p>
+    <w:p>
+      <w:pPr>
+        <w:rPr>
+          <w:sz w:val="22"/>
+          <w:szCs w:val="18"/>
+        </w:rPr>
+      </w:pPr>
+      <w:r>
+        <w:rPr>
+          <w:sz w:val="22"/>
+          <w:szCs w:val="18"/>
+        </w:rPr>
+        <w:t>The development of</w:t>
+      </w:r>
+      <w:r>
+        <w:rPr>
+          <w:sz w:val="22"/>
+          <w:szCs w:val="18"/>
+        </w:rPr>
+        <w:t xml:space="preserve"> the chess engine</w:t>
+      </w:r>
+      <w:r>
+        <w:rPr>
+          <w:sz w:val="22"/>
+          <w:szCs w:val="18"/>
+        </w:rPr>
+        <w:t xml:space="preserve"> AlphaZero marked a paradigm shift away from hand-crafted features toward learned representations. Unlike traditional engines requiring explicit feature engineering, AlphaZero achieved superhuman performance "starting from random play, and given no domain knowledge except the game rules"</w:t>
+      </w:r>
+      <w:r>
+        <w:rPr>
+          <w:sz w:val="22"/>
+          <w:szCs w:val="18"/>
+        </w:rPr>
+        <w:t xml:space="preserve"> (Technology Networks, 2018)</w:t>
+      </w:r>
+      <w:r>
+        <w:rPr>
+          <w:sz w:val="22"/>
+          <w:szCs w:val="18"/>
+        </w:rPr>
+        <w:t>. Through self-play and deep reinforcement learning, it automatically discovered relevant positional concepts without human intervention, eliminating the need for explicit feature design.</w:t>
+      </w:r>
+    </w:p>
+    <w:p>
+      <w:pPr>
+        <w:rPr>
+          <w:sz w:val="22"/>
+          <w:szCs w:val="18"/>
+        </w:rPr>
+      </w:pPr>
+      <w:r>
+        <w:rPr>
+          <w:sz w:val="22"/>
+          <w:szCs w:val="18"/>
+        </w:rPr>
+        <w:t>Like before</w:t>
+      </w:r>
+      <w:r>
+        <w:rPr>
+          <w:sz w:val="22"/>
+          <w:szCs w:val="18"/>
+        </w:rPr>
+        <w:t xml:space="preserve">, this approach targets optimal play rather than human style characterization. The Maia Chess project </w:t>
+      </w:r>
+      <w:r>
+        <w:rPr>
+          <w:sz w:val="22"/>
+          <w:szCs w:val="18"/>
+        </w:rPr>
+        <w:t xml:space="preserve">from </w:t>
+      </w:r>
+      <w:r>
+        <w:rPr>
+          <w:sz w:val="22"/>
+          <w:szCs w:val="18"/>
+        </w:rPr>
+        <w:t>McIlroy-Young et al.</w:t>
+      </w:r>
+      <w:r>
+        <w:rPr>
+          <w:sz w:val="22"/>
+          <w:szCs w:val="18"/>
+        </w:rPr>
+        <w:t xml:space="preserve"> (2020) </w:t>
+      </w:r>
+      <w:r>
+        <w:rPr>
+          <w:sz w:val="22"/>
+          <w:szCs w:val="18"/>
+        </w:rPr>
+        <w:t xml:space="preserve">adapted AlphaZero's deep learning architecture specifically for </w:t>
+      </w:r>
+      <w:r>
+        <w:rPr>
+          <w:sz w:val="22"/>
+          <w:szCs w:val="18"/>
+        </w:rPr>
+        <w:t>modelling</w:t>
+      </w:r>
+      <w:r>
+        <w:rPr>
+          <w:sz w:val="22"/>
+          <w:szCs w:val="18"/>
+        </w:rPr>
+        <w:t xml:space="preserve"> human </w:t>
+      </w:r>
+      <w:r>
+        <w:rPr>
+          <w:sz w:val="22"/>
+          <w:szCs w:val="18"/>
+        </w:rPr>
+        <w:t>behaviour</w:t>
+      </w:r>
+      <w:r>
+        <w:rPr>
+          <w:sz w:val="22"/>
+          <w:szCs w:val="18"/>
+        </w:rPr>
+        <w:t>, training separate neural networks on games from players at different rating level</w:t>
+      </w:r>
+      <w:r>
+        <w:rPr>
+          <w:sz w:val="22"/>
+          <w:szCs w:val="18"/>
+        </w:rPr>
+        <w:t>s</w:t>
+      </w:r>
+      <w:r>
+        <w:rPr>
+          <w:sz w:val="22"/>
+          <w:szCs w:val="18"/>
+        </w:rPr>
+        <w:t xml:space="preserve">. Rather than hand-crafting features, Maia learned representations directly from millions of human games, achieving significantly higher accuracy in predicting human moves than traditional engines. This demonstrated that neural networks could capture subtle </w:t>
+      </w:r>
+      <w:r>
+        <w:rPr>
+          <w:sz w:val="22"/>
+          <w:szCs w:val="18"/>
+        </w:rPr>
+        <w:t>behavioural</w:t>
+      </w:r>
+      <w:r>
+        <w:rPr>
+          <w:sz w:val="22"/>
+          <w:szCs w:val="18"/>
+        </w:rPr>
+        <w:t xml:space="preserve"> patterns without explicit feature engineering, though at the cost of model interpretability.</w:t>
+      </w:r>
+    </w:p>
+    <w:p>
+      <w:pPr>
+        <w:rPr>
+          <w:sz w:val="22"/>
+          <w:szCs w:val="18"/>
+        </w:rPr>
+      </w:pPr>
+    </w:p>
+    <w:p>
+      <w:pPr>
+        <w:pStyle w:val="Heading3"/>
+      </w:pPr>
+      <w:r>
+        <w:lastRenderedPageBreak/>
+        <w:t>2.5</w:t>
+      </w:r>
+      <w:r>
+        <w:tab/>
+      </w:r>
+      <w:r>
+        <w:tab/>
+        <w:t xml:space="preserve"> Practical Considerations</w:t>
+      </w:r>
+    </w:p>
+    <w:p>
+      <w:pPr>
+        <w:rPr>
+          <w:sz w:val="22"/>
+          <w:szCs w:val="18"/>
+        </w:rPr>
+      </w:pPr>
+      <w:r>
+        <w:rPr>
+          <w:sz w:val="22"/>
+          <w:szCs w:val="18"/>
+        </w:rPr>
+        <w:t>For this project we must consider the implications of our approach. Should we select hand-crafted feature engineering, we gain interpretability since we can identify which behaviour patterns distinguish play styles. On the other hand, learned representations with neural networks may provide better accuracy and be able detect more subtle behaviour patterns that are not caught by experts. The downside is that it introduces a ‘black box’ because we are unable to interpret these patterns.</w:t>
+      </w:r>
+    </w:p>
+    <w:p>
+      <w:pPr>
+        <w:rPr>
+          <w:sz w:val="22"/>
+          <w:szCs w:val="18"/>
+        </w:rPr>
+      </w:pPr>
+      <w:r>
+        <w:rPr>
+          <w:sz w:val="22"/>
+          <w:szCs w:val="18"/>
+        </w:rPr>
+        <w:t xml:space="preserve">Another consideration we must address is that of computational power. This project will be conducted on limited hardware compared to that of other projects such as the Maia Chess project. </w:t>
+      </w:r>
+      <w:r>
+        <w:rPr>
+          <w:sz w:val="22"/>
+          <w:szCs w:val="18"/>
+        </w:rPr>
+        <w:t xml:space="preserve">What this means is that we could potentially be forced to sacrifice some accuracy </w:t>
+      </w:r>
+      <w:r>
+        <w:rPr>
+          <w:sz w:val="22"/>
+          <w:szCs w:val="18"/>
+        </w:rPr>
+        <w:t>to</w:t>
+      </w:r>
+      <w:r>
+        <w:rPr>
+          <w:sz w:val="22"/>
+          <w:szCs w:val="18"/>
+        </w:rPr>
+        <w:t xml:space="preserve"> keep the project within a reasonable scope, and the results of certain approaches will yield results that are affected by our constraint of processing power.</w:t>
+      </w:r>
+      <w:r>
+        <w:rPr>
+          <w:sz w:val="22"/>
+          <w:szCs w:val="18"/>
+        </w:rPr>
+        <w:t xml:space="preserve"> For example, training the model on games using a chess engine on a higher depth would grant access to a more accurate set of best possible moves but would take a significantly longer amount of time. Even inputting more games into the pre-processing pipeline would give more reliable results but would take longer than this project warrants.</w:t>
       </w:r>
     </w:p>
     <w:p>
@@ -2386,7 +2840,10 @@
       <w:bookmarkStart w:id="7" w:name="_Toc407145094"/>
       <w:r>
         <w:lastRenderedPageBreak/>
-        <w:t>Chapter 2</w:t>
+        <w:t xml:space="preserve">Chapter </w:t>
+      </w:r>
+      <w:r>
+        <w:t>3</w:t>
       </w:r>
       <w:r>
         <w:br/>
@@ -3070,7 +3527,7 @@
           <v:shape id="_x0000_i1025" type="#_x0000_t75" alt="" style="width:199.5pt;height:93.75pt;mso-width-percent:0;mso-height-percent:0;mso-width-percent:0;mso-height-percent:0" o:ole="" fillcolor="window">
             <v:imagedata r:id="rId10" o:title=""/>
           </v:shape>
-          <o:OLEObject Type="Embed" ProgID="MSDraw" ShapeID="_x0000_i1025" DrawAspect="Content" ObjectID="_1827259336" r:id="rId11">
+          <o:OLEObject Type="Embed" ProgID="MSDraw" ShapeID="_x0000_i1025" DrawAspect="Content" ObjectID="_1831053988" r:id="rId11">
             <o:FieldCodes>\* mergeformat</o:FieldCodes>
           </o:OLEObject>
         </w:object>
@@ -3150,7 +3607,10 @@
       </w:pPr>
       <w:r>
         <w:lastRenderedPageBreak/>
-        <w:t>Chapter 3</w:t>
+        <w:t xml:space="preserve">Chapter </w:t>
+      </w:r>
+      <w:r>
+        <w:t>4</w:t>
       </w:r>
       <w:r>
         <w:br/>
@@ -3228,7 +3688,13 @@
       <w:bookmarkStart w:id="26" w:name="_Toc407145097"/>
       <w:r>
         <w:lastRenderedPageBreak/>
-        <w:t xml:space="preserve">Chapter 4 </w:t>
+        <w:t xml:space="preserve">Chapter </w:t>
+      </w:r>
+      <w:r>
+        <w:t>5</w:t>
+      </w:r>
+      <w:r>
+        <w:t xml:space="preserve"> </w:t>
       </w:r>
       <w:r>
         <w:br/>
@@ -3385,7 +3851,23 @@
           <w:sz w:val="22"/>
           <w:szCs w:val="22"/>
         </w:rPr>
-        <w:t xml:space="preserve"> size and 1.5 line spacing.</w:t>
+        <w:t xml:space="preserve"> size and </w:t>
+      </w:r>
+      <w:proofErr w:type="gramStart"/>
+      <w:r>
+        <w:rPr>
+          <w:sz w:val="22"/>
+          <w:szCs w:val="22"/>
+        </w:rPr>
+        <w:t>1.5 line</w:t>
+      </w:r>
+      <w:proofErr w:type="gramEnd"/>
+      <w:r>
+        <w:rPr>
+          <w:sz w:val="22"/>
+          <w:szCs w:val="22"/>
+        </w:rPr>
+        <w:t xml:space="preserve"> spacing.</w:t>
       </w:r>
       <w:r>
         <w:rPr>
@@ -3439,7 +3921,23 @@
           <w:sz w:val="22"/>
           <w:szCs w:val="22"/>
         </w:rPr>
-        <w:t xml:space="preserve"> size and 1.5 line spacing.</w:t>
+        <w:t xml:space="preserve"> size and </w:t>
+      </w:r>
+      <w:proofErr w:type="gramStart"/>
+      <w:r>
+        <w:rPr>
+          <w:sz w:val="22"/>
+          <w:szCs w:val="22"/>
+        </w:rPr>
+        <w:t>1.5 line</w:t>
+      </w:r>
+      <w:proofErr w:type="gramEnd"/>
+      <w:r>
+        <w:rPr>
+          <w:sz w:val="22"/>
+          <w:szCs w:val="22"/>
+        </w:rPr>
+        <w:t xml:space="preserve"> spacing.</w:t>
       </w:r>
       <w:r>
         <w:rPr>
@@ -3493,7 +3991,23 @@
           <w:sz w:val="22"/>
           <w:szCs w:val="22"/>
         </w:rPr>
-        <w:t xml:space="preserve"> size and 1.5 line spacing.</w:t>
+        <w:t xml:space="preserve"> size and </w:t>
+      </w:r>
+      <w:proofErr w:type="gramStart"/>
+      <w:r>
+        <w:rPr>
+          <w:sz w:val="22"/>
+          <w:szCs w:val="22"/>
+        </w:rPr>
+        <w:t>1.5 line</w:t>
+      </w:r>
+      <w:proofErr w:type="gramEnd"/>
+      <w:r>
+        <w:rPr>
+          <w:sz w:val="22"/>
+          <w:szCs w:val="22"/>
+        </w:rPr>
+        <w:t xml:space="preserve"> spacing.</w:t>
       </w:r>
       <w:r>
         <w:rPr>
@@ -4470,6 +4984,119 @@
     </w:lvl>
   </w:abstractNum>
   <w:abstractNum w:abstractNumId="12" w15:restartNumberingAfterBreak="0">
+    <w:nsid w:val="09397A8E"/>
+    <w:multiLevelType w:val="multilevel"/>
+    <w:tmpl w:val="CC627B28"/>
+    <w:lvl w:ilvl="0">
+      <w:start w:val="2"/>
+      <w:numFmt w:val="decimal"/>
+      <w:lvlText w:val="%1"/>
+      <w:lvlJc w:val="left"/>
+      <w:pPr>
+        <w:ind w:left="360" w:hanging="360"/>
+      </w:pPr>
+      <w:rPr>
+        <w:rFonts w:hint="default"/>
+      </w:rPr>
+    </w:lvl>
+    <w:lvl w:ilvl="1">
+      <w:start w:val="1"/>
+      <w:numFmt w:val="decimal"/>
+      <w:lvlText w:val="%1.%2"/>
+      <w:lvlJc w:val="left"/>
+      <w:pPr>
+        <w:ind w:left="720" w:hanging="720"/>
+      </w:pPr>
+      <w:rPr>
+        <w:rFonts w:hint="default"/>
+      </w:rPr>
+    </w:lvl>
+    <w:lvl w:ilvl="2">
+      <w:start w:val="1"/>
+      <w:numFmt w:val="decimal"/>
+      <w:lvlText w:val="%1.%2.%3"/>
+      <w:lvlJc w:val="left"/>
+      <w:pPr>
+        <w:ind w:left="720" w:hanging="720"/>
+      </w:pPr>
+      <w:rPr>
+        <w:rFonts w:hint="default"/>
+      </w:rPr>
+    </w:lvl>
+    <w:lvl w:ilvl="3">
+      <w:start w:val="1"/>
+      <w:numFmt w:val="decimal"/>
+      <w:lvlText w:val="%1.%2.%3.%4"/>
+      <w:lvlJc w:val="left"/>
+      <w:pPr>
+        <w:ind w:left="1080" w:hanging="1080"/>
+      </w:pPr>
+      <w:rPr>
+        <w:rFonts w:hint="default"/>
+      </w:rPr>
+    </w:lvl>
+    <w:lvl w:ilvl="4">
+      <w:start w:val="1"/>
+      <w:numFmt w:val="decimal"/>
+      <w:lvlText w:val="%1.%2.%3.%4.%5"/>
+      <w:lvlJc w:val="left"/>
+      <w:pPr>
+        <w:ind w:left="1080" w:hanging="1080"/>
+      </w:pPr>
+      <w:rPr>
+        <w:rFonts w:hint="default"/>
+      </w:rPr>
+    </w:lvl>
+    <w:lvl w:ilvl="5">
+      <w:start w:val="1"/>
+      <w:numFmt w:val="decimal"/>
+      <w:lvlText w:val="%1.%2.%3.%4.%5.%6"/>
+      <w:lvlJc w:val="left"/>
+      <w:pPr>
+        <w:ind w:left="1440" w:hanging="1440"/>
+      </w:pPr>
+      <w:rPr>
+        <w:rFonts w:hint="default"/>
+      </w:rPr>
+    </w:lvl>
+    <w:lvl w:ilvl="6">
+      <w:start w:val="1"/>
+      <w:numFmt w:val="decimal"/>
+      <w:lvlText w:val="%1.%2.%3.%4.%5.%6.%7"/>
+      <w:lvlJc w:val="left"/>
+      <w:pPr>
+        <w:ind w:left="1800" w:hanging="1800"/>
+      </w:pPr>
+      <w:rPr>
+        <w:rFonts w:hint="default"/>
+      </w:rPr>
+    </w:lvl>
+    <w:lvl w:ilvl="7">
+      <w:start w:val="1"/>
+      <w:numFmt w:val="decimal"/>
+      <w:lvlText w:val="%1.%2.%3.%4.%5.%6.%7.%8"/>
+      <w:lvlJc w:val="left"/>
+      <w:pPr>
+        <w:ind w:left="1800" w:hanging="1800"/>
+      </w:pPr>
+      <w:rPr>
+        <w:rFonts w:hint="default"/>
+      </w:rPr>
+    </w:lvl>
+    <w:lvl w:ilvl="8">
+      <w:start w:val="1"/>
+      <w:numFmt w:val="decimal"/>
+      <w:lvlText w:val="%1.%2.%3.%4.%5.%6.%7.%8.%9"/>
+      <w:lvlJc w:val="left"/>
+      <w:pPr>
+        <w:ind w:left="2160" w:hanging="2160"/>
+      </w:pPr>
+      <w:rPr>
+        <w:rFonts w:hint="default"/>
+      </w:rPr>
+    </w:lvl>
+  </w:abstractNum>
+  <w:abstractNum w:abstractNumId="13" w15:restartNumberingAfterBreak="0">
     <w:nsid w:val="1E1A12F8"/>
     <w:multiLevelType w:val="multilevel"/>
     <w:tmpl w:val="A9B4F640"/>
@@ -4582,7 +5209,7 @@
       </w:rPr>
     </w:lvl>
   </w:abstractNum>
-  <w:abstractNum w:abstractNumId="13" w15:restartNumberingAfterBreak="0">
+  <w:abstractNum w:abstractNumId="14" w15:restartNumberingAfterBreak="0">
     <w:nsid w:val="24131BB9"/>
     <w:multiLevelType w:val="hybridMultilevel"/>
     <w:tmpl w:val="9B8A6800"/>
@@ -4695,7 +5322,7 @@
       </w:rPr>
     </w:lvl>
   </w:abstractNum>
-  <w:abstractNum w:abstractNumId="14" w15:restartNumberingAfterBreak="0">
+  <w:abstractNum w:abstractNumId="15" w15:restartNumberingAfterBreak="0">
     <w:nsid w:val="307355F0"/>
     <w:multiLevelType w:val="hybridMultilevel"/>
     <w:tmpl w:val="34305C04"/>
@@ -4808,7 +5435,7 @@
       </w:rPr>
     </w:lvl>
   </w:abstractNum>
-  <w:abstractNum w:abstractNumId="15" w15:restartNumberingAfterBreak="0">
+  <w:abstractNum w:abstractNumId="16" w15:restartNumberingAfterBreak="0">
     <w:nsid w:val="36AC243D"/>
     <w:multiLevelType w:val="hybridMultilevel"/>
     <w:tmpl w:val="F0347DCA"/>
@@ -4921,7 +5548,7 @@
       </w:rPr>
     </w:lvl>
   </w:abstractNum>
-  <w:abstractNum w:abstractNumId="16" w15:restartNumberingAfterBreak="0">
+  <w:abstractNum w:abstractNumId="17" w15:restartNumberingAfterBreak="0">
     <w:nsid w:val="445F2AF6"/>
     <w:multiLevelType w:val="hybridMultilevel"/>
     <w:tmpl w:val="9034ACCE"/>
@@ -5034,7 +5661,7 @@
       </w:rPr>
     </w:lvl>
   </w:abstractNum>
-  <w:abstractNum w:abstractNumId="17" w15:restartNumberingAfterBreak="0">
+  <w:abstractNum w:abstractNumId="18" w15:restartNumberingAfterBreak="0">
     <w:nsid w:val="526544FE"/>
     <w:multiLevelType w:val="hybridMultilevel"/>
     <w:tmpl w:val="4EE629CE"/>
@@ -5123,7 +5750,7 @@
       </w:pPr>
     </w:lvl>
   </w:abstractNum>
-  <w:abstractNum w:abstractNumId="18" w15:restartNumberingAfterBreak="0">
+  <w:abstractNum w:abstractNumId="19" w15:restartNumberingAfterBreak="0">
     <w:nsid w:val="571504CC"/>
     <w:multiLevelType w:val="hybridMultilevel"/>
     <w:tmpl w:val="91AA967C"/>
@@ -5236,7 +5863,7 @@
       </w:rPr>
     </w:lvl>
   </w:abstractNum>
-  <w:abstractNum w:abstractNumId="19" w15:restartNumberingAfterBreak="0">
+  <w:abstractNum w:abstractNumId="20" w15:restartNumberingAfterBreak="0">
     <w:nsid w:val="6A917ECD"/>
     <w:multiLevelType w:val="hybridMultilevel"/>
     <w:tmpl w:val="27044AE2"/>
@@ -5349,7 +5976,7 @@
       </w:rPr>
     </w:lvl>
   </w:abstractNum>
-  <w:abstractNum w:abstractNumId="20" w15:restartNumberingAfterBreak="0">
+  <w:abstractNum w:abstractNumId="21" w15:restartNumberingAfterBreak="0">
     <w:nsid w:val="6DF04E0F"/>
     <w:multiLevelType w:val="hybridMultilevel"/>
     <w:tmpl w:val="295C1118"/>
@@ -5463,19 +6090,19 @@
     </w:lvl>
   </w:abstractNum>
   <w:num w:numId="1" w16cid:durableId="1349678647">
-    <w:abstractNumId w:val="18"/>
+    <w:abstractNumId w:val="19"/>
   </w:num>
   <w:num w:numId="2" w16cid:durableId="1130248750">
     <w:abstractNumId w:val="10"/>
   </w:num>
   <w:num w:numId="3" w16cid:durableId="1519275826">
+    <w:abstractNumId w:val="17"/>
+  </w:num>
+  <w:num w:numId="4" w16cid:durableId="381564169">
     <w:abstractNumId w:val="16"/>
   </w:num>
-  <w:num w:numId="4" w16cid:durableId="381564169">
+  <w:num w:numId="5" w16cid:durableId="928778025">
     <w:abstractNumId w:val="15"/>
-  </w:num>
-  <w:num w:numId="5" w16cid:durableId="928778025">
-    <w:abstractNumId w:val="14"/>
   </w:num>
   <w:num w:numId="6" w16cid:durableId="682630460">
     <w:abstractNumId w:val="11"/>
@@ -5511,18 +6138,21 @@
     <w:abstractNumId w:val="0"/>
   </w:num>
   <w:num w:numId="17" w16cid:durableId="2001541502">
+    <w:abstractNumId w:val="14"/>
+  </w:num>
+  <w:num w:numId="18" w16cid:durableId="257300595">
+    <w:abstractNumId w:val="21"/>
+  </w:num>
+  <w:num w:numId="19" w16cid:durableId="639118613">
+    <w:abstractNumId w:val="20"/>
+  </w:num>
+  <w:num w:numId="20" w16cid:durableId="712268069">
+    <w:abstractNumId w:val="18"/>
+  </w:num>
+  <w:num w:numId="21" w16cid:durableId="1158113202">
     <w:abstractNumId w:val="13"/>
   </w:num>
-  <w:num w:numId="18" w16cid:durableId="257300595">
-    <w:abstractNumId w:val="20"/>
-  </w:num>
-  <w:num w:numId="19" w16cid:durableId="639118613">
-    <w:abstractNumId w:val="19"/>
-  </w:num>
-  <w:num w:numId="20" w16cid:durableId="712268069">
-    <w:abstractNumId w:val="17"/>
-  </w:num>
-  <w:num w:numId="21" w16cid:durableId="1158113202">
+  <w:num w:numId="22" w16cid:durableId="504906227">
     <w:abstractNumId w:val="12"/>
   </w:num>
 </w:numbering>
@@ -5537,7 +6167,11 @@
         <w:lang w:val="en-GB" w:eastAsia="en-GB" w:bidi="ar-SA"/>
       </w:rPr>
     </w:rPrDefault>
-    <w:pPrDefault/>
+    <w:pPrDefault>
+      <w:pPr>
+        <w:spacing w:after="120" w:line="360" w:lineRule="auto"/>
+      </w:pPr>
+    </w:pPrDefault>
   </w:docDefaults>
   <w:latentStyles w:defLockedState="0" w:defUIPriority="0" w:defSemiHidden="0" w:defUnhideWhenUsed="0" w:defQFormat="0" w:count="376">
     <w:lsdException w:name="Normal" w:qFormat="1"/>
@@ -5904,9 +6538,6 @@
     <w:name w:val="Normal"/>
     <w:qFormat/>
     <w:rsid w:val="00223C7F"/>
-    <w:pPr>
-      <w:spacing w:after="120" w:line="360" w:lineRule="atLeast"/>
-    </w:pPr>
     <w:rPr>
       <w:sz w:val="24"/>
     </w:rPr>
@@ -5960,11 +6591,12 @@
     <w:basedOn w:val="Heading3"/>
     <w:next w:val="Normal"/>
     <w:qFormat/>
+    <w:rsid w:val="000A531E"/>
     <w:pPr>
       <w:outlineLvl w:val="3"/>
     </w:pPr>
     <w:rPr>
-      <w:sz w:val="24"/>
+      <w:sz w:val="22"/>
     </w:rPr>
   </w:style>
   <w:style w:type="paragraph" w:styleId="Heading5">

</xml_diff>

<commit_message>
Updated report - Methodology
</commit_message>
<xml_diff>
--- a/report.docx
+++ b/report.docx
@@ -89,7 +89,7 @@
         <mc:AlternateContent>
           <mc:Choice Requires="wps">
             <w:drawing>
-              <wp:anchor distT="0" distB="0" distL="114300" distR="114300" simplePos="0" relativeHeight="251658240" behindDoc="0" locked="1" layoutInCell="1" allowOverlap="1" wp14:anchorId="09B43DA5" wp14:editId="5127E234">
+              <wp:anchor distT="0" distB="0" distL="114300" distR="114300" simplePos="0" relativeHeight="251657216" behindDoc="0" locked="1" layoutInCell="1" allowOverlap="1" wp14:anchorId="09B43DA5" wp14:editId="72AD1286">
                 <wp:simplePos x="0" y="0"/>
                 <wp:positionH relativeFrom="page">
                   <wp:posOffset>714375</wp:posOffset>
@@ -227,7 +227,7 @@
                 <v:stroke joinstyle="miter"/>
                 <v:path gradientshapeok="t" o:connecttype="rect"/>
               </v:shapetype>
-              <v:shape id="Text Box 2" o:spid="_x0000_s1026" type="#_x0000_t202" style="position:absolute;left:0;text-align:left;margin-left:56.25pt;margin-top:114pt;width:258pt;height:68.4pt;z-index:251658240;visibility:visible;mso-wrap-style:square;mso-width-percent:0;mso-height-percent:0;mso-wrap-distance-left:9pt;mso-wrap-distance-top:0;mso-wrap-distance-right:9pt;mso-wrap-distance-bottom:0;mso-position-horizontal:absolute;mso-position-horizontal-relative:page;mso-position-vertical:absolute;mso-position-vertical-relative:page;mso-width-percent:0;mso-height-percent:0;mso-width-relative:page;mso-height-relative:page;v-text-anchor:top" o:gfxdata="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" filled="f" stroked="f">
+              <v:shape id="Text Box 2" o:spid="_x0000_s1026" type="#_x0000_t202" style="position:absolute;left:0;text-align:left;margin-left:56.25pt;margin-top:114pt;width:258pt;height:68.4pt;z-index:251657216;visibility:visible;mso-wrap-style:square;mso-width-percent:0;mso-height-percent:0;mso-wrap-distance-left:9pt;mso-wrap-distance-top:0;mso-wrap-distance-right:9pt;mso-wrap-distance-bottom:0;mso-position-horizontal:absolute;mso-position-horizontal-relative:page;mso-position-vertical:absolute;mso-position-vertical-relative:page;mso-width-percent:0;mso-height-percent:0;mso-width-relative:page;mso-height-relative:page;v-text-anchor:top" o:gfxdata="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" filled="f" stroked="f">
                 <v:textbox inset="0,0,0,0">
                   <w:txbxContent>
                     <w:tbl>
@@ -798,7 +798,6 @@
         <w:jc w:val="both"/>
         <w:rPr>
           <w:i/>
-          <w:sz w:val="22"/>
           <w:szCs w:val="22"/>
         </w:rPr>
       </w:pPr>
@@ -807,7 +806,6 @@
       <w:pPr>
         <w:rPr>
           <w:iCs/>
-          <w:sz w:val="22"/>
           <w:szCs w:val="22"/>
         </w:rPr>
       </w:pPr>
@@ -828,14 +826,12 @@
         <w:jc w:val="both"/>
         <w:rPr>
           <w:i/>
-          <w:sz w:val="22"/>
           <w:szCs w:val="22"/>
         </w:rPr>
       </w:pPr>
       <w:r>
         <w:rPr>
           <w:i/>
-          <w:sz w:val="22"/>
           <w:szCs w:val="22"/>
         </w:rPr>
         <w:t>&lt;</w:t>
@@ -843,7 +839,6 @@
       <w:r>
         <w:rPr>
           <w:i/>
-          <w:sz w:val="22"/>
           <w:szCs w:val="22"/>
         </w:rPr>
         <w:t>This page should contain any acknowledgements to those who have assisted with your work.  Where you have worked as part of a team, you should</w:t>
@@ -851,7 +846,6 @@
       <w:r>
         <w:rPr>
           <w:i/>
-          <w:sz w:val="22"/>
           <w:szCs w:val="22"/>
         </w:rPr>
         <w:t>,</w:t>
@@ -859,7 +853,6 @@
       <w:r>
         <w:rPr>
           <w:i/>
-          <w:sz w:val="22"/>
           <w:szCs w:val="22"/>
         </w:rPr>
         <w:t xml:space="preserve"> </w:t>
@@ -867,7 +860,6 @@
       <w:r>
         <w:rPr>
           <w:i/>
-          <w:sz w:val="22"/>
           <w:szCs w:val="22"/>
         </w:rPr>
         <w:t>where appropriate, reference to any contribution made by others to the project.</w:t>
@@ -875,7 +867,6 @@
       <w:r>
         <w:rPr>
           <w:i/>
-          <w:sz w:val="22"/>
           <w:szCs w:val="22"/>
         </w:rPr>
         <w:t>&gt;</w:t>
@@ -886,14 +877,12 @@
         <w:jc w:val="both"/>
         <w:rPr>
           <w:i/>
-          <w:sz w:val="22"/>
           <w:szCs w:val="22"/>
         </w:rPr>
       </w:pPr>
       <w:r>
         <w:rPr>
           <w:i/>
-          <w:sz w:val="22"/>
           <w:szCs w:val="22"/>
         </w:rPr>
         <w:t xml:space="preserve">Note that it is not acceptable to solicit </w:t>
@@ -901,7 +890,6 @@
       <w:r>
         <w:rPr>
           <w:i/>
-          <w:sz w:val="22"/>
           <w:szCs w:val="22"/>
         </w:rPr>
         <w:t xml:space="preserve">assistance on </w:t>
@@ -909,7 +897,6 @@
       <w:r>
         <w:rPr>
           <w:i/>
-          <w:sz w:val="22"/>
           <w:szCs w:val="22"/>
         </w:rPr>
         <w:t>‘proof reading’ which is defined as “the systematic checking and identification of errors in spelling, punctuation, grammar and sentence construction, formatting and layout in the text”; see</w:t>
@@ -955,27 +942,23 @@
           <w:rFonts w:asciiTheme="minorHAnsi" w:eastAsiaTheme="minorEastAsia" w:hAnsiTheme="minorHAnsi" w:cstheme="minorBidi"/>
           <w:b w:val="0"/>
           <w:noProof/>
-          <w:sz w:val="22"/>
-          <w:szCs w:val="22"/>
-        </w:rPr>
-      </w:pPr>
-      <w:r>
-        <w:rPr>
-          <w:sz w:val="22"/>
+          <w:szCs w:val="22"/>
+        </w:rPr>
+      </w:pPr>
+      <w:r>
+        <w:rPr>
           <w:szCs w:val="22"/>
         </w:rPr>
         <w:fldChar w:fldCharType="begin"/>
       </w:r>
       <w:r>
         <w:rPr>
-          <w:sz w:val="22"/>
           <w:szCs w:val="22"/>
         </w:rPr>
         <w:instrText>TOC \o</w:instrText>
       </w:r>
       <w:r>
         <w:rPr>
-          <w:sz w:val="22"/>
           <w:szCs w:val="22"/>
         </w:rPr>
         <w:fldChar w:fldCharType="separate"/>
@@ -1035,7 +1018,6 @@
           <w:rFonts w:asciiTheme="minorHAnsi" w:eastAsiaTheme="minorEastAsia" w:hAnsiTheme="minorHAnsi" w:cstheme="minorBidi"/>
           <w:b w:val="0"/>
           <w:noProof/>
-          <w:sz w:val="22"/>
           <w:szCs w:val="22"/>
         </w:rPr>
       </w:pPr>
@@ -1094,7 +1076,6 @@
           <w:rFonts w:asciiTheme="minorHAnsi" w:eastAsiaTheme="minorEastAsia" w:hAnsiTheme="minorHAnsi" w:cstheme="minorBidi"/>
           <w:b w:val="0"/>
           <w:noProof/>
-          <w:sz w:val="22"/>
           <w:szCs w:val="22"/>
         </w:rPr>
       </w:pPr>
@@ -1153,7 +1134,6 @@
           <w:rFonts w:asciiTheme="minorHAnsi" w:eastAsiaTheme="minorEastAsia" w:hAnsiTheme="minorHAnsi" w:cstheme="minorBidi"/>
           <w:b w:val="0"/>
           <w:noProof/>
-          <w:sz w:val="22"/>
           <w:szCs w:val="22"/>
         </w:rPr>
       </w:pPr>
@@ -1211,7 +1191,6 @@
         <w:rPr>
           <w:rFonts w:asciiTheme="minorHAnsi" w:eastAsiaTheme="minorEastAsia" w:hAnsiTheme="minorHAnsi" w:cstheme="minorBidi"/>
           <w:noProof/>
-          <w:sz w:val="22"/>
           <w:szCs w:val="22"/>
         </w:rPr>
       </w:pPr>
@@ -1269,7 +1248,6 @@
         <w:rPr>
           <w:rFonts w:asciiTheme="minorHAnsi" w:eastAsiaTheme="minorEastAsia" w:hAnsiTheme="minorHAnsi" w:cstheme="minorBidi"/>
           <w:noProof/>
-          <w:sz w:val="22"/>
           <w:szCs w:val="22"/>
         </w:rPr>
       </w:pPr>
@@ -1327,7 +1305,6 @@
         <w:rPr>
           <w:rFonts w:asciiTheme="minorHAnsi" w:eastAsiaTheme="minorEastAsia" w:hAnsiTheme="minorHAnsi" w:cstheme="minorBidi"/>
           <w:noProof/>
-          <w:sz w:val="22"/>
           <w:szCs w:val="22"/>
         </w:rPr>
       </w:pPr>
@@ -1389,7 +1366,6 @@
           <w:rFonts w:asciiTheme="minorHAnsi" w:eastAsiaTheme="minorEastAsia" w:hAnsiTheme="minorHAnsi" w:cstheme="minorBidi"/>
           <w:b w:val="0"/>
           <w:noProof/>
-          <w:sz w:val="22"/>
           <w:szCs w:val="22"/>
         </w:rPr>
       </w:pPr>
@@ -1447,7 +1423,6 @@
         <w:rPr>
           <w:rFonts w:asciiTheme="minorHAnsi" w:eastAsiaTheme="minorEastAsia" w:hAnsiTheme="minorHAnsi" w:cstheme="minorBidi"/>
           <w:noProof/>
-          <w:sz w:val="22"/>
           <w:szCs w:val="22"/>
         </w:rPr>
       </w:pPr>
@@ -1505,7 +1480,6 @@
         <w:rPr>
           <w:rFonts w:asciiTheme="minorHAnsi" w:eastAsiaTheme="minorEastAsia" w:hAnsiTheme="minorHAnsi" w:cstheme="minorBidi"/>
           <w:noProof/>
-          <w:sz w:val="22"/>
           <w:szCs w:val="22"/>
         </w:rPr>
       </w:pPr>
@@ -1564,7 +1538,6 @@
           <w:rFonts w:asciiTheme="minorHAnsi" w:eastAsiaTheme="minorEastAsia" w:hAnsiTheme="minorHAnsi" w:cstheme="minorBidi"/>
           <w:b w:val="0"/>
           <w:noProof/>
-          <w:sz w:val="22"/>
           <w:szCs w:val="22"/>
         </w:rPr>
       </w:pPr>
@@ -1623,7 +1596,6 @@
           <w:rFonts w:asciiTheme="minorHAnsi" w:eastAsiaTheme="minorEastAsia" w:hAnsiTheme="minorHAnsi" w:cstheme="minorBidi"/>
           <w:b w:val="0"/>
           <w:noProof/>
-          <w:sz w:val="22"/>
           <w:szCs w:val="22"/>
         </w:rPr>
       </w:pPr>
@@ -1687,7 +1659,6 @@
         <w:rPr>
           <w:rFonts w:asciiTheme="minorHAnsi" w:eastAsiaTheme="minorEastAsia" w:hAnsiTheme="minorHAnsi" w:cstheme="minorBidi"/>
           <w:noProof/>
-          <w:sz w:val="22"/>
           <w:szCs w:val="22"/>
         </w:rPr>
       </w:pPr>
@@ -1704,7 +1675,6 @@
         <w:rPr>
           <w:rFonts w:asciiTheme="minorHAnsi" w:eastAsiaTheme="minorEastAsia" w:hAnsiTheme="minorHAnsi" w:cstheme="minorBidi"/>
           <w:noProof/>
-          <w:sz w:val="22"/>
           <w:szCs w:val="22"/>
         </w:rPr>
       </w:pPr>
@@ -1796,7 +1766,6 @@
         <w:rPr>
           <w:rFonts w:asciiTheme="minorHAnsi" w:eastAsiaTheme="minorEastAsia" w:hAnsiTheme="minorHAnsi" w:cstheme="minorBidi"/>
           <w:noProof/>
-          <w:sz w:val="22"/>
           <w:szCs w:val="22"/>
         </w:rPr>
       </w:pPr>
@@ -1822,13 +1791,11 @@
         <w:rPr>
           <w:rFonts w:asciiTheme="minorHAnsi" w:eastAsiaTheme="minorEastAsia" w:hAnsiTheme="minorHAnsi" w:cstheme="minorBidi"/>
           <w:noProof/>
-          <w:sz w:val="22"/>
-          <w:szCs w:val="22"/>
-        </w:rPr>
-      </w:pPr>
-      <w:r>
-        <w:rPr>
-          <w:sz w:val="22"/>
+          <w:szCs w:val="22"/>
+        </w:rPr>
+      </w:pPr>
+      <w:r>
+        <w:rPr>
           <w:szCs w:val="22"/>
         </w:rPr>
         <w:fldChar w:fldCharType="end"/>
@@ -1838,7 +1805,6 @@
       <w:pPr>
         <w:ind w:left="567"/>
         <w:rPr>
-          <w:sz w:val="22"/>
           <w:szCs w:val="22"/>
         </w:rPr>
       </w:pPr>
@@ -1881,118 +1847,101 @@
     <w:p>
       <w:pPr>
         <w:rPr>
-          <w:sz w:val="22"/>
-          <w:szCs w:val="22"/>
-        </w:rPr>
-      </w:pPr>
-      <w:r>
-        <w:rPr>
-          <w:sz w:val="22"/>
+          <w:szCs w:val="22"/>
+        </w:rPr>
+      </w:pPr>
+      <w:r>
+        <w:rPr>
           <w:szCs w:val="22"/>
         </w:rPr>
         <w:t>&lt;</w:t>
       </w:r>
       <w:r>
         <w:rPr>
-          <w:sz w:val="22"/>
           <w:szCs w:val="22"/>
         </w:rPr>
         <w:t>Recommend using</w:t>
       </w:r>
       <w:r>
         <w:rPr>
-          <w:sz w:val="22"/>
           <w:szCs w:val="22"/>
         </w:rPr>
         <w:t xml:space="preserve"> </w:t>
       </w:r>
       <w:r>
         <w:rPr>
-          <w:sz w:val="22"/>
           <w:szCs w:val="22"/>
         </w:rPr>
         <w:t xml:space="preserve">‘Heading 1’ for chapter titles, </w:t>
       </w:r>
       <w:r>
         <w:rPr>
-          <w:sz w:val="22"/>
           <w:szCs w:val="22"/>
         </w:rPr>
         <w:t>‘Heading 2’</w:t>
       </w:r>
       <w:r>
         <w:rPr>
-          <w:sz w:val="22"/>
           <w:szCs w:val="22"/>
         </w:rPr>
         <w:t xml:space="preserve"> style</w:t>
       </w:r>
       <w:r>
         <w:rPr>
-          <w:sz w:val="22"/>
           <w:szCs w:val="22"/>
         </w:rPr>
         <w:t xml:space="preserve"> for section headings, ‘Heading 3’ for subsection headings, and ‘Heading 4’ for sub-subsection headings</w:t>
       </w:r>
       <w:r>
         <w:rPr>
-          <w:sz w:val="22"/>
           <w:szCs w:val="22"/>
         </w:rPr>
         <w:t xml:space="preserve">, but whatever you choose </w:t>
       </w:r>
       <w:r>
         <w:rPr>
-          <w:sz w:val="22"/>
           <w:szCs w:val="22"/>
         </w:rPr>
         <w:t>you must</w:t>
       </w:r>
       <w:r>
         <w:rPr>
-          <w:sz w:val="22"/>
           <w:szCs w:val="22"/>
         </w:rPr>
         <w:t xml:space="preserve"> be consistent</w:t>
       </w:r>
       <w:r>
         <w:rPr>
-          <w:sz w:val="22"/>
           <w:szCs w:val="22"/>
         </w:rPr>
         <w:t xml:space="preserve">. Don’t forget that text </w:t>
       </w:r>
       <w:r>
         <w:rPr>
-          <w:sz w:val="22"/>
           <w:szCs w:val="22"/>
         </w:rPr>
         <w:t>(</w:t>
       </w:r>
       <w:r>
         <w:rPr>
-          <w:sz w:val="22"/>
           <w:szCs w:val="22"/>
         </w:rPr>
         <w:t>other than headings</w:t>
       </w:r>
       <w:r>
         <w:rPr>
-          <w:sz w:val="22"/>
           <w:szCs w:val="22"/>
         </w:rPr>
         <w:t>)</w:t>
       </w:r>
       <w:r>
         <w:rPr>
-          <w:sz w:val="22"/>
           <w:szCs w:val="22"/>
         </w:rPr>
         <w:t xml:space="preserve"> </w:t>
       </w:r>
       <w:r>
         <w:rPr>
-          <w:sz w:val="22"/>
           <w:szCs w:val="22"/>
         </w:rPr>
         <w:t xml:space="preserve">should be 11 </w:t>
@@ -2000,7 +1949,6 @@
       <w:proofErr w:type="gramStart"/>
       <w:r>
         <w:rPr>
-          <w:sz w:val="22"/>
           <w:szCs w:val="22"/>
         </w:rPr>
         <w:t>point</w:t>
@@ -2008,14 +1956,12 @@
       <w:proofErr w:type="gramEnd"/>
       <w:r>
         <w:rPr>
-          <w:sz w:val="22"/>
           <w:szCs w:val="22"/>
         </w:rPr>
         <w:t>.</w:t>
       </w:r>
       <w:r>
         <w:rPr>
-          <w:sz w:val="22"/>
           <w:szCs w:val="22"/>
         </w:rPr>
         <w:t>&gt;</w:t>
@@ -2039,14 +1985,12 @@
         <w:spacing w:line="360" w:lineRule="auto"/>
         <w:rPr>
           <w:rFonts w:ascii="Arial" w:hAnsi="Arial" w:cs="Arial"/>
-          <w:sz w:val="22"/>
           <w:szCs w:val="22"/>
         </w:rPr>
       </w:pPr>
       <w:r>
         <w:rPr>
           <w:rFonts w:ascii="Arial" w:hAnsi="Arial" w:cs="Arial"/>
-          <w:sz w:val="22"/>
           <w:szCs w:val="22"/>
         </w:rPr>
         <w:t>This project aims to apply machine learning techniques to identify and classify distinct playing styles in chess from historical game data. Chess players exhibit remarkably different approaches to the game</w:t>
@@ -2054,7 +1998,6 @@
       <w:r>
         <w:rPr>
           <w:rFonts w:ascii="Arial" w:hAnsi="Arial" w:cs="Arial"/>
-          <w:sz w:val="22"/>
           <w:szCs w:val="22"/>
         </w:rPr>
         <w:t xml:space="preserve"> - s</w:t>
@@ -2062,7 +2005,6 @@
       <w:r>
         <w:rPr>
           <w:rFonts w:ascii="Arial" w:hAnsi="Arial" w:cs="Arial"/>
-          <w:sz w:val="22"/>
           <w:szCs w:val="22"/>
         </w:rPr>
         <w:t xml:space="preserve">ome prefer aggressive attacks and material sacrifices, while others favour patient manoeuvring and solid defensive structures. However, analysing a player's style </w:t>
@@ -2070,7 +2012,6 @@
       <w:r>
         <w:rPr>
           <w:rFonts w:ascii="Arial" w:hAnsi="Arial" w:cs="Arial"/>
-          <w:sz w:val="22"/>
           <w:szCs w:val="22"/>
         </w:rPr>
         <w:t xml:space="preserve">typically </w:t>
@@ -2078,7 +2019,6 @@
       <w:r>
         <w:rPr>
           <w:rFonts w:ascii="Arial" w:hAnsi="Arial" w:cs="Arial"/>
-          <w:sz w:val="22"/>
           <w:szCs w:val="22"/>
         </w:rPr>
         <w:t>requires manual review of many games by experienced players, making it time-intensive and subjective.</w:t>
@@ -2090,14 +2030,12 @@
         <w:spacing w:line="360" w:lineRule="auto"/>
         <w:rPr>
           <w:rFonts w:ascii="Arial" w:hAnsi="Arial" w:cs="Arial"/>
-          <w:sz w:val="22"/>
           <w:szCs w:val="22"/>
         </w:rPr>
       </w:pPr>
       <w:r>
         <w:rPr>
           <w:rFonts w:ascii="Arial" w:hAnsi="Arial" w:cs="Arial"/>
-          <w:sz w:val="22"/>
           <w:szCs w:val="22"/>
         </w:rPr>
         <w:t>The computer science challenge lies in teaching a computer to recogni</w:t>
@@ -2105,7 +2043,6 @@
       <w:r>
         <w:rPr>
           <w:rFonts w:ascii="Arial" w:hAnsi="Arial" w:cs="Arial"/>
-          <w:sz w:val="22"/>
           <w:szCs w:val="22"/>
         </w:rPr>
         <w:t>s</w:t>
@@ -2113,7 +2050,6 @@
       <w:r>
         <w:rPr>
           <w:rFonts w:ascii="Arial" w:hAnsi="Arial" w:cs="Arial"/>
-          <w:sz w:val="22"/>
           <w:szCs w:val="22"/>
         </w:rPr>
         <w:t xml:space="preserve">e these qualitative patterns automatically. Unlike simpler problems such as predicting who will win a game (based on ratings or positions), style classification requires the system to understand </w:t>
@@ -2122,7 +2058,6 @@
         <w:rPr>
           <w:rStyle w:val="Emphasis"/>
           <w:rFonts w:ascii="Arial" w:hAnsi="Arial" w:cs="Arial"/>
-          <w:sz w:val="22"/>
           <w:szCs w:val="22"/>
         </w:rPr>
         <w:t>how</w:t>
@@ -2130,7 +2065,6 @@
       <w:r>
         <w:rPr>
           <w:rFonts w:ascii="Arial" w:hAnsi="Arial" w:cs="Arial"/>
-          <w:sz w:val="22"/>
           <w:szCs w:val="22"/>
         </w:rPr>
         <w:t xml:space="preserve"> players make decisions, not just </w:t>
@@ -2141,7 +2075,6 @@
           <w:rFonts w:ascii="Arial" w:hAnsi="Arial" w:cs="Arial"/>
           <w:i w:val="0"/>
           <w:iCs w:val="0"/>
-          <w:sz w:val="22"/>
           <w:szCs w:val="22"/>
         </w:rPr>
         <w:t>whether</w:t>
@@ -2151,7 +2084,6 @@
           <w:rFonts w:ascii="Arial" w:hAnsi="Arial" w:cs="Arial"/>
           <w:i/>
           <w:iCs/>
-          <w:sz w:val="22"/>
           <w:szCs w:val="22"/>
         </w:rPr>
         <w:t xml:space="preserve"> </w:t>
@@ -2159,7 +2091,6 @@
       <w:r>
         <w:rPr>
           <w:rFonts w:ascii="Arial" w:hAnsi="Arial" w:cs="Arial"/>
-          <w:sz w:val="22"/>
           <w:szCs w:val="22"/>
         </w:rPr>
         <w:t>those decisions are objectively good. The computer must learn to extract meaningful patterns from the complexity of chess</w:t>
@@ -2167,7 +2098,6 @@
       <w:r>
         <w:rPr>
           <w:rFonts w:ascii="Arial" w:hAnsi="Arial" w:cs="Arial"/>
-          <w:sz w:val="22"/>
           <w:szCs w:val="22"/>
         </w:rPr>
         <w:t xml:space="preserve"> </w:t>
@@ -2175,7 +2105,6 @@
       <w:r>
         <w:rPr>
           <w:rFonts w:ascii="Arial" w:hAnsi="Arial" w:cs="Arial"/>
-          <w:sz w:val="22"/>
           <w:szCs w:val="22"/>
         </w:rPr>
         <w:t>where billions of possible positions exist and the "best" move often depends on context rather than fixed rules. This involves designing algorithms that can analyse thousands of games, identify consistent behavioural patterns across different situations, and classify them into distinct style categories, all while handling the challenge that the same player might employ different styles in different games.</w:t>
@@ -2187,14 +2116,12 @@
         <w:spacing w:line="360" w:lineRule="auto"/>
         <w:rPr>
           <w:rFonts w:ascii="Arial" w:hAnsi="Arial" w:cs="Arial"/>
-          <w:sz w:val="22"/>
           <w:szCs w:val="22"/>
         </w:rPr>
       </w:pPr>
       <w:r>
         <w:rPr>
           <w:rFonts w:ascii="Arial" w:hAnsi="Arial" w:cs="Arial"/>
-          <w:sz w:val="22"/>
           <w:szCs w:val="22"/>
         </w:rPr>
         <w:t>The goal is to create a practical tool that allows average chess players to understand their own playing tendencies without needing expert analysis or deep technical knowledge. This project addresses a real-world need by making style analysis accessible, moving beyond existing chess tools that focus primarily on finding the strongest moves rather than understanding human playing patterns.</w:t>
@@ -2220,16 +2147,8 @@
       <w:pPr>
         <w:pStyle w:val="ListParagraph"/>
         <w:ind w:left="540"/>
-        <w:rPr>
-          <w:sz w:val="22"/>
-          <w:szCs w:val="18"/>
-        </w:rPr>
-      </w:pPr>
-      <w:r>
-        <w:rPr>
-          <w:sz w:val="22"/>
-          <w:szCs w:val="18"/>
-        </w:rPr>
+      </w:pPr>
+      <w:r>
         <w:t>The challenge of automatically identifying chess playing styles has been approached from several angles in prior research, each with distinct methodologies and limitations.</w:t>
       </w:r>
     </w:p>
@@ -2240,12 +2159,14 @@
     </w:p>
     <w:p>
       <w:pPr>
-        <w:pStyle w:val="Heading3"/>
-        <w:numPr>
-          <w:ilvl w:val="1"/>
-          <w:numId w:val="22"/>
-        </w:numPr>
-      </w:pPr>
+        <w:pStyle w:val="Heading2"/>
+      </w:pPr>
+      <w:r>
+        <w:t>2.1</w:t>
+      </w:r>
+      <w:r>
+        <w:tab/>
+      </w:r>
       <w:r>
         <w:t xml:space="preserve">Previous </w:t>
       </w:r>
@@ -2257,92 +2178,50 @@
       <w:pPr>
         <w:pStyle w:val="ListParagraph"/>
         <w:ind w:left="0"/>
-        <w:rPr>
-          <w:sz w:val="22"/>
-          <w:szCs w:val="18"/>
-        </w:rPr>
-      </w:pPr>
-      <w:r>
-        <w:rPr>
-          <w:sz w:val="22"/>
-          <w:szCs w:val="18"/>
-        </w:rPr>
+      </w:pPr>
+      <w:r>
         <w:t xml:space="preserve">Jayasekara (2018) demonstrated that distinct playing styles in chess are computationally differentiable through machine learning techniques. By </w:t>
       </w:r>
       <w:r>
-        <w:rPr>
-          <w:sz w:val="22"/>
-          <w:szCs w:val="18"/>
-        </w:rPr>
         <w:t>analysing</w:t>
       </w:r>
       <w:r>
-        <w:rPr>
-          <w:sz w:val="22"/>
-          <w:szCs w:val="18"/>
-        </w:rPr>
         <w:t xml:space="preserve"> games from top-level players, the research showed that clustering methods could successfully group games according to playing styles, with classification algorithms including Logistic Regression, Naïve Bayes, and Random Forest achieving accurate mappings between extracted features and predetermined style categories. This work established the feasibility of automated style classification and </w:t>
       </w:r>
       <w:r>
-        <w:rPr>
-          <w:sz w:val="22"/>
-          <w:szCs w:val="18"/>
-        </w:rPr>
         <w:t>showed</w:t>
       </w:r>
       <w:r>
-        <w:rPr>
-          <w:sz w:val="22"/>
-          <w:szCs w:val="18"/>
-        </w:rPr>
         <w:t xml:space="preserve"> that Random Forest classifiers are particularly effective for this task. However, Jayasekara's approach relied on assumed playing styles for professional players rather than developing a systematic </w:t>
       </w:r>
       <w:r>
-        <w:rPr>
-          <w:sz w:val="22"/>
-          <w:szCs w:val="18"/>
-        </w:rPr>
         <w:t>labelling</w:t>
       </w:r>
       <w:r>
-        <w:rPr>
-          <w:sz w:val="22"/>
-          <w:szCs w:val="18"/>
-        </w:rPr>
         <w:t xml:space="preserve"> </w:t>
       </w:r>
       <w:r>
-        <w:rPr>
-          <w:sz w:val="22"/>
-          <w:szCs w:val="18"/>
-        </w:rPr>
         <w:t>methodology and</w:t>
       </w:r>
       <w:r>
-        <w:rPr>
-          <w:sz w:val="22"/>
-          <w:szCs w:val="18"/>
-        </w:rPr>
         <w:t xml:space="preserve"> did not address how such systems could be deployed for average players seeking to understand their own styles.</w:t>
       </w:r>
     </w:p>
     <w:p>
       <w:pPr>
         <w:pStyle w:val="ListParagraph"/>
-        <w:rPr>
-          <w:sz w:val="22"/>
-          <w:szCs w:val="18"/>
-        </w:rPr>
-      </w:pPr>
-    </w:p>
-    <w:p>
-      <w:pPr>
-        <w:pStyle w:val="Heading3"/>
-        <w:numPr>
-          <w:ilvl w:val="1"/>
-          <w:numId w:val="22"/>
-        </w:numPr>
-      </w:pPr>
+      </w:pPr>
+    </w:p>
+    <w:p>
+      <w:pPr>
+        <w:pStyle w:val="Heading2"/>
+      </w:pPr>
+      <w:r>
+        <w:t>2.2</w:t>
+      </w:r>
+      <w:r>
+        <w:tab/>
+      </w:r>
       <w:r>
         <w:t>Feature Engineering</w:t>
       </w:r>
@@ -2351,242 +2230,103 @@
       <w:pPr>
         <w:pStyle w:val="ListParagraph"/>
         <w:ind w:left="0"/>
-        <w:rPr>
-          <w:sz w:val="22"/>
-          <w:szCs w:val="18"/>
-        </w:rPr>
-      </w:pPr>
-      <w:r>
-        <w:rPr>
-          <w:sz w:val="22"/>
-          <w:szCs w:val="18"/>
-        </w:rPr>
+      </w:pPr>
+      <w:r>
         <w:t>When applying machine learning to chess style analysis, a fundamental challenge is determining the characteristics in a game are meaningful in relation to playing styles. Feature engineering aims to extract quantifiable attributes from raw game data and will help us in tackling this problem.</w:t>
       </w:r>
     </w:p>
     <w:p>
-      <w:pPr>
-        <w:rPr>
-          <w:sz w:val="22"/>
-          <w:szCs w:val="18"/>
-        </w:rPr>
-      </w:pPr>
-      <w:r>
-        <w:rPr>
-          <w:sz w:val="22"/>
-          <w:szCs w:val="18"/>
-        </w:rPr>
+      <w:r>
         <w:t>Traditional chess engines rel</w:t>
       </w:r>
       <w:r>
-        <w:rPr>
-          <w:sz w:val="22"/>
-          <w:szCs w:val="18"/>
-        </w:rPr>
         <w:t>y</w:t>
       </w:r>
       <w:r>
-        <w:rPr>
-          <w:sz w:val="22"/>
-          <w:szCs w:val="18"/>
-        </w:rPr>
         <w:t xml:space="preserve"> heavily on hand-crafted evaluation functions developed by experts. </w:t>
       </w:r>
       <w:r>
-        <w:rPr>
-          <w:sz w:val="22"/>
-          <w:szCs w:val="18"/>
-        </w:rPr>
         <w:t>Silver et al. (2018)</w:t>
       </w:r>
       <w:r>
-        <w:rPr>
-          <w:sz w:val="22"/>
-          <w:szCs w:val="18"/>
-        </w:rPr>
         <w:t xml:space="preserve"> noted that "state-of-the-art programs are based on powerful engines that search many millions of positions, leveraging handcrafted domain expertise and sophisticated domain adaptations.</w:t>
       </w:r>
       <w:r>
-        <w:rPr>
-          <w:sz w:val="22"/>
-          <w:szCs w:val="18"/>
-        </w:rPr>
         <w:t>”</w:t>
       </w:r>
       <w:r>
-        <w:rPr>
-          <w:sz w:val="22"/>
-          <w:szCs w:val="18"/>
-        </w:rPr>
-        <w:t xml:space="preserve"> These systems required chess masters to manually encode positional concepts such as </w:t>
-      </w:r>
-      <w:r>
-        <w:rPr>
-          <w:sz w:val="22"/>
-          <w:szCs w:val="18"/>
-        </w:rPr>
-        <w:t>cent</w:t>
-      </w:r>
-      <w:r>
-        <w:rPr>
-          <w:sz w:val="22"/>
-          <w:szCs w:val="18"/>
-        </w:rPr>
+        <w:t xml:space="preserve"> These systems required chess masters to manually encode positional concepts such as cent</w:t>
+      </w:r>
+      <w:r>
         <w:t>re</w:t>
       </w:r>
       <w:r>
-        <w:rPr>
-          <w:sz w:val="22"/>
-          <w:szCs w:val="18"/>
-        </w:rPr>
         <w:t xml:space="preserve"> control, king safety, and pawn structure into explicit</w:t>
       </w:r>
       <w:r>
-        <w:rPr>
-          <w:sz w:val="22"/>
-          <w:szCs w:val="18"/>
-        </w:rPr>
         <w:t xml:space="preserve">, quantifiable </w:t>
       </w:r>
       <w:r>
-        <w:rPr>
-          <w:sz w:val="22"/>
-          <w:szCs w:val="18"/>
-        </w:rPr>
         <w:t>features. While effective for engine strength, this approach present</w:t>
       </w:r>
       <w:r>
-        <w:rPr>
-          <w:sz w:val="22"/>
-          <w:szCs w:val="18"/>
-        </w:rPr>
         <w:t>s</w:t>
       </w:r>
       <w:r>
-        <w:rPr>
-          <w:sz w:val="22"/>
-          <w:szCs w:val="18"/>
-        </w:rPr>
         <w:t xml:space="preserve"> limitations for style classification, as it </w:t>
       </w:r>
       <w:r>
-        <w:rPr>
-          <w:sz w:val="22"/>
-          <w:szCs w:val="18"/>
-        </w:rPr>
         <w:t>is applied in the context of</w:t>
       </w:r>
       <w:r>
-        <w:rPr>
-          <w:sz w:val="22"/>
-          <w:szCs w:val="18"/>
-        </w:rPr>
         <w:t xml:space="preserve"> objective evaluation over </w:t>
       </w:r>
       <w:r>
-        <w:rPr>
-          <w:sz w:val="22"/>
-          <w:szCs w:val="18"/>
-        </w:rPr>
-        <w:t>behavioural</w:t>
-      </w:r>
-      <w:r>
-        <w:rPr>
-          <w:sz w:val="22"/>
-          <w:szCs w:val="18"/>
-        </w:rPr>
-        <w:t xml:space="preserve"> characteri</w:t>
-      </w:r>
-      <w:r>
-        <w:rPr>
-          <w:sz w:val="22"/>
-          <w:szCs w:val="18"/>
-        </w:rPr>
+        <w:lastRenderedPageBreak/>
+        <w:t>behavioural characteri</w:t>
+      </w:r>
+      <w:r>
         <w:t>sa</w:t>
       </w:r>
       <w:r>
-        <w:rPr>
-          <w:sz w:val="22"/>
-          <w:szCs w:val="18"/>
-        </w:rPr>
         <w:t>tion</w:t>
       </w:r>
       <w:r>
-        <w:rPr>
-          <w:sz w:val="22"/>
-          <w:szCs w:val="18"/>
-        </w:rPr>
         <w:t>.</w:t>
       </w:r>
       <w:r>
-        <w:rPr>
-          <w:sz w:val="22"/>
-          <w:szCs w:val="18"/>
-        </w:rPr>
         <w:t xml:space="preserve"> However, despite the different use case, there still exists a subset of features from the ones used in chess engines that can provide play style insights.</w:t>
       </w:r>
     </w:p>
-    <w:p>
-      <w:pPr>
-        <w:rPr>
-          <w:sz w:val="22"/>
-          <w:szCs w:val="18"/>
-        </w:rPr>
-      </w:pPr>
-    </w:p>
-    <w:p>
-      <w:pPr>
-        <w:pStyle w:val="Heading3"/>
-        <w:numPr>
-          <w:ilvl w:val="1"/>
-          <w:numId w:val="22"/>
-        </w:numPr>
-      </w:pPr>
+    <w:p/>
+    <w:p>
+      <w:pPr>
+        <w:pStyle w:val="Heading2"/>
+      </w:pPr>
+      <w:r>
+        <w:t>2.3</w:t>
+      </w:r>
+      <w:r>
+        <w:tab/>
+      </w:r>
       <w:r>
         <w:t>Feature Design for Style Classification</w:t>
       </w:r>
     </w:p>
     <w:p>
-      <w:pPr>
-        <w:rPr>
-          <w:sz w:val="22"/>
-          <w:szCs w:val="18"/>
-        </w:rPr>
-      </w:pPr>
-      <w:r>
-        <w:rPr>
-          <w:sz w:val="22"/>
-          <w:szCs w:val="18"/>
-        </w:rPr>
+      <w:r>
         <w:t xml:space="preserve">Research specifically targeting playing style has developed features that characterize decision-making tendencies rather than position quality. A predictive modelling study extracted eight distinct features to differentiate styles among elite players including Magnus Carlsen, Hikaru Nakamura, and Garry Kasparov (Aniketh Kalagara, 2024). These features ranged from game length (distinguishing patient players who prefer lengthy strategic battles from those seeking quick tactical victories) to trade frequency (capturing willingness to simplify positions versus maintaining tension). The research successfully trained models to distinguish between players, establishing that behavioural features could serve as effective style discriminators. </w:t>
       </w:r>
     </w:p>
     <w:p>
-      <w:pPr>
-        <w:rPr>
-          <w:sz w:val="22"/>
-          <w:szCs w:val="18"/>
-        </w:rPr>
-      </w:pPr>
-      <w:r>
-        <w:rPr>
-          <w:sz w:val="22"/>
-          <w:szCs w:val="18"/>
-        </w:rPr>
+      <w:r>
         <w:t>A key difference to observe here is that the mentioned research focuses on a selected five players, all of whom are well-known grandmasters at the very upper echelons of chess skill, while this project uses games from random players to attempt to create a more relatable model.</w:t>
       </w:r>
     </w:p>
-    <w:p>
-      <w:pPr>
-        <w:rPr>
-          <w:sz w:val="22"/>
-          <w:szCs w:val="18"/>
-        </w:rPr>
-      </w:pPr>
-    </w:p>
-    <w:p>
-      <w:pPr>
-        <w:pStyle w:val="Heading3"/>
+    <w:p/>
+    <w:p>
+      <w:pPr>
+        <w:pStyle w:val="Heading2"/>
       </w:pPr>
       <w:r>
         <w:t>2.4</w:t>
@@ -2595,238 +2335,102 @@
         <w:tab/>
       </w:r>
       <w:r>
+        <w:t>Learned Representation</w:t>
+      </w:r>
+    </w:p>
+    <w:p>
+      <w:r>
+        <w:t>The development of</w:t>
+      </w:r>
+      <w:r>
+        <w:t xml:space="preserve"> the chess engine</w:t>
+      </w:r>
+      <w:r>
+        <w:t xml:space="preserve"> AlphaZero marked a paradigm shift away from hand-crafted features toward learned representations. Unlike traditional engines requiring explicit feature engineering, AlphaZero achieved superhuman performance "starting from random play, and given no domain knowledge except the game rules"</w:t>
+      </w:r>
+      <w:r>
+        <w:t xml:space="preserve"> (Technology Networks, 2018)</w:t>
+      </w:r>
+      <w:r>
+        <w:t>. Through self-play and deep reinforcement learning, it automatically discovered relevant positional concepts without human intervention, eliminating the need for explicit feature design.</w:t>
+      </w:r>
+    </w:p>
+    <w:p>
+      <w:r>
+        <w:t>Like before</w:t>
+      </w:r>
+      <w:r>
+        <w:t xml:space="preserve">, this approach targets optimal play rather than human style characterization. The Maia Chess project </w:t>
+      </w:r>
+      <w:r>
+        <w:t xml:space="preserve">from </w:t>
+      </w:r>
+      <w:r>
+        <w:t>McIlroy-Young et al.</w:t>
+      </w:r>
+      <w:r>
+        <w:t xml:space="preserve"> (2020) </w:t>
+      </w:r>
+      <w:r>
+        <w:t>adapted AlphaZero's deep learning architecture specifically for modelling human behaviour, training separate neural networks on games from players at different rating level</w:t>
+      </w:r>
+      <w:r>
+        <w:t>s</w:t>
+      </w:r>
+      <w:r>
+        <w:t xml:space="preserve">. Rather than hand-crafting features, Maia learned representations directly from millions of human games, achieving significantly higher accuracy in predicting human moves than traditional engines. This demonstrated that neural </w:t>
+      </w:r>
+      <w:r>
+        <w:lastRenderedPageBreak/>
+        <w:t>networks could capture subtle behavioural patterns without explicit feature engineering, though at the cost of model interpretability.</w:t>
+      </w:r>
+    </w:p>
+    <w:p/>
+    <w:p>
+      <w:pPr>
+        <w:pStyle w:val="Heading2"/>
+      </w:pPr>
+      <w:r>
+        <w:t>2.5</w:t>
+      </w:r>
+      <w:r>
         <w:tab/>
-        <w:t>Learned Representation</w:t>
-      </w:r>
-    </w:p>
-    <w:p>
-      <w:pPr>
-        <w:rPr>
-          <w:sz w:val="22"/>
-          <w:szCs w:val="18"/>
-        </w:rPr>
-      </w:pPr>
-      <w:r>
-        <w:rPr>
-          <w:sz w:val="22"/>
-          <w:szCs w:val="18"/>
-        </w:rPr>
-        <w:t>The development of</w:t>
-      </w:r>
-      <w:r>
-        <w:rPr>
-          <w:sz w:val="22"/>
-          <w:szCs w:val="18"/>
-        </w:rPr>
-        <w:t xml:space="preserve"> the chess engine</w:t>
-      </w:r>
-      <w:r>
-        <w:rPr>
-          <w:sz w:val="22"/>
-          <w:szCs w:val="18"/>
-        </w:rPr>
-        <w:t xml:space="preserve"> AlphaZero marked a paradigm shift away from hand-crafted features toward learned representations. Unlike traditional engines requiring explicit feature engineering, AlphaZero achieved superhuman performance "starting from random play, and given no domain knowledge except the game rules"</w:t>
-      </w:r>
-      <w:r>
-        <w:rPr>
-          <w:sz w:val="22"/>
-          <w:szCs w:val="18"/>
-        </w:rPr>
-        <w:t xml:space="preserve"> (Technology Networks, 2018)</w:t>
-      </w:r>
-      <w:r>
-        <w:rPr>
-          <w:sz w:val="22"/>
-          <w:szCs w:val="18"/>
-        </w:rPr>
-        <w:t>. Through self-play and deep reinforcement learning, it automatically discovered relevant positional concepts without human intervention, eliminating the need for explicit feature design.</w:t>
-      </w:r>
-    </w:p>
-    <w:p>
-      <w:pPr>
-        <w:rPr>
-          <w:sz w:val="22"/>
-          <w:szCs w:val="18"/>
-        </w:rPr>
-      </w:pPr>
-      <w:r>
-        <w:rPr>
-          <w:sz w:val="22"/>
-          <w:szCs w:val="18"/>
-        </w:rPr>
-        <w:t>Like before</w:t>
-      </w:r>
-      <w:r>
-        <w:rPr>
-          <w:sz w:val="22"/>
-          <w:szCs w:val="18"/>
-        </w:rPr>
-        <w:t xml:space="preserve">, this approach targets optimal play rather than human style characterization. The Maia Chess project </w:t>
-      </w:r>
-      <w:r>
-        <w:rPr>
-          <w:sz w:val="22"/>
-          <w:szCs w:val="18"/>
-        </w:rPr>
-        <w:t xml:space="preserve">from </w:t>
-      </w:r>
-      <w:r>
-        <w:rPr>
-          <w:sz w:val="22"/>
-          <w:szCs w:val="18"/>
-        </w:rPr>
-        <w:t>McIlroy-Young et al.</w:t>
-      </w:r>
-      <w:r>
-        <w:rPr>
-          <w:sz w:val="22"/>
-          <w:szCs w:val="18"/>
-        </w:rPr>
-        <w:t xml:space="preserve"> (2020) </w:t>
-      </w:r>
-      <w:r>
-        <w:rPr>
-          <w:sz w:val="22"/>
-          <w:szCs w:val="18"/>
-        </w:rPr>
-        <w:t xml:space="preserve">adapted AlphaZero's deep learning architecture specifically for </w:t>
-      </w:r>
-      <w:r>
-        <w:rPr>
-          <w:sz w:val="22"/>
-          <w:szCs w:val="18"/>
-        </w:rPr>
-        <w:t>modelling</w:t>
-      </w:r>
-      <w:r>
-        <w:rPr>
-          <w:sz w:val="22"/>
-          <w:szCs w:val="18"/>
-        </w:rPr>
-        <w:t xml:space="preserve"> human </w:t>
-      </w:r>
-      <w:r>
-        <w:rPr>
-          <w:sz w:val="22"/>
-          <w:szCs w:val="18"/>
-        </w:rPr>
-        <w:t>behaviour</w:t>
-      </w:r>
-      <w:r>
-        <w:rPr>
-          <w:sz w:val="22"/>
-          <w:szCs w:val="18"/>
-        </w:rPr>
-        <w:t>, training separate neural networks on games from players at different rating level</w:t>
-      </w:r>
-      <w:r>
-        <w:rPr>
-          <w:sz w:val="22"/>
-          <w:szCs w:val="18"/>
-        </w:rPr>
-        <w:t>s</w:t>
-      </w:r>
-      <w:r>
-        <w:rPr>
-          <w:sz w:val="22"/>
-          <w:szCs w:val="18"/>
-        </w:rPr>
-        <w:t xml:space="preserve">. Rather than hand-crafting features, Maia learned representations directly from millions of human games, achieving significantly higher accuracy in predicting human moves than traditional engines. This demonstrated that neural networks could capture subtle </w:t>
-      </w:r>
-      <w:r>
-        <w:rPr>
-          <w:sz w:val="22"/>
-          <w:szCs w:val="18"/>
-        </w:rPr>
-        <w:t>behavioural</w:t>
-      </w:r>
-      <w:r>
-        <w:rPr>
-          <w:sz w:val="22"/>
-          <w:szCs w:val="18"/>
-        </w:rPr>
-        <w:t xml:space="preserve"> patterns without explicit feature engineering, though at the cost of model interpretability.</w:t>
-      </w:r>
-    </w:p>
-    <w:p>
-      <w:pPr>
-        <w:rPr>
-          <w:sz w:val="22"/>
-          <w:szCs w:val="18"/>
-        </w:rPr>
-      </w:pPr>
-    </w:p>
-    <w:p>
-      <w:pPr>
-        <w:pStyle w:val="Heading3"/>
-      </w:pPr>
-      <w:r>
-        <w:lastRenderedPageBreak/>
-        <w:t>2.5</w:t>
-      </w:r>
-      <w:r>
-        <w:tab/>
-      </w:r>
-      <w:r>
-        <w:tab/>
-        <w:t xml:space="preserve"> Practical Considerations</w:t>
-      </w:r>
-    </w:p>
-    <w:p>
-      <w:pPr>
-        <w:rPr>
-          <w:sz w:val="22"/>
-          <w:szCs w:val="18"/>
-        </w:rPr>
-      </w:pPr>
-      <w:r>
-        <w:rPr>
-          <w:sz w:val="22"/>
-          <w:szCs w:val="18"/>
-        </w:rPr>
-        <w:t>For this project we must consider the implications of our approach. Should we select hand-crafted feature engineering, we gain interpretability since we can identify which behaviour patterns distinguish play styles. On the other hand, learned representations with neural networks may provide better accuracy and be able detect more subtle behaviour patterns that are not caught by experts. The downside is that it introduces a ‘black box’ because we are unable to interpret these patterns.</w:t>
-      </w:r>
-    </w:p>
-    <w:p>
-      <w:pPr>
-        <w:rPr>
-          <w:sz w:val="22"/>
-          <w:szCs w:val="18"/>
-        </w:rPr>
-      </w:pPr>
-      <w:r>
-        <w:rPr>
-          <w:sz w:val="22"/>
-          <w:szCs w:val="18"/>
-        </w:rPr>
+      </w:r>
+      <w:r>
+        <w:t>Practical Considerations</w:t>
+      </w:r>
+    </w:p>
+    <w:p>
+      <w:r>
+        <w:t xml:space="preserve">For this project we must consider the implications of our approach. </w:t>
+      </w:r>
+      <w:r>
+        <w:t xml:space="preserve">If we opt for </w:t>
+      </w:r>
+      <w:r>
+        <w:t xml:space="preserve">hand-crafted feature engineering, we gain interpretability since we can identify which behaviour patterns distinguish </w:t>
+      </w:r>
+      <w:r>
+        <w:t xml:space="preserve">different </w:t>
+      </w:r>
+      <w:r>
+        <w:t>play styles. On the other hand, learned representations with neural networks may provide better accuracy and be able detect more subtle behaviour patterns that are not caught by experts. The downside is that it introduces a ‘black box’ because we are unable to interpret these patterns.</w:t>
+      </w:r>
+    </w:p>
+    <w:p>
+      <w:r>
         <w:t xml:space="preserve">Another consideration we must address is that of computational power. This project will be conducted on limited hardware compared to that of other projects such as the Maia Chess project. </w:t>
       </w:r>
       <w:r>
-        <w:rPr>
-          <w:sz w:val="22"/>
-          <w:szCs w:val="18"/>
-        </w:rPr>
         <w:t xml:space="preserve">What this means is that we could potentially be forced to sacrifice some accuracy </w:t>
       </w:r>
       <w:r>
-        <w:rPr>
-          <w:sz w:val="22"/>
-          <w:szCs w:val="18"/>
-        </w:rPr>
         <w:t>to</w:t>
       </w:r>
       <w:r>
-        <w:rPr>
-          <w:sz w:val="22"/>
-          <w:szCs w:val="18"/>
-        </w:rPr>
         <w:t xml:space="preserve"> keep the project within a reasonable scope, and the results of certain approaches will yield results that are affected by our constraint of processing power.</w:t>
       </w:r>
       <w:r>
-        <w:rPr>
-          <w:sz w:val="22"/>
-          <w:szCs w:val="18"/>
-        </w:rPr>
         <w:t xml:space="preserve"> For example, training the model on games using a chess engine on a higher depth would grant access to a more accurate set of best possible moves but would take a significantly longer amount of time. Even inputting more games into the pre-processing pipeline would give more reliable results but would take longer than this project warrants.</w:t>
       </w:r>
     </w:p>
@@ -2857,11 +2461,369 @@
       </w:r>
     </w:p>
     <w:p>
-      <w:pPr>
-        <w:rPr>
-          <w:sz w:val="22"/>
-          <w:szCs w:val="22"/>
-        </w:rPr>
+      <w:r>
+        <w:t>This chapter describes the</w:t>
+      </w:r>
+      <w:r>
+        <w:t xml:space="preserve"> </w:t>
+      </w:r>
+      <w:r>
+        <w:t>approach taken to develop a machine learning-based chess playstyle classifier that enables</w:t>
+      </w:r>
+      <w:r>
+        <w:t xml:space="preserve"> the</w:t>
+      </w:r>
+      <w:r>
+        <w:t xml:space="preserve"> average chess player to understand their general playing style. The methodology addresses the core requirement of creating an accessible tool rather than a complex game analysis system. The approach was structured into five phases, each with defined deliverables aligned to the project objectives established in Chapter 1.</w:t>
+      </w:r>
+    </w:p>
+    <w:p>
+      <w:pPr>
+        <w:pStyle w:val="Heading2"/>
+      </w:pPr>
+      <w:r>
+        <w:t>3</w:t>
+      </w:r>
+      <w:r>
+        <w:t>.1</w:t>
+      </w:r>
+      <w:r>
+        <w:tab/>
+        <w:t>Overview of Methodology</w:t>
+      </w:r>
+    </w:p>
+    <w:p>
+      <w:r>
+        <w:t>The project is split into 5 distinct stages of development: data preprocessing</w:t>
+      </w:r>
+      <w:r>
+        <w:t>,</w:t>
+      </w:r>
+      <w:r>
+        <w:t xml:space="preserve"> training the Random Forest model</w:t>
+      </w:r>
+      <w:r>
+        <w:t>,</w:t>
+      </w:r>
+      <w:r>
+        <w:t xml:space="preserve"> training the Neural Network</w:t>
+      </w:r>
+      <w:r>
+        <w:t>,</w:t>
+      </w:r>
+      <w:r>
+        <w:t xml:space="preserve"> model evaluation and comparison</w:t>
+      </w:r>
+      <w:r>
+        <w:t>, and publication of the resulting tools.</w:t>
+      </w:r>
+    </w:p>
+    <w:p>
+      <w:r>
+        <w:t xml:space="preserve">Using a phased approach allows us to efficiently allocate </w:t>
+      </w:r>
+      <w:r>
+        <w:t>time and resources. It minimises the refactoring of code compared to a non-structured project plan and arranges the development process such that each stage produces a deliverable and addresses an objective of the project.</w:t>
+      </w:r>
+    </w:p>
+    <w:p>
+      <w:r>
+        <w:t>Stage 1 will focus on the first objective which is to develop and validate a labelled dataset on which the models can be trained. In this stage, we include the design and implementation of domain-specific features to increase model accuracy.</w:t>
+      </w:r>
+    </w:p>
+    <w:p>
+      <w:r>
+        <w:t>Stage</w:t>
+      </w:r>
+      <w:r>
+        <w:t>s</w:t>
+      </w:r>
+      <w:r>
+        <w:t xml:space="preserve"> 2 </w:t>
+      </w:r>
+      <w:r>
+        <w:t>and 3 are centred around the development of the Random Forest and Neural Network models, respectively.</w:t>
+      </w:r>
+      <w:r>
+        <w:t xml:space="preserve"> It will utilise the labelled data from the previous stage to produce</w:t>
+      </w:r>
+      <w:r>
+        <w:t xml:space="preserve"> models capable of classifying a user’s play style from a game.</w:t>
+      </w:r>
+    </w:p>
+    <w:p>
+      <w:r>
+        <w:t>Stage 4 consists of evaluating and comparing the two models based on performance metrics such as accuracy, precision, F1 score, etc. Here, we will also look at which model is more suitable for the average player, and which one should be chosen based on different hardware.</w:t>
+      </w:r>
+    </w:p>
+    <w:p>
+      <w:r>
+        <w:t>Stage 5 looks at delivering the products of all previous stages through an accessible medium that allows users to input a chess game that they have played and receive a chess playing style.</w:t>
+      </w:r>
+    </w:p>
+    <w:p>
+      <w:r>
+        <w:t>GitHub is the chosen version control tool used throughout the project.</w:t>
+      </w:r>
+    </w:p>
+    <w:p/>
+    <w:p>
+      <w:pPr>
+        <w:pStyle w:val="Heading2"/>
+      </w:pPr>
+      <w:r>
+        <w:lastRenderedPageBreak/>
+        <w:t>3.2</w:t>
+      </w:r>
+      <w:r>
+        <w:tab/>
+        <w:t>Data Collection and Preparation Pipeline</w:t>
+      </w:r>
+    </w:p>
+    <w:p>
+      <w:pPr>
+        <w:pStyle w:val="Heading3"/>
+      </w:pPr>
+      <w:r>
+        <w:t>3.2.1</w:t>
+      </w:r>
+      <w:r>
+        <w:tab/>
+        <w:t>Data Source</w:t>
+      </w:r>
+    </w:p>
+    <w:p>
+      <w:r>
+        <w:t xml:space="preserve">Before anything else, we must prepare and validate data to ensure that it is reliable and usable for training our models. </w:t>
+      </w:r>
+      <w:r>
+        <w:t xml:space="preserve">This was chosen as the </w:t>
+      </w:r>
+      <w:r>
+        <w:t>first phase since it makes it easier during subsequent phases to design models around the data that we have</w:t>
+      </w:r>
+      <w:r>
+        <w:t>. If we created the training procedure first, we would require data to test its performance anyway, so it makes sense to start with the data preparation.</w:t>
+      </w:r>
+    </w:p>
+    <w:p>
+      <w:r>
+        <w:rPr>
+          <w:noProof/>
+        </w:rPr>
+        <w:drawing>
+          <wp:anchor distT="0" distB="0" distL="114300" distR="114300" simplePos="0" relativeHeight="251657216" behindDoc="0" locked="0" layoutInCell="1" allowOverlap="1" wp14:anchorId="1B4539B6" wp14:editId="6CBA5237">
+            <wp:simplePos x="0" y="0"/>
+            <wp:positionH relativeFrom="column">
+              <wp:posOffset>-276225</wp:posOffset>
+            </wp:positionH>
+            <wp:positionV relativeFrom="paragraph">
+              <wp:posOffset>3413125</wp:posOffset>
+            </wp:positionV>
+            <wp:extent cx="6285865" cy="3571875"/>
+            <wp:effectExtent l="0" t="0" r="635" b="9525"/>
+            <wp:wrapTopAndBottom/>
+            <wp:docPr id="828702723" name="Picture 5"/>
+            <wp:cNvGraphicFramePr>
+              <a:graphicFrameLocks xmlns:a="http://schemas.openxmlformats.org/drawingml/2006/main" noChangeAspect="1"/>
+            </wp:cNvGraphicFramePr>
+            <a:graphic xmlns:a="http://schemas.openxmlformats.org/drawingml/2006/main">
+              <a:graphicData uri="http://schemas.openxmlformats.org/drawingml/2006/picture">
+                <pic:pic xmlns:pic="http://schemas.openxmlformats.org/drawingml/2006/picture">
+                  <pic:nvPicPr>
+                    <pic:cNvPr id="828702723" name="Picture 828702723"/>
+                    <pic:cNvPicPr/>
+                  </pic:nvPicPr>
+                  <pic:blipFill>
+                    <a:blip r:embed="rId10">
+                      <a:extLst>
+                        <a:ext uri="{28A0092B-C50C-407E-A947-70E740481C1C}">
+                          <a14:useLocalDpi xmlns:a14="http://schemas.microsoft.com/office/drawing/2010/main" val="0"/>
+                        </a:ext>
+                      </a:extLst>
+                    </a:blip>
+                    <a:stretch>
+                      <a:fillRect/>
+                    </a:stretch>
+                  </pic:blipFill>
+                  <pic:spPr>
+                    <a:xfrm>
+                      <a:off x="0" y="0"/>
+                      <a:ext cx="6285865" cy="3571875"/>
+                    </a:xfrm>
+                    <a:prstGeom prst="rect">
+                      <a:avLst/>
+                    </a:prstGeom>
+                  </pic:spPr>
+                </pic:pic>
+              </a:graphicData>
+            </a:graphic>
+            <wp14:sizeRelH relativeFrom="margin">
+              <wp14:pctWidth>0</wp14:pctWidth>
+            </wp14:sizeRelH>
+            <wp14:sizeRelV relativeFrom="margin">
+              <wp14:pctHeight>0</wp14:pctHeight>
+            </wp14:sizeRelV>
+          </wp:anchor>
+        </w:drawing>
+      </w:r>
+      <w:r>
+        <w:t xml:space="preserve">The Lichess Open Database of chess games </w:t>
+      </w:r>
+      <w:r>
+        <w:t xml:space="preserve">provides large sets of games from players of all skill ratings from each year. We will be using the move sequence and the skill rating of each player from each game from one of the years, up until a variable maximum </w:t>
+      </w:r>
+      <w:r>
+        <w:t xml:space="preserve">of games: </w:t>
+      </w:r>
+      <w:r>
+        <w:t xml:space="preserve">we chose </w:t>
+      </w:r>
+      <w:r>
+        <w:t>1</w:t>
+      </w:r>
+      <w:r>
+        <w:t>000</w:t>
+      </w:r>
+      <w:r>
+        <w:t xml:space="preserve"> games, which means 2000 labelled items</w:t>
+      </w:r>
+      <w:r>
+        <w:t>.</w:t>
+      </w:r>
+      <w:r>
+        <w:t xml:space="preserve"> Another consideration is the skill rating diversity; a minimum rating of 1500 was applied so the script would only label the games of players with that rating or higher. To clarify, games where a player of at least 1500 is against a player of below 1500 would only yield one labelled game. The </w:t>
+      </w:r>
+      <w:r>
+        <w:t>reason for this minimum rating is that we want to try to eliminate games where players make many blunders or mistakes because these moves would affect the quality of the dataset and are more representative of skill limitation rather than play styles. We also avoid noise in the dataset, for example a lower-skilled player might make an unintentional prophylactic move</w:t>
+      </w:r>
+      <w:r>
+        <w:t>,</w:t>
+      </w:r>
+      <w:r>
+        <w:t xml:space="preserve"> which would otherwise be detected via feature engineering and cause the algorithm to label that player</w:t>
+      </w:r>
+      <w:r>
+        <w:t xml:space="preserve">’s style </w:t>
+      </w:r>
+      <w:r>
+        <w:t xml:space="preserve">as </w:t>
+      </w:r>
+      <w:r>
+        <w:t xml:space="preserve">‘positional’, when in reality the player did not perform the move with positional play in mind. Lastly, 1500 rating is the </w:t>
+      </w:r>
+      <w:r>
+        <w:t xml:space="preserve">top </w:t>
+      </w:r>
+      <w:r>
+        <w:t>40.9</w:t>
+      </w:r>
+      <w:r>
+        <w:t>%</w:t>
+      </w:r>
+      <w:r>
+        <w:t xml:space="preserve"> of all players on Lichess</w:t>
+      </w:r>
+      <w:r>
+        <w:t xml:space="preserve">, as seen </w:t>
+      </w:r>
+      <w:r>
+        <w:rPr>
+          <w:b/>
+          <w:bCs/>
+        </w:rPr>
+        <w:lastRenderedPageBreak/>
+        <w:t>Figure 3.1</w:t>
+      </w:r>
+      <w:r>
+        <w:tab/>
+        <w:t>This is the weekly rating distribution from 15</w:t>
+      </w:r>
+      <w:r>
+        <w:rPr>
+          <w:vertAlign w:val="superscript"/>
+        </w:rPr>
+        <w:t>th</w:t>
+      </w:r>
+      <w:r>
+        <w:t xml:space="preserve"> January 2026.</w:t>
+      </w:r>
+    </w:p>
+    <w:p>
+      <w:r>
+        <w:t>in Figure 3.1</w:t>
+      </w:r>
+      <w:r>
+        <w:t>, so it is a reasonable choice when developing a tool to be used by the average player.</w:t>
+      </w:r>
+      <w:r>
+        <w:t xml:space="preserve"> Although these statistics are from 2026, the Glicko-2 </w:t>
+      </w:r>
+      <w:r>
+        <w:t>rating system ensures that the median rating does not deviate significantly from 1500.</w:t>
+      </w:r>
+    </w:p>
+    <w:p>
+      <w:pPr>
+        <w:pStyle w:val="Heading3"/>
+      </w:pPr>
+      <w:r>
+        <w:t>3.2.2</w:t>
+      </w:r>
+      <w:r>
+        <w:tab/>
+        <w:t>Feature Extraction</w:t>
+      </w:r>
+    </w:p>
+    <w:p>
+      <w:r>
+        <w:t>We have just mentioned feature engineering, which is vital part of our preprocessing pipeline.</w:t>
+      </w:r>
+      <w:r>
+        <w:t xml:space="preserve"> For this, we </w:t>
+      </w:r>
+      <w:r>
+        <w:t xml:space="preserve">defined 20 distinct features </w:t>
+      </w:r>
+      <w:r>
+        <w:t xml:space="preserve">that </w:t>
+      </w:r>
+      <w:r>
+        <w:t xml:space="preserve">can be extracted from each game using the help of a chess engine, Stockfish. </w:t>
+      </w:r>
+      <w:r>
+        <w:t>After e</w:t>
+      </w:r>
+      <w:r>
+        <w:t>ach mov</w:t>
+      </w:r>
+      <w:r>
+        <w:t>e</w:t>
+      </w:r>
+      <w:r>
+        <w:t>, we let Stockfish analyse the board to give us the best moves in that position and the evaluation of the board state (who is winning and by how much).</w:t>
+      </w:r>
+    </w:p>
+    <w:p>
+      <w:pPr>
+        <w:pStyle w:val="Heading2"/>
+      </w:pPr>
+      <w:r>
+        <w:t>3.3</w:t>
+      </w:r>
+      <w:r>
+        <w:tab/>
+        <w:t>Model Selection and Development Strategy</w:t>
+      </w:r>
+    </w:p>
+    <w:p>
+      <w:r>
+        <w:t xml:space="preserve">Next, we have the training of the two models: Random Forest and Neural Network. The decision to separate these two into individual phases of development was guided by the characteristics of each approach. The Random Forest model is selected to be trained first because it is a much more interpretable method than the Neural Network, meaning that we can understand </w:t>
+      </w:r>
+    </w:p>
+    <w:p>
+      <w:pPr>
+        <w:pStyle w:val="Heading2"/>
       </w:pPr>
       <w:bookmarkStart w:id="8" w:name="_Toc281120924"/>
       <w:bookmarkStart w:id="9" w:name="_Toc281123569"/>
@@ -2870,32 +2832,6 @@
       <w:bookmarkStart w:id="12" w:name="_Toc281120923"/>
       <w:bookmarkStart w:id="13" w:name="_Toc281123568"/>
       <w:bookmarkStart w:id="14" w:name="_Toc281125809"/>
-      <w:r>
-        <w:rPr>
-          <w:sz w:val="22"/>
-          <w:szCs w:val="22"/>
-        </w:rPr>
-        <w:t>&lt;Everythi</w:t>
-      </w:r>
-      <w:r>
-        <w:rPr>
-          <w:sz w:val="22"/>
-          <w:szCs w:val="22"/>
-        </w:rPr>
-        <w:t>ng that comes under the `Methodology</w:t>
-      </w:r>
-      <w:r>
-        <w:rPr>
-          <w:sz w:val="22"/>
-          <w:szCs w:val="22"/>
-        </w:rPr>
-        <w:t>' criterion in the mark scheme should be described in one, or possibly more than one, chapter(s).&gt;</w:t>
-      </w:r>
-    </w:p>
-    <w:p>
-      <w:pPr>
-        <w:pStyle w:val="Heading2"/>
-      </w:pPr>
       <w:r>
         <w:t>2.1</w:t>
       </w:r>
@@ -2947,14 +2883,12 @@
               </w:tabs>
               <w:rPr>
                 <w:b/>
-                <w:sz w:val="22"/>
                 <w:szCs w:val="22"/>
               </w:rPr>
             </w:pPr>
             <w:r>
               <w:rPr>
                 <w:b/>
-                <w:sz w:val="22"/>
                 <w:szCs w:val="22"/>
               </w:rPr>
               <w:t>Heading One</w:t>
@@ -2977,14 +2911,12 @@
               </w:tabs>
               <w:rPr>
                 <w:b/>
-                <w:sz w:val="22"/>
                 <w:szCs w:val="22"/>
               </w:rPr>
             </w:pPr>
             <w:r>
               <w:rPr>
                 <w:b/>
-                <w:sz w:val="22"/>
                 <w:szCs w:val="22"/>
               </w:rPr>
               <w:t>Heading Two</w:t>
@@ -3007,14 +2939,12 @@
               </w:tabs>
               <w:rPr>
                 <w:b/>
-                <w:sz w:val="22"/>
                 <w:szCs w:val="22"/>
               </w:rPr>
             </w:pPr>
             <w:r>
               <w:rPr>
                 <w:b/>
-                <w:sz w:val="22"/>
                 <w:szCs w:val="22"/>
               </w:rPr>
               <w:t>Heading Three</w:t>
@@ -3041,13 +2971,11 @@
                 <w:tab w:val="decimal" w:pos="1123"/>
               </w:tabs>
               <w:rPr>
-                <w:sz w:val="22"/>
                 <w:szCs w:val="22"/>
               </w:rPr>
             </w:pPr>
             <w:r>
               <w:rPr>
-                <w:sz w:val="22"/>
                 <w:szCs w:val="22"/>
               </w:rPr>
               <w:t>1.1</w:t>
@@ -3067,13 +2995,11 @@
                 <w:tab w:val="decimal" w:pos="1044"/>
               </w:tabs>
               <w:rPr>
-                <w:sz w:val="22"/>
                 <w:szCs w:val="22"/>
               </w:rPr>
             </w:pPr>
             <w:r>
               <w:rPr>
-                <w:sz w:val="22"/>
                 <w:szCs w:val="22"/>
               </w:rPr>
               <w:t>1.2</w:t>
@@ -3095,13 +3021,11 @@
                 <w:tab w:val="decimal" w:pos="1269"/>
               </w:tabs>
               <w:rPr>
-                <w:sz w:val="22"/>
                 <w:szCs w:val="22"/>
               </w:rPr>
             </w:pPr>
             <w:r>
               <w:rPr>
-                <w:sz w:val="22"/>
                 <w:szCs w:val="22"/>
               </w:rPr>
               <w:t>1.3</w:t>
@@ -3127,13 +3051,11 @@
                 <w:tab w:val="decimal" w:pos="1123"/>
               </w:tabs>
               <w:rPr>
-                <w:sz w:val="22"/>
                 <w:szCs w:val="22"/>
               </w:rPr>
             </w:pPr>
             <w:r>
               <w:rPr>
-                <w:sz w:val="22"/>
                 <w:szCs w:val="22"/>
               </w:rPr>
               <w:t>1.21</w:t>
@@ -3150,13 +3072,11 @@
                 <w:tab w:val="decimal" w:pos="1044"/>
               </w:tabs>
               <w:rPr>
-                <w:sz w:val="22"/>
                 <w:szCs w:val="22"/>
               </w:rPr>
             </w:pPr>
             <w:r>
               <w:rPr>
-                <w:sz w:val="22"/>
                 <w:szCs w:val="22"/>
               </w:rPr>
               <w:t>1.22</w:t>
@@ -3177,13 +3097,11 @@
                 <w:tab w:val="decimal" w:pos="1269"/>
               </w:tabs>
               <w:rPr>
-                <w:sz w:val="22"/>
                 <w:szCs w:val="22"/>
               </w:rPr>
             </w:pPr>
             <w:r>
               <w:rPr>
-                <w:sz w:val="22"/>
                 <w:szCs w:val="22"/>
               </w:rPr>
               <w:t>12.3</w:t>
@@ -3210,13 +3128,11 @@
                 <w:tab w:val="decimal" w:pos="1123"/>
               </w:tabs>
               <w:rPr>
-                <w:sz w:val="22"/>
                 <w:szCs w:val="22"/>
               </w:rPr>
             </w:pPr>
             <w:r>
               <w:rPr>
-                <w:sz w:val="22"/>
                 <w:szCs w:val="22"/>
               </w:rPr>
               <w:t>12.31</w:t>
@@ -3236,13 +3152,11 @@
                 <w:tab w:val="decimal" w:pos="1044"/>
               </w:tabs>
               <w:rPr>
-                <w:sz w:val="22"/>
                 <w:szCs w:val="22"/>
               </w:rPr>
             </w:pPr>
             <w:r>
               <w:rPr>
-                <w:sz w:val="22"/>
                 <w:szCs w:val="22"/>
               </w:rPr>
               <w:t>12.32</w:t>
@@ -3264,13 +3178,11 @@
                 <w:tab w:val="decimal" w:pos="1269"/>
               </w:tabs>
               <w:rPr>
-                <w:sz w:val="22"/>
                 <w:szCs w:val="22"/>
               </w:rPr>
             </w:pPr>
             <w:r>
               <w:rPr>
-                <w:sz w:val="22"/>
                 <w:szCs w:val="22"/>
               </w:rPr>
               <w:t>12.33</w:t>
@@ -3282,13 +3194,11 @@
     <w:p>
       <w:pPr>
         <w:rPr>
-          <w:sz w:val="22"/>
-          <w:szCs w:val="22"/>
-        </w:rPr>
-      </w:pPr>
-      <w:r>
-        <w:rPr>
-          <w:sz w:val="22"/>
+          <w:szCs w:val="22"/>
+        </w:rPr>
+      </w:pPr>
+      <w:r>
+        <w:rPr>
           <w:szCs w:val="22"/>
         </w:rPr>
         <w:t>Text before table.  Text before table.  Text before table.  Text before table.  Text before table.  Text before table.  Text before table.  Text before table.  Text before table.  Text before table.</w:t>
@@ -3297,7 +3207,6 @@
     <w:p>
       <w:pPr>
         <w:rPr>
-          <w:sz w:val="22"/>
           <w:szCs w:val="22"/>
         </w:rPr>
       </w:pPr>
@@ -3307,7 +3216,6 @@
         <w:pStyle w:val="tablecaption"/>
         <w:rPr>
           <w:b/>
-          <w:sz w:val="22"/>
           <w:szCs w:val="22"/>
         </w:rPr>
       </w:pPr>
@@ -3323,7 +3231,6 @@
         <w:pStyle w:val="tablecaption"/>
         <w:rPr>
           <w:b/>
-          <w:sz w:val="22"/>
           <w:szCs w:val="22"/>
         </w:rPr>
       </w:pPr>
@@ -3333,7 +3240,6 @@
         <w:pStyle w:val="tablecaption"/>
         <w:rPr>
           <w:b/>
-          <w:sz w:val="22"/>
           <w:szCs w:val="22"/>
         </w:rPr>
       </w:pPr>
@@ -3343,7 +3249,6 @@
         <w:pStyle w:val="tablecaption"/>
         <w:rPr>
           <w:b/>
-          <w:sz w:val="22"/>
           <w:szCs w:val="22"/>
         </w:rPr>
       </w:pPr>
@@ -3353,14 +3258,12 @@
         <w:pStyle w:val="tablecaption"/>
         <w:ind w:left="0" w:firstLine="0"/>
         <w:rPr>
-          <w:sz w:val="22"/>
           <w:szCs w:val="22"/>
         </w:rPr>
       </w:pPr>
       <w:r>
         <w:rPr>
           <w:b/>
-          <w:sz w:val="22"/>
           <w:szCs w:val="22"/>
         </w:rPr>
         <w:t xml:space="preserve">Table </w:t>
@@ -3369,14 +3272,12 @@
       <w:r>
         <w:rPr>
           <w:b/>
-          <w:sz w:val="22"/>
           <w:szCs w:val="22"/>
         </w:rPr>
         <w:t>2.1</w:t>
       </w:r>
       <w:r>
         <w:rPr>
-          <w:sz w:val="22"/>
           <w:szCs w:val="22"/>
         </w:rPr>
         <w:t xml:space="preserve">  </w:t>
@@ -3388,28 +3289,24 @@
       <w:bookmarkEnd w:id="20"/>
       <w:r>
         <w:rPr>
-          <w:sz w:val="22"/>
           <w:szCs w:val="22"/>
         </w:rPr>
         <w:t>This is the table description in the ‘</w:t>
       </w:r>
       <w:r>
         <w:rPr>
-          <w:sz w:val="22"/>
           <w:szCs w:val="22"/>
         </w:rPr>
         <w:t>table description</w:t>
       </w:r>
       <w:r>
         <w:rPr>
-          <w:sz w:val="22"/>
           <w:szCs w:val="22"/>
         </w:rPr>
         <w:t>’ style</w:t>
       </w:r>
       <w:r>
         <w:rPr>
-          <w:sz w:val="22"/>
           <w:szCs w:val="22"/>
         </w:rPr>
         <w:t>.</w:t>
@@ -3418,7 +3315,6 @@
     <w:p>
       <w:pPr>
         <w:rPr>
-          <w:sz w:val="22"/>
           <w:szCs w:val="22"/>
         </w:rPr>
       </w:pPr>
@@ -3429,6 +3325,7 @@
       </w:pPr>
       <w:bookmarkStart w:id="21" w:name="_Toc407145096"/>
       <w:r>
+        <w:lastRenderedPageBreak/>
         <w:t>2.</w:t>
       </w:r>
       <w:r>
@@ -3448,41 +3345,35 @@
     <w:p>
       <w:pPr>
         <w:rPr>
-          <w:sz w:val="22"/>
-          <w:szCs w:val="22"/>
-        </w:rPr>
-      </w:pPr>
-      <w:r>
-        <w:rPr>
-          <w:sz w:val="22"/>
+          <w:szCs w:val="22"/>
+        </w:rPr>
+      </w:pPr>
+      <w:r>
+        <w:rPr>
           <w:szCs w:val="22"/>
         </w:rPr>
         <w:t xml:space="preserve">Figures can be added using the </w:t>
       </w:r>
       <w:r>
         <w:rPr>
-          <w:sz w:val="22"/>
           <w:szCs w:val="22"/>
         </w:rPr>
         <w:t>Illustrations section of</w:t>
       </w:r>
       <w:r>
         <w:rPr>
-          <w:sz w:val="22"/>
           <w:szCs w:val="22"/>
         </w:rPr>
         <w:t xml:space="preserve"> the </w:t>
       </w:r>
       <w:r>
         <w:rPr>
-          <w:sz w:val="22"/>
           <w:szCs w:val="22"/>
         </w:rPr>
         <w:t>Insert tab</w:t>
       </w:r>
       <w:r>
         <w:rPr>
-          <w:sz w:val="22"/>
           <w:szCs w:val="22"/>
         </w:rPr>
         <w:t>.</w:t>
@@ -3494,14 +3385,12 @@
         <w:keepLines/>
         <w:jc w:val="center"/>
         <w:rPr>
-          <w:sz w:val="22"/>
-          <w:szCs w:val="22"/>
-        </w:rPr>
-      </w:pPr>
-      <w:r>
-        <w:rPr>
-          <w:noProof/>
-          <w:sz w:val="22"/>
+          <w:szCs w:val="22"/>
+        </w:rPr>
+      </w:pPr>
+      <w:r>
+        <w:rPr>
+          <w:noProof/>
           <w:szCs w:val="22"/>
         </w:rPr>
         <w:object w:dxaOrig="4001" w:dyaOrig="1840" w14:anchorId="339A407C">
@@ -3525,9 +3414,9 @@
             <o:lock v:ext="edit" aspectratio="t"/>
           </v:shapetype>
           <v:shape id="_x0000_i1025" type="#_x0000_t75" alt="" style="width:199.5pt;height:93.75pt;mso-width-percent:0;mso-height-percent:0;mso-width-percent:0;mso-height-percent:0" o:ole="" fillcolor="window">
-            <v:imagedata r:id="rId10" o:title=""/>
+            <v:imagedata r:id="rId11" o:title=""/>
           </v:shape>
-          <o:OLEObject Type="Embed" ProgID="MSDraw" ShapeID="_x0000_i1025" DrawAspect="Content" ObjectID="_1831053988" r:id="rId11">
+          <o:OLEObject Type="Embed" ProgID="MSDraw" ShapeID="_x0000_i1025" DrawAspect="Content" ObjectID="_1831152135" r:id="rId12">
             <o:FieldCodes>\* mergeformat</o:FieldCodes>
           </o:OLEObject>
         </w:object>
@@ -3537,7 +3426,6 @@
       <w:pPr>
         <w:pStyle w:val="figurecaption"/>
         <w:rPr>
-          <w:sz w:val="22"/>
           <w:szCs w:val="22"/>
         </w:rPr>
       </w:pPr>
@@ -3548,7 +3436,6 @@
       <w:r>
         <w:rPr>
           <w:b/>
-          <w:sz w:val="22"/>
           <w:szCs w:val="22"/>
         </w:rPr>
         <w:t xml:space="preserve">Figure </w:t>
@@ -3557,14 +3444,12 @@
       <w:r>
         <w:rPr>
           <w:b/>
-          <w:sz w:val="22"/>
           <w:szCs w:val="22"/>
         </w:rPr>
         <w:t>2.1</w:t>
       </w:r>
       <w:r>
         <w:rPr>
-          <w:sz w:val="22"/>
           <w:szCs w:val="22"/>
         </w:rPr>
         <w:t xml:space="preserve">  </w:t>
@@ -3574,28 +3459,24 @@
       <w:bookmarkEnd w:id="25"/>
       <w:r>
         <w:rPr>
-          <w:sz w:val="22"/>
           <w:szCs w:val="22"/>
         </w:rPr>
         <w:t>This is the figure description</w:t>
       </w:r>
       <w:r>
         <w:rPr>
-          <w:sz w:val="22"/>
           <w:szCs w:val="22"/>
         </w:rPr>
         <w:t xml:space="preserve"> in the ‘figure d</w:t>
       </w:r>
       <w:r>
         <w:rPr>
-          <w:sz w:val="22"/>
           <w:szCs w:val="22"/>
         </w:rPr>
         <w:t>escription’ style</w:t>
       </w:r>
       <w:r>
         <w:rPr>
-          <w:sz w:val="22"/>
           <w:szCs w:val="22"/>
         </w:rPr>
         <w:t>.</w:t>
@@ -3629,27 +3510,23 @@
     <w:p>
       <w:pPr>
         <w:rPr>
-          <w:sz w:val="22"/>
-          <w:szCs w:val="22"/>
-        </w:rPr>
-      </w:pPr>
-      <w:r>
-        <w:rPr>
-          <w:sz w:val="22"/>
+          <w:szCs w:val="22"/>
+        </w:rPr>
+      </w:pPr>
+      <w:r>
+        <w:rPr>
           <w:szCs w:val="22"/>
         </w:rPr>
         <w:t>&lt;Everything t</w:t>
       </w:r>
       <w:r>
         <w:rPr>
-          <w:sz w:val="22"/>
           <w:szCs w:val="22"/>
         </w:rPr>
         <w:t>hat comes under the `Implementation and Validation</w:t>
       </w:r>
       <w:r>
         <w:rPr>
-          <w:sz w:val="22"/>
           <w:szCs w:val="22"/>
         </w:rPr>
         <w:t>' criterion in the mark scheme should be described in one, or possibly more than one, chapter(s).&gt;</w:t>
@@ -3659,23 +3536,20 @@
     <w:p>
       <w:pPr>
         <w:rPr>
-          <w:sz w:val="22"/>
-          <w:szCs w:val="22"/>
-        </w:rPr>
-      </w:pPr>
-    </w:p>
-    <w:p>
-      <w:pPr>
-        <w:rPr>
-          <w:sz w:val="22"/>
-          <w:szCs w:val="22"/>
-        </w:rPr>
-      </w:pPr>
-    </w:p>
-    <w:p>
-      <w:pPr>
-        <w:rPr>
-          <w:sz w:val="22"/>
+          <w:szCs w:val="22"/>
+        </w:rPr>
+      </w:pPr>
+    </w:p>
+    <w:p>
+      <w:pPr>
+        <w:rPr>
+          <w:szCs w:val="22"/>
+        </w:rPr>
+      </w:pPr>
+    </w:p>
+    <w:p>
+      <w:pPr>
+        <w:rPr>
           <w:szCs w:val="22"/>
         </w:rPr>
       </w:pPr>
@@ -3712,20 +3586,17 @@
     <w:p>
       <w:pPr>
         <w:rPr>
-          <w:sz w:val="22"/>
-          <w:szCs w:val="22"/>
-        </w:rPr>
-      </w:pPr>
-      <w:r>
-        <w:rPr>
-          <w:sz w:val="22"/>
+          <w:szCs w:val="22"/>
+        </w:rPr>
+      </w:pPr>
+      <w:r>
+        <w:rPr>
           <w:szCs w:val="22"/>
         </w:rPr>
         <w:t>&lt;</w:t>
       </w:r>
       <w:r>
         <w:rPr>
-          <w:sz w:val="22"/>
           <w:szCs w:val="22"/>
         </w:rPr>
         <w:t xml:space="preserve">Results, evaluation (including user evaluation) </w:t>
@@ -3734,35 +3605,30 @@
         <w:rPr>
           <w:i/>
           <w:iCs/>
-          <w:sz w:val="22"/>
           <w:szCs w:val="22"/>
         </w:rPr>
         <w:t>etc</w:t>
       </w:r>
       <w:r>
         <w:rPr>
-          <w:sz w:val="22"/>
           <w:szCs w:val="22"/>
         </w:rPr>
         <w:t xml:space="preserve">. should be described in one or more chapters. See the `Results and </w:t>
       </w:r>
       <w:r>
         <w:rPr>
-          <w:sz w:val="22"/>
           <w:szCs w:val="22"/>
         </w:rPr>
         <w:t>Evaluation</w:t>
       </w:r>
       <w:r>
         <w:rPr>
-          <w:sz w:val="22"/>
           <w:szCs w:val="22"/>
         </w:rPr>
         <w:t>' criterion in the mark scheme for the sorts of material that may be included here</w:t>
       </w:r>
       <w:r>
         <w:rPr>
-          <w:sz w:val="22"/>
           <w:szCs w:val="22"/>
         </w:rPr>
         <w:t>.</w:t>
@@ -3771,20 +3637,17 @@
     <w:p>
       <w:pPr>
         <w:rPr>
-          <w:sz w:val="22"/>
-          <w:szCs w:val="22"/>
-        </w:rPr>
-      </w:pPr>
-      <w:r>
-        <w:rPr>
-          <w:sz w:val="22"/>
+          <w:szCs w:val="22"/>
+        </w:rPr>
+      </w:pPr>
+      <w:r>
+        <w:rPr>
           <w:szCs w:val="22"/>
         </w:rPr>
         <w:t xml:space="preserve">Outcomes of your project. Discussion of the aim and context of your project and what you achieved in that regard. </w:t>
       </w:r>
       <w:r>
         <w:rPr>
-          <w:sz w:val="22"/>
           <w:szCs w:val="22"/>
         </w:rPr>
         <w:t>Everything that comes under the `Results and Discussion' criterion in the mark scheme that has not been addressed in an earlier chapter should be included in this final chapter. The following section headings are suggestions only.&gt;</w:t>
@@ -3793,7 +3656,6 @@
     <w:p>
       <w:pPr>
         <w:rPr>
-          <w:sz w:val="22"/>
           <w:szCs w:val="22"/>
         </w:rPr>
       </w:pPr>
@@ -3818,7 +3680,6 @@
     <w:p>
       <w:pPr>
         <w:rPr>
-          <w:sz w:val="22"/>
           <w:szCs w:val="22"/>
         </w:rPr>
       </w:pPr>
@@ -3827,28 +3688,24 @@
       </w:r>
       <w:r>
         <w:rPr>
-          <w:sz w:val="22"/>
           <w:szCs w:val="22"/>
         </w:rPr>
         <w:t>&lt;Text in 11</w:t>
       </w:r>
       <w:r>
         <w:rPr>
-          <w:sz w:val="22"/>
           <w:szCs w:val="22"/>
         </w:rPr>
         <w:t>-</w:t>
       </w:r>
       <w:r>
         <w:rPr>
-          <w:sz w:val="22"/>
           <w:szCs w:val="22"/>
         </w:rPr>
         <w:t>point</w:t>
       </w:r>
       <w:r>
         <w:rPr>
-          <w:sz w:val="22"/>
           <w:szCs w:val="22"/>
         </w:rPr>
         <w:t xml:space="preserve"> size and </w:t>
@@ -3856,7 +3713,6 @@
       <w:proofErr w:type="gramStart"/>
       <w:r>
         <w:rPr>
-          <w:sz w:val="22"/>
           <w:szCs w:val="22"/>
         </w:rPr>
         <w:t>1.5 line</w:t>
@@ -3864,14 +3720,12 @@
       <w:proofErr w:type="gramEnd"/>
       <w:r>
         <w:rPr>
-          <w:sz w:val="22"/>
           <w:szCs w:val="22"/>
         </w:rPr>
         <w:t xml:space="preserve"> spacing.</w:t>
       </w:r>
       <w:r>
         <w:rPr>
-          <w:sz w:val="22"/>
           <w:szCs w:val="22"/>
         </w:rPr>
         <w:t>&gt;</w:t>
@@ -3891,34 +3745,29 @@
     <w:p>
       <w:pPr>
         <w:rPr>
-          <w:sz w:val="22"/>
-          <w:szCs w:val="22"/>
-        </w:rPr>
-      </w:pPr>
-      <w:r>
-        <w:rPr>
-          <w:sz w:val="22"/>
+          <w:szCs w:val="22"/>
+        </w:rPr>
+      </w:pPr>
+      <w:r>
+        <w:rPr>
           <w:szCs w:val="22"/>
         </w:rPr>
         <w:t>&lt;Text in 11</w:t>
       </w:r>
       <w:r>
         <w:rPr>
-          <w:sz w:val="22"/>
           <w:szCs w:val="22"/>
         </w:rPr>
         <w:t>-</w:t>
       </w:r>
       <w:r>
         <w:rPr>
-          <w:sz w:val="22"/>
           <w:szCs w:val="22"/>
         </w:rPr>
         <w:t>point</w:t>
       </w:r>
       <w:r>
         <w:rPr>
-          <w:sz w:val="22"/>
           <w:szCs w:val="22"/>
         </w:rPr>
         <w:t xml:space="preserve"> size and </w:t>
@@ -3926,7 +3775,6 @@
       <w:proofErr w:type="gramStart"/>
       <w:r>
         <w:rPr>
-          <w:sz w:val="22"/>
           <w:szCs w:val="22"/>
         </w:rPr>
         <w:t>1.5 line</w:t>
@@ -3934,14 +3782,12 @@
       <w:proofErr w:type="gramEnd"/>
       <w:r>
         <w:rPr>
-          <w:sz w:val="22"/>
           <w:szCs w:val="22"/>
         </w:rPr>
         <w:t xml:space="preserve"> spacing.</w:t>
       </w:r>
       <w:r>
         <w:rPr>
-          <w:sz w:val="22"/>
           <w:szCs w:val="22"/>
         </w:rPr>
         <w:t>&gt;</w:t>
@@ -3961,34 +3807,29 @@
     <w:p>
       <w:pPr>
         <w:rPr>
-          <w:sz w:val="22"/>
-          <w:szCs w:val="22"/>
-        </w:rPr>
-      </w:pPr>
-      <w:r>
-        <w:rPr>
-          <w:sz w:val="22"/>
+          <w:szCs w:val="22"/>
+        </w:rPr>
+      </w:pPr>
+      <w:r>
+        <w:rPr>
           <w:szCs w:val="22"/>
         </w:rPr>
         <w:t>&lt;Text in 11</w:t>
       </w:r>
       <w:r>
         <w:rPr>
-          <w:sz w:val="22"/>
           <w:szCs w:val="22"/>
         </w:rPr>
         <w:t>-</w:t>
       </w:r>
       <w:r>
         <w:rPr>
-          <w:sz w:val="22"/>
           <w:szCs w:val="22"/>
         </w:rPr>
         <w:t>point</w:t>
       </w:r>
       <w:r>
         <w:rPr>
-          <w:sz w:val="22"/>
           <w:szCs w:val="22"/>
         </w:rPr>
         <w:t xml:space="preserve"> size and </w:t>
@@ -3996,7 +3837,6 @@
       <w:proofErr w:type="gramStart"/>
       <w:r>
         <w:rPr>
-          <w:sz w:val="22"/>
           <w:szCs w:val="22"/>
         </w:rPr>
         <w:t>1.5 line</w:t>
@@ -4004,14 +3844,12 @@
       <w:proofErr w:type="gramEnd"/>
       <w:r>
         <w:rPr>
-          <w:sz w:val="22"/>
           <w:szCs w:val="22"/>
         </w:rPr>
         <w:t xml:space="preserve"> spacing.</w:t>
       </w:r>
       <w:r>
         <w:rPr>
-          <w:sz w:val="22"/>
           <w:szCs w:val="22"/>
         </w:rPr>
         <w:t>&gt;</w:t>
@@ -4033,14 +3871,12 @@
       <w:pPr>
         <w:rPr>
           <w:i/>
-          <w:sz w:val="22"/>
           <w:szCs w:val="22"/>
         </w:rPr>
       </w:pPr>
       <w:r>
         <w:rPr>
           <w:i/>
-          <w:sz w:val="22"/>
           <w:szCs w:val="22"/>
         </w:rPr>
         <w:t>&lt;</w:t>
@@ -4048,7 +3884,6 @@
       <w:r>
         <w:rPr>
           <w:i/>
-          <w:sz w:val="22"/>
           <w:szCs w:val="22"/>
         </w:rPr>
         <w:t xml:space="preserve">It is expected that the list would reflect the breadth and depth of scholarly research undertaken by the student </w:t>
@@ -4057,7 +3892,6 @@
       <w:r>
         <w:rPr>
           <w:i/>
-          <w:sz w:val="22"/>
           <w:szCs w:val="22"/>
         </w:rPr>
         <w:t>during the course of</w:t>
@@ -4066,7 +3900,6 @@
       <w:r>
         <w:rPr>
           <w:i/>
-          <w:sz w:val="22"/>
           <w:szCs w:val="22"/>
         </w:rPr>
         <w:t xml:space="preserve"> the project</w:t>
@@ -4076,14 +3909,12 @@
       <w:pPr>
         <w:rPr>
           <w:i/>
-          <w:sz w:val="22"/>
           <w:szCs w:val="22"/>
         </w:rPr>
       </w:pPr>
       <w:r>
         <w:rPr>
           <w:i/>
-          <w:sz w:val="22"/>
           <w:szCs w:val="22"/>
         </w:rPr>
         <w:t>The format of referencing is nor prescribed, but you must use one style appropriately and consistently</w:t>
@@ -4091,7 +3922,6 @@
       <w:r>
         <w:rPr>
           <w:i/>
-          <w:sz w:val="22"/>
           <w:szCs w:val="22"/>
         </w:rPr>
         <w:t>&gt;</w:t>
@@ -4120,13 +3950,11 @@
     <w:p>
       <w:pPr>
         <w:rPr>
-          <w:sz w:val="22"/>
-          <w:szCs w:val="22"/>
-        </w:rPr>
-      </w:pPr>
-      <w:r>
-        <w:rPr>
-          <w:sz w:val="22"/>
+          <w:szCs w:val="22"/>
+        </w:rPr>
+      </w:pPr>
+      <w:r>
+        <w:rPr>
           <w:szCs w:val="22"/>
         </w:rPr>
         <w:t>&lt;This appendix must contain everything covered under the ’self-appraisal’ criterion in the mark scheme. Although there is no length limit for this section, 2-4 pages will normally be su</w:t>
@@ -4134,42 +3962,36 @@
       <w:r>
         <w:rPr>
           <w:rFonts w:ascii="Cambria Math" w:hAnsi="Cambria Math" w:cs="Cambria Math"/>
-          <w:sz w:val="22"/>
           <w:szCs w:val="22"/>
         </w:rPr>
         <w:t>ﬃ</w:t>
       </w:r>
       <w:r>
         <w:rPr>
-          <w:sz w:val="22"/>
           <w:szCs w:val="22"/>
         </w:rPr>
         <w:t xml:space="preserve">cient. </w:t>
       </w:r>
       <w:r>
         <w:rPr>
-          <w:sz w:val="22"/>
           <w:szCs w:val="22"/>
         </w:rPr>
         <w:t>T</w:t>
       </w:r>
       <w:r>
         <w:rPr>
-          <w:sz w:val="22"/>
           <w:szCs w:val="22"/>
         </w:rPr>
         <w:t xml:space="preserve">he format of this section is not prescribed, </w:t>
       </w:r>
       <w:r>
         <w:rPr>
-          <w:sz w:val="22"/>
           <w:szCs w:val="22"/>
         </w:rPr>
         <w:t xml:space="preserve">but </w:t>
       </w:r>
       <w:r>
         <w:rPr>
-          <w:sz w:val="22"/>
           <w:szCs w:val="22"/>
         </w:rPr>
         <w:t>you may like to consider the following sections and subsections.&gt;</w:t>
@@ -4202,13 +4024,11 @@
     <w:p>
       <w:pPr>
         <w:rPr>
-          <w:sz w:val="22"/>
-          <w:szCs w:val="22"/>
-        </w:rPr>
-      </w:pPr>
-      <w:r>
-        <w:rPr>
-          <w:sz w:val="22"/>
+          <w:szCs w:val="22"/>
+        </w:rPr>
+      </w:pPr>
+      <w:r>
+        <w:rPr>
           <w:szCs w:val="22"/>
         </w:rPr>
         <w:t xml:space="preserve">&lt;Refer to each of these issues in turn. If one or more is not relevant to your project, you should still explain </w:t>
@@ -4217,14 +4037,12 @@
         <w:rPr>
           <w:i/>
           <w:iCs/>
-          <w:sz w:val="22"/>
           <w:szCs w:val="22"/>
         </w:rPr>
         <w:t>why</w:t>
       </w:r>
       <w:r>
         <w:rPr>
-          <w:sz w:val="22"/>
           <w:szCs w:val="22"/>
         </w:rPr>
         <w:t xml:space="preserve"> you think it was not relevant.&gt;</w:t>
@@ -4241,34 +4059,29 @@
     <w:p>
       <w:pPr>
         <w:rPr>
-          <w:sz w:val="22"/>
-          <w:szCs w:val="22"/>
-        </w:rPr>
-      </w:pPr>
-      <w:r>
-        <w:rPr>
-          <w:sz w:val="22"/>
+          <w:szCs w:val="22"/>
+        </w:rPr>
+      </w:pPr>
+      <w:r>
+        <w:rPr>
           <w:szCs w:val="22"/>
         </w:rPr>
         <w:t>&lt;</w:t>
       </w:r>
       <w:r>
         <w:rPr>
-          <w:sz w:val="22"/>
           <w:szCs w:val="22"/>
         </w:rPr>
         <w:t>Discussion</w:t>
       </w:r>
       <w:r>
         <w:rPr>
-          <w:sz w:val="22"/>
           <w:szCs w:val="22"/>
         </w:rPr>
         <w:t xml:space="preserve"> of l</w:t>
       </w:r>
       <w:r>
         <w:rPr>
-          <w:sz w:val="22"/>
           <w:szCs w:val="22"/>
         </w:rPr>
         <w:t>egal issues&gt;</w:t>
@@ -4377,27 +4190,23 @@
     <w:p>
       <w:pPr>
         <w:rPr>
-          <w:sz w:val="22"/>
-          <w:szCs w:val="22"/>
-        </w:rPr>
-      </w:pPr>
-      <w:r>
-        <w:rPr>
-          <w:sz w:val="22"/>
+          <w:szCs w:val="22"/>
+        </w:rPr>
+      </w:pPr>
+      <w:r>
+        <w:rPr>
           <w:szCs w:val="22"/>
         </w:rPr>
         <w:t>&lt;</w:t>
       </w:r>
       <w:r>
         <w:rPr>
-          <w:sz w:val="22"/>
           <w:szCs w:val="22"/>
         </w:rPr>
         <w:t>Discussion of p</w:t>
       </w:r>
       <w:r>
         <w:rPr>
-          <w:sz w:val="22"/>
           <w:szCs w:val="22"/>
         </w:rPr>
         <w:t>rofessional Issues&gt;</w:t>
@@ -4425,13 +4234,11 @@
     <w:p>
       <w:pPr>
         <w:rPr>
-          <w:sz w:val="22"/>
-          <w:szCs w:val="22"/>
-        </w:rPr>
-      </w:pPr>
-      <w:r>
-        <w:rPr>
-          <w:sz w:val="22"/>
+          <w:szCs w:val="22"/>
+        </w:rPr>
+      </w:pPr>
+      <w:r>
+        <w:rPr>
           <w:szCs w:val="22"/>
         </w:rPr>
         <w:t>&lt;This appendix should provide a brief record of materials used in the solution that are not the student's own work. Such materials might be pieces of codes made available from a research group/company or from the internet, datasets prepared by external users or any preliminary materials/drafts/notes provided by a supervisor. It should be clear what was used as ready-made components and what was developed as part of the project. This appendix should be included even if no external materials were used, in which case a statement to that effect is all that is required.&gt;</w:t>
@@ -4440,13 +4247,12 @@
     <w:p>
       <w:pPr>
         <w:rPr>
-          <w:sz w:val="22"/>
           <w:szCs w:val="22"/>
         </w:rPr>
       </w:pPr>
     </w:p>
     <w:sectPr>
-      <w:headerReference w:type="default" r:id="rId12"/>
+      <w:headerReference w:type="default" r:id="rId13"/>
       <w:footnotePr>
         <w:numRestart w:val="eachSect"/>
       </w:footnotePr>
@@ -6164,6 +5970,8 @@
     <w:rPrDefault>
       <w:rPr>
         <w:rFonts w:ascii="Arial" w:eastAsia="Times New Roman" w:hAnsi="Arial" w:cs="Arial"/>
+        <w:sz w:val="22"/>
+        <w:szCs w:val="18"/>
         <w:lang w:val="en-GB" w:eastAsia="en-GB" w:bidi="ar-SA"/>
       </w:rPr>
     </w:rPrDefault>
@@ -6538,9 +6346,6 @@
     <w:name w:val="Normal"/>
     <w:qFormat/>
     <w:rsid w:val="00223C7F"/>
-    <w:rPr>
-      <w:sz w:val="24"/>
-    </w:rPr>
   </w:style>
   <w:style w:type="paragraph" w:styleId="Heading1">
     <w:name w:val="heading 1"/>
@@ -6608,9 +6413,6 @@
       <w:spacing w:before="240" w:after="60"/>
       <w:outlineLvl w:val="4"/>
     </w:pPr>
-    <w:rPr>
-      <w:sz w:val="22"/>
-    </w:rPr>
   </w:style>
   <w:style w:type="paragraph" w:styleId="Heading6">
     <w:name w:val="heading 6"/>
@@ -6623,7 +6425,6 @@
     </w:pPr>
     <w:rPr>
       <w:i/>
-      <w:sz w:val="22"/>
     </w:rPr>
   </w:style>
   <w:style w:type="paragraph" w:styleId="Heading7">

</xml_diff>

<commit_message>
EDIT: added table of contents to report
</commit_message>
<xml_diff>
--- a/report.docx
+++ b/report.docx
@@ -448,9 +448,9 @@
         <w:tblLook w:val="04A0" w:firstRow="1" w:lastRow="0" w:firstColumn="1" w:lastColumn="0" w:noHBand="0" w:noVBand="1"/>
       </w:tblPr>
       <w:tblGrid>
-        <w:gridCol w:w="3077"/>
-        <w:gridCol w:w="2750"/>
-        <w:gridCol w:w="3403"/>
+        <w:gridCol w:w="2743"/>
+        <w:gridCol w:w="3424"/>
+        <w:gridCol w:w="3063"/>
       </w:tblGrid>
       <w:tr>
         <w:tc>
@@ -621,7 +621,7 @@
               <w:rPr>
                 <w:i/>
               </w:rPr>
-              <w:t>URL</w:t>
+              <w:t>https://github.com/mattyh867/chess-playing-style-classifier</w:t>
             </w:r>
           </w:p>
         </w:tc>
@@ -800,13 +800,73 @@
       <w:bookmarkEnd w:id="0"/>
     </w:p>
     <w:p>
-      <w:pPr>
-        <w:jc w:val="both"/>
-        <w:rPr>
-          <w:i/>
-          <w:szCs w:val="22"/>
-        </w:rPr>
-      </w:pPr>
+      <w:r>
+        <w:t>High-level chess players have had access to coaches and personalised analysis for decades, while the average player can only rely on general guidance</w:t>
+      </w:r>
+      <w:r>
+        <w:t>,</w:t>
+      </w:r>
+      <w:r>
+        <w:t xml:space="preserve"> such as books and videos, that cannot directly advise based on the individual. </w:t>
+      </w:r>
+      <w:r>
+        <w:t xml:space="preserve">The goal of this project is to provide a tool that can be used by intermediate players to give them a better idea of their playing style, allowing them to seek resources suited to their style. </w:t>
+      </w:r>
+      <w:r>
+        <w:t>This project develops a machine learning pipeline that assigns one of four playing styles (aggressive, positional, defensive, balanced) to a chess game based on features extracted from game data.</w:t>
+      </w:r>
+    </w:p>
+    <w:p>
+      <w:r>
+        <w:t>The dataset was built from 2015 Lichess games played</w:t>
+      </w:r>
+      <w:r>
+        <w:t xml:space="preserve"> at 1500 Elo rating and above</w:t>
+      </w:r>
+      <w:r>
+        <w:t xml:space="preserve">, with </w:t>
+      </w:r>
+      <w:r>
+        <w:t>16</w:t>
+      </w:r>
+      <w:r>
+        <w:t xml:space="preserve"> features extracted per game using the Stockfish engine at depth 1</w:t>
+      </w:r>
+      <w:r>
+        <w:t>2</w:t>
+      </w:r>
+      <w:r>
+        <w:t xml:space="preserve">. Labels were assigned automatically via a rule-based heuristic grounded in chess theory. Three classifiers were trained and evaluated: a Random Forest </w:t>
+      </w:r>
+      <w:r>
+        <w:t xml:space="preserve">Classifier </w:t>
+      </w:r>
+      <w:r>
+        <w:t xml:space="preserve">(91.2%), a </w:t>
+      </w:r>
+      <w:r>
+        <w:t>Feed-Forward Neural Network</w:t>
+      </w:r>
+      <w:r>
+        <w:t xml:space="preserve"> (89.8%), and </w:t>
+      </w:r>
+      <w:r>
+        <w:t xml:space="preserve">Extreme Gradient Boosting Classifier </w:t>
+      </w:r>
+      <w:r>
+        <w:t>(97.0%). The performance ordering is consistent with Grinsztajn et al. (2022), who found tree-based models tend to outperform neural networks on structured tabular data. Feature importance analysis across all three models consistently highlighted captures per move, prophylactic moves, and positional sacrifices as the strongest discriminators.</w:t>
+      </w:r>
+    </w:p>
+    <w:p>
+      <w:r>
+        <w:t xml:space="preserve">Cross-skill evaluation was conducted on 2016 Lichess data across </w:t>
+      </w:r>
+      <w:r>
+        <w:t>two</w:t>
+      </w:r>
+      <w:r>
+        <w:t xml:space="preserve"> Elo brackets, and a web interface was developed to make the system accessible to non-expert users, satisfying all five project objectives. Limitations include the absence of an external ground truth for labelling validation, and known misclassification of historical games where Stockfish penalises principled sacrificial play as errors.</w:t>
+      </w:r>
     </w:p>
     <w:p>
       <w:pPr>
@@ -1147,7 +1207,19 @@
         <w:rPr>
           <w:noProof/>
         </w:rPr>
-        <w:t>Chapter 1 Level 1 Heading with ‘heading 1’ Style</w:t>
+        <w:t>Chapter 1</w:t>
+      </w:r>
+      <w:r>
+        <w:rPr>
+          <w:noProof/>
+        </w:rPr>
+        <w:t xml:space="preserve">: </w:t>
+      </w:r>
+      <w:r>
+        <w:rPr>
+          <w:noProof/>
+        </w:rPr>
+        <w:t>Introduction.</w:t>
       </w:r>
       <w:r>
         <w:rPr>
@@ -1204,7 +1276,13 @@
         <w:rPr>
           <w:noProof/>
         </w:rPr>
-        <w:t>1.1  Level 2 Heading with ‘heading 2’ Style</w:t>
+        <w:t xml:space="preserve">1.1  </w:t>
+      </w:r>
+      <w:r>
+        <w:rPr>
+          <w:noProof/>
+        </w:rPr>
+        <w:t>Outline</w:t>
       </w:r>
       <w:r>
         <w:rPr>
@@ -1250,18 +1328,25 @@
     </w:p>
     <w:p>
       <w:pPr>
-        <w:pStyle w:val="TOC3"/>
+        <w:pStyle w:val="TOC1"/>
         <w:rPr>
           <w:rFonts w:asciiTheme="minorHAnsi" w:eastAsiaTheme="minorEastAsia" w:hAnsiTheme="minorHAnsi" w:cstheme="minorBidi"/>
-          <w:noProof/>
-          <w:szCs w:val="22"/>
-        </w:rPr>
-      </w:pPr>
-      <w:r>
-        <w:rPr>
-          <w:noProof/>
-        </w:rPr>
-        <w:t>1.1.1  Level 3 Heading with ‘heading 3’ Style</w:t>
+          <w:b w:val="0"/>
+          <w:noProof/>
+          <w:szCs w:val="22"/>
+        </w:rPr>
+      </w:pPr>
+      <w:r>
+        <w:rPr>
+          <w:noProof/>
+        </w:rPr>
+        <w:t>Chapter 2</w:t>
+      </w:r>
+      <w:r>
+        <w:rPr>
+          <w:noProof/>
+        </w:rPr>
+        <w:t>: Background Research</w:t>
       </w:r>
       <w:r>
         <w:rPr>
@@ -1279,7 +1364,7 @@
         <w:rPr>
           <w:noProof/>
         </w:rPr>
-        <w:instrText xml:space="preserve"> PAGEREF _Toc407145092 \h </w:instrText>
+        <w:instrText xml:space="preserve"> PAGEREF _Toc407145094 \h </w:instrText>
       </w:r>
       <w:r>
         <w:rPr>
@@ -1296,7 +1381,7 @@
         <w:rPr>
           <w:noProof/>
         </w:rPr>
-        <w:t>1</w:t>
+        <w:t>2</w:t>
       </w:r>
       <w:r>
         <w:rPr>
@@ -1307,7 +1392,7 @@
     </w:p>
     <w:p>
       <w:pPr>
-        <w:pStyle w:val="TOC4"/>
+        <w:pStyle w:val="TOC2"/>
         <w:rPr>
           <w:rFonts w:asciiTheme="minorHAnsi" w:eastAsiaTheme="minorEastAsia" w:hAnsiTheme="minorHAnsi" w:cstheme="minorBidi"/>
           <w:noProof/>
@@ -1318,7 +1403,13 @@
         <w:rPr>
           <w:noProof/>
         </w:rPr>
-        <w:t>1.1.1.1  Level 4 Heading with ‘heading 4’ Style</w:t>
+        <w:t xml:space="preserve">2.1  </w:t>
+      </w:r>
+      <w:r>
+        <w:rPr>
+          <w:noProof/>
+        </w:rPr>
+        <w:t>Playing Style Classification</w:t>
       </w:r>
       <w:r>
         <w:rPr>
@@ -1336,7 +1427,7 @@
         <w:rPr>
           <w:noProof/>
         </w:rPr>
-        <w:instrText xml:space="preserve"> PAGEREF _Toc407145093 \h </w:instrText>
+        <w:instrText xml:space="preserve"> PAGEREF _Toc407145095 \h </w:instrText>
       </w:r>
       <w:r>
         <w:rPr>
@@ -1350,13 +1441,2657 @@
         <w:fldChar w:fldCharType="separate"/>
       </w:r>
       <w:r>
+        <w:rPr>
+          <w:noProof/>
+        </w:rPr>
+        <w:t>2</w:t>
+      </w:r>
+      <w:r>
+        <w:rPr>
+          <w:noProof/>
+        </w:rPr>
+        <w:fldChar w:fldCharType="end"/>
+      </w:r>
+    </w:p>
+    <w:p>
+      <w:pPr>
+        <w:pStyle w:val="TOC2"/>
+        <w:rPr>
+          <w:noProof/>
+        </w:rPr>
+      </w:pPr>
+      <w:r>
+        <w:rPr>
+          <w:noProof/>
+        </w:rPr>
+        <w:t xml:space="preserve">2.2 </w:t>
+      </w:r>
+      <w:r>
+        <w:rPr>
+          <w:noProof/>
+        </w:rPr>
+        <w:t xml:space="preserve"> </w:t>
+      </w:r>
+      <w:r>
+        <w:rPr>
+          <w:noProof/>
+        </w:rPr>
+        <w:t>Previous Clustering and Classification Approaches</w:t>
+      </w:r>
+      <w:r>
+        <w:rPr>
+          <w:noProof/>
+        </w:rPr>
+        <w:tab/>
+      </w:r>
+      <w:r>
+        <w:rPr>
+          <w:noProof/>
+        </w:rPr>
+        <w:t>3</w:t>
+      </w:r>
+    </w:p>
+    <w:p>
+      <w:pPr>
+        <w:pStyle w:val="TOC2"/>
+        <w:rPr>
+          <w:noProof/>
+        </w:rPr>
+      </w:pPr>
+      <w:r>
+        <w:rPr>
+          <w:noProof/>
+        </w:rPr>
+        <w:t>2.3  Feature Engineering</w:t>
+      </w:r>
+      <w:r>
+        <w:rPr>
+          <w:noProof/>
+        </w:rPr>
+        <w:tab/>
+        <w:t>3</w:t>
+      </w:r>
+    </w:p>
+    <w:p>
+      <w:pPr>
+        <w:pStyle w:val="TOC2"/>
+        <w:rPr>
+          <w:noProof/>
+        </w:rPr>
+      </w:pPr>
+      <w:r>
+        <w:rPr>
+          <w:noProof/>
+        </w:rPr>
+        <w:t>2.</w:t>
+      </w:r>
+      <w:r>
+        <w:rPr>
+          <w:noProof/>
+        </w:rPr>
+        <w:t>4</w:t>
+      </w:r>
+      <w:r>
+        <w:rPr>
+          <w:noProof/>
+        </w:rPr>
+        <w:t xml:space="preserve">  </w:t>
+      </w:r>
+      <w:r>
+        <w:rPr>
+          <w:noProof/>
+        </w:rPr>
+        <w:t>Feature Design for Style Classification</w:t>
+      </w:r>
+      <w:r>
+        <w:rPr>
+          <w:noProof/>
+        </w:rPr>
+        <w:tab/>
+      </w:r>
+      <w:r>
+        <w:rPr>
+          <w:noProof/>
+        </w:rPr>
+        <w:t>4</w:t>
+      </w:r>
+    </w:p>
+    <w:p>
+      <w:pPr>
+        <w:pStyle w:val="TOC2"/>
+        <w:rPr>
+          <w:noProof/>
+        </w:rPr>
+      </w:pPr>
+      <w:r>
+        <w:rPr>
+          <w:noProof/>
+        </w:rPr>
+        <w:t>2.</w:t>
+      </w:r>
+      <w:r>
+        <w:rPr>
+          <w:noProof/>
+        </w:rPr>
+        <w:t>5</w:t>
+      </w:r>
+      <w:r>
+        <w:rPr>
+          <w:noProof/>
+        </w:rPr>
+        <w:t xml:space="preserve">  </w:t>
+      </w:r>
+      <w:r>
+        <w:rPr>
+          <w:noProof/>
+        </w:rPr>
+        <w:t>Learned Representation</w:t>
+      </w:r>
+      <w:r>
+        <w:rPr>
+          <w:noProof/>
+        </w:rPr>
+        <w:tab/>
+      </w:r>
+      <w:r>
+        <w:rPr>
+          <w:noProof/>
+        </w:rPr>
+        <w:t>4</w:t>
+      </w:r>
+    </w:p>
+    <w:p>
+      <w:pPr>
+        <w:pStyle w:val="TOC2"/>
+        <w:rPr>
+          <w:noProof/>
+        </w:rPr>
+      </w:pPr>
+      <w:r>
+        <w:rPr>
+          <w:noProof/>
+        </w:rPr>
+        <w:t>2.</w:t>
+      </w:r>
+      <w:r>
+        <w:rPr>
+          <w:noProof/>
+        </w:rPr>
+        <w:t>6</w:t>
+      </w:r>
+      <w:r>
+        <w:rPr>
+          <w:noProof/>
+        </w:rPr>
+        <w:t xml:space="preserve">  </w:t>
+      </w:r>
+      <w:r>
+        <w:rPr>
+          <w:noProof/>
+        </w:rPr>
+        <w:t>Practical Considerations</w:t>
+      </w:r>
+      <w:r>
+        <w:rPr>
+          <w:noProof/>
+        </w:rPr>
+        <w:tab/>
+      </w:r>
+      <w:r>
+        <w:rPr>
+          <w:noProof/>
+        </w:rPr>
+        <w:t>5</w:t>
+      </w:r>
+    </w:p>
+    <w:p>
+      <w:pPr>
+        <w:pStyle w:val="TOC1"/>
+        <w:rPr>
+          <w:rFonts w:asciiTheme="minorHAnsi" w:eastAsiaTheme="minorEastAsia" w:hAnsiTheme="minorHAnsi" w:cstheme="minorBidi"/>
+          <w:b w:val="0"/>
+          <w:noProof/>
+          <w:szCs w:val="22"/>
+        </w:rPr>
+      </w:pPr>
+      <w:r>
+        <w:rPr>
+          <w:noProof/>
+        </w:rPr>
+        <w:t xml:space="preserve">Chapter </w:t>
+      </w:r>
+      <w:r>
+        <w:rPr>
+          <w:noProof/>
+        </w:rPr>
+        <w:t>3: Methodology</w:t>
+      </w:r>
+      <w:r>
+        <w:rPr>
+          <w:noProof/>
+        </w:rPr>
+        <w:t xml:space="preserve"> </w:t>
+      </w:r>
+      <w:r>
+        <w:rPr>
+          <w:noProof/>
+        </w:rPr>
+        <w:tab/>
+      </w:r>
+      <w:r>
+        <w:rPr>
+          <w:noProof/>
+        </w:rPr>
+        <w:fldChar w:fldCharType="begin"/>
+      </w:r>
+      <w:r>
+        <w:rPr>
+          <w:noProof/>
+        </w:rPr>
+        <w:instrText xml:space="preserve"> PAGEREF _Toc407145094 \h </w:instrText>
+      </w:r>
+      <w:r>
+        <w:rPr>
+          <w:noProof/>
+        </w:rPr>
+      </w:r>
+      <w:r>
+        <w:rPr>
+          <w:noProof/>
+        </w:rPr>
+        <w:fldChar w:fldCharType="separate"/>
+      </w:r>
+      <w:r>
+        <w:rPr>
+          <w:noProof/>
+        </w:rPr>
+        <w:t>2</w:t>
+      </w:r>
+      <w:r>
+        <w:rPr>
+          <w:noProof/>
+        </w:rPr>
+        <w:fldChar w:fldCharType="end"/>
+      </w:r>
+    </w:p>
+    <w:p>
+      <w:pPr>
+        <w:pStyle w:val="TOC2"/>
+        <w:rPr>
+          <w:rFonts w:asciiTheme="minorHAnsi" w:eastAsiaTheme="minorEastAsia" w:hAnsiTheme="minorHAnsi" w:cstheme="minorBidi"/>
+          <w:noProof/>
+          <w:szCs w:val="22"/>
+        </w:rPr>
+      </w:pPr>
+      <w:r>
+        <w:rPr>
+          <w:noProof/>
+        </w:rPr>
+        <w:t>3</w:t>
+      </w:r>
+      <w:r>
+        <w:rPr>
+          <w:noProof/>
+        </w:rPr>
+        <w:t xml:space="preserve">.1  </w:t>
+      </w:r>
+      <w:r>
+        <w:rPr>
+          <w:noProof/>
+        </w:rPr>
+        <w:t>Overview of Methodology</w:t>
+      </w:r>
+      <w:r>
+        <w:rPr>
+          <w:noProof/>
+        </w:rPr>
+        <w:tab/>
+      </w:r>
+      <w:r>
+        <w:rPr>
+          <w:noProof/>
+        </w:rPr>
+        <w:fldChar w:fldCharType="begin"/>
+      </w:r>
+      <w:r>
+        <w:rPr>
+          <w:noProof/>
+        </w:rPr>
+        <w:instrText xml:space="preserve"> PAGEREF _Toc407145095 \h </w:instrText>
+      </w:r>
+      <w:r>
+        <w:rPr>
+          <w:noProof/>
+        </w:rPr>
+      </w:r>
+      <w:r>
+        <w:rPr>
+          <w:noProof/>
+        </w:rPr>
+        <w:fldChar w:fldCharType="separate"/>
+      </w:r>
+      <w:r>
+        <w:rPr>
+          <w:noProof/>
+        </w:rPr>
+        <w:t>2</w:t>
+      </w:r>
+      <w:r>
+        <w:rPr>
+          <w:noProof/>
+        </w:rPr>
+        <w:fldChar w:fldCharType="end"/>
+      </w:r>
+    </w:p>
+    <w:p>
+      <w:pPr>
+        <w:pStyle w:val="TOC2"/>
+        <w:rPr>
+          <w:noProof/>
+        </w:rPr>
+      </w:pPr>
+      <w:r>
+        <w:rPr>
+          <w:noProof/>
+        </w:rPr>
+        <w:t>3</w:t>
+      </w:r>
+      <w:r>
+        <w:rPr>
+          <w:noProof/>
+        </w:rPr>
+        <w:t xml:space="preserve">.2 </w:t>
+      </w:r>
+      <w:r>
+        <w:rPr>
+          <w:noProof/>
+        </w:rPr>
+        <w:t xml:space="preserve"> </w:t>
+      </w:r>
+      <w:r>
+        <w:rPr>
+          <w:noProof/>
+        </w:rPr>
+        <w:t>Project Management</w:t>
+      </w:r>
+      <w:r>
+        <w:rPr>
+          <w:noProof/>
+        </w:rPr>
+        <w:tab/>
+        <w:t>3</w:t>
+      </w:r>
+    </w:p>
+    <w:p>
+      <w:pPr>
+        <w:pStyle w:val="TOC2"/>
+        <w:rPr>
+          <w:noProof/>
+        </w:rPr>
+      </w:pPr>
+      <w:r>
+        <w:rPr>
+          <w:noProof/>
+        </w:rPr>
+        <w:t>3</w:t>
+      </w:r>
+      <w:r>
+        <w:rPr>
+          <w:noProof/>
+        </w:rPr>
+        <w:t xml:space="preserve">.3  </w:t>
+      </w:r>
+      <w:r>
+        <w:rPr>
+          <w:noProof/>
+        </w:rPr>
+        <w:t>Data Collection and Preparation Pipeline</w:t>
+      </w:r>
+      <w:r>
+        <w:rPr>
+          <w:noProof/>
+        </w:rPr>
+        <w:tab/>
+        <w:t>3</w:t>
+      </w:r>
+    </w:p>
+    <w:p>
+      <w:pPr>
+        <w:pStyle w:val="TOC2"/>
+        <w:rPr>
+          <w:noProof/>
+        </w:rPr>
+      </w:pPr>
+      <w:r>
+        <w:rPr>
+          <w:noProof/>
+        </w:rPr>
+        <w:tab/>
+        <w:t>3.3.1  Data Source</w:t>
+      </w:r>
+      <w:r>
+        <w:rPr>
+          <w:noProof/>
+        </w:rPr>
+        <w:tab/>
+        <w:t>3</w:t>
+      </w:r>
+    </w:p>
+    <w:p>
+      <w:pPr>
+        <w:pStyle w:val="TOC2"/>
+        <w:rPr>
+          <w:noProof/>
+        </w:rPr>
+      </w:pPr>
+      <w:r>
+        <w:rPr>
+          <w:noProof/>
+        </w:rPr>
+        <w:tab/>
+        <w:t>3.3.</w:t>
+      </w:r>
+      <w:r>
+        <w:rPr>
+          <w:noProof/>
+        </w:rPr>
+        <w:t>2</w:t>
+      </w:r>
+      <w:r>
+        <w:rPr>
+          <w:noProof/>
+        </w:rPr>
+        <w:t xml:space="preserve">  </w:t>
+      </w:r>
+      <w:r>
+        <w:rPr>
+          <w:noProof/>
+        </w:rPr>
+        <w:t>Feature Extraction</w:t>
+      </w:r>
+      <w:r>
+        <w:rPr>
+          <w:noProof/>
+        </w:rPr>
+        <w:tab/>
+        <w:t>3</w:t>
+      </w:r>
+    </w:p>
+    <w:p>
+      <w:pPr>
+        <w:pStyle w:val="TOC2"/>
+        <w:rPr>
+          <w:noProof/>
+        </w:rPr>
+      </w:pPr>
+      <w:r>
+        <w:rPr>
+          <w:noProof/>
+        </w:rPr>
+        <w:t>3</w:t>
+      </w:r>
+      <w:r>
+        <w:rPr>
+          <w:noProof/>
+        </w:rPr>
+        <w:t xml:space="preserve">.4  </w:t>
+      </w:r>
+      <w:r>
+        <w:rPr>
+          <w:noProof/>
+        </w:rPr>
+        <w:t>Random Forest Classifier</w:t>
+      </w:r>
+      <w:r>
+        <w:rPr>
+          <w:noProof/>
+        </w:rPr>
+        <w:tab/>
+        <w:t>4</w:t>
+      </w:r>
+    </w:p>
+    <w:p>
+      <w:pPr>
+        <w:pStyle w:val="TOC2"/>
+        <w:rPr>
+          <w:noProof/>
+        </w:rPr>
+      </w:pPr>
+      <w:r>
+        <w:rPr>
+          <w:noProof/>
+        </w:rPr>
+        <w:t>3</w:t>
+      </w:r>
+      <w:r>
+        <w:rPr>
+          <w:noProof/>
+        </w:rPr>
+        <w:t xml:space="preserve">.5  </w:t>
+      </w:r>
+      <w:r>
+        <w:rPr>
+          <w:noProof/>
+        </w:rPr>
+        <w:t>Feed-Forward Neural Network</w:t>
+      </w:r>
+      <w:r>
+        <w:rPr>
+          <w:noProof/>
+        </w:rPr>
+        <w:tab/>
+        <w:t>4</w:t>
+      </w:r>
+    </w:p>
+    <w:p>
+      <w:pPr>
+        <w:pStyle w:val="TOC2"/>
+        <w:rPr>
+          <w:noProof/>
+        </w:rPr>
+      </w:pPr>
+      <w:r>
+        <w:rPr>
+          <w:noProof/>
+        </w:rPr>
+        <w:t>3</w:t>
+      </w:r>
+      <w:r>
+        <w:rPr>
+          <w:noProof/>
+        </w:rPr>
+        <w:t xml:space="preserve">.6  </w:t>
+      </w:r>
+      <w:r>
+        <w:rPr>
+          <w:noProof/>
+        </w:rPr>
+        <w:t>Extreme Gradient Boosting Classifier</w:t>
+      </w:r>
+      <w:r>
+        <w:rPr>
+          <w:noProof/>
+        </w:rPr>
+        <w:tab/>
+        <w:t>5</w:t>
+      </w:r>
+    </w:p>
+    <w:p>
+      <w:pPr>
+        <w:pStyle w:val="TOC1"/>
+        <w:rPr>
+          <w:rFonts w:asciiTheme="minorHAnsi" w:eastAsiaTheme="minorEastAsia" w:hAnsiTheme="minorHAnsi" w:cstheme="minorBidi"/>
+          <w:b w:val="0"/>
+          <w:noProof/>
+          <w:szCs w:val="22"/>
+        </w:rPr>
+      </w:pPr>
+      <w:r>
+        <w:rPr>
+          <w:noProof/>
+        </w:rPr>
+        <w:t xml:space="preserve">Chapter </w:t>
+      </w:r>
+      <w:r>
+        <w:rPr>
+          <w:noProof/>
+        </w:rPr>
+        <w:t>4</w:t>
+      </w:r>
+      <w:r>
+        <w:rPr>
+          <w:noProof/>
+        </w:rPr>
+        <w:t xml:space="preserve">: </w:t>
+      </w:r>
+      <w:r>
+        <w:rPr>
+          <w:noProof/>
+        </w:rPr>
+        <w:t>Implementation</w:t>
+      </w:r>
+      <w:r>
+        <w:rPr>
+          <w:noProof/>
+        </w:rPr>
+        <w:t xml:space="preserve"> and Validation</w:t>
+      </w:r>
+      <w:r>
+        <w:rPr>
+          <w:noProof/>
+        </w:rPr>
+        <w:tab/>
+      </w:r>
+      <w:r>
+        <w:rPr>
+          <w:noProof/>
+        </w:rPr>
+        <w:fldChar w:fldCharType="begin"/>
+      </w:r>
+      <w:r>
+        <w:rPr>
+          <w:noProof/>
+        </w:rPr>
+        <w:instrText xml:space="preserve"> PAGEREF _Toc407145094 \h </w:instrText>
+      </w:r>
+      <w:r>
+        <w:rPr>
+          <w:noProof/>
+        </w:rPr>
+      </w:r>
+      <w:r>
+        <w:rPr>
+          <w:noProof/>
+        </w:rPr>
+        <w:fldChar w:fldCharType="separate"/>
+      </w:r>
+      <w:r>
+        <w:rPr>
+          <w:noProof/>
+        </w:rPr>
+        <w:t>2</w:t>
+      </w:r>
+      <w:r>
+        <w:rPr>
+          <w:noProof/>
+        </w:rPr>
+        <w:fldChar w:fldCharType="end"/>
+      </w:r>
+    </w:p>
+    <w:p>
+      <w:pPr>
+        <w:pStyle w:val="TOC2"/>
+        <w:rPr>
+          <w:noProof/>
+        </w:rPr>
+      </w:pPr>
+      <w:r>
+        <w:rPr>
+          <w:noProof/>
+        </w:rPr>
+        <w:t>4</w:t>
+      </w:r>
+      <w:r>
+        <w:rPr>
+          <w:noProof/>
+        </w:rPr>
+        <w:t xml:space="preserve">.1  </w:t>
+      </w:r>
+      <w:r>
+        <w:rPr>
+          <w:noProof/>
+        </w:rPr>
+        <w:t>Dataset Construction and Labelling Pipeline</w:t>
+      </w:r>
+      <w:r>
+        <w:rPr>
+          <w:noProof/>
+        </w:rPr>
+        <w:tab/>
+      </w:r>
+      <w:r>
+        <w:rPr>
+          <w:noProof/>
+        </w:rPr>
+        <w:fldChar w:fldCharType="begin"/>
+      </w:r>
+      <w:r>
+        <w:rPr>
+          <w:noProof/>
+        </w:rPr>
+        <w:instrText xml:space="preserve"> PAGEREF _Toc407145095 \h </w:instrText>
+      </w:r>
+      <w:r>
+        <w:rPr>
+          <w:noProof/>
+        </w:rPr>
+      </w:r>
+      <w:r>
+        <w:rPr>
+          <w:noProof/>
+        </w:rPr>
+        <w:fldChar w:fldCharType="separate"/>
+      </w:r>
+      <w:r>
+        <w:rPr>
+          <w:noProof/>
+        </w:rPr>
+        <w:t>2</w:t>
+      </w:r>
+      <w:r>
+        <w:rPr>
+          <w:noProof/>
+        </w:rPr>
+        <w:fldChar w:fldCharType="end"/>
+      </w:r>
+    </w:p>
+    <w:p>
+      <w:pPr>
+        <w:pStyle w:val="TOC2"/>
+        <w:rPr>
+          <w:noProof/>
+        </w:rPr>
+      </w:pPr>
+      <w:r>
+        <w:rPr>
+          <w:rFonts w:asciiTheme="minorHAnsi" w:eastAsiaTheme="minorEastAsia" w:hAnsiTheme="minorHAnsi" w:cstheme="minorBidi"/>
+          <w:noProof/>
+          <w:szCs w:val="22"/>
+        </w:rPr>
+        <w:tab/>
+      </w:r>
+      <w:r>
+        <w:rPr>
+          <w:noProof/>
+        </w:rPr>
+        <w:t>4.1.1</w:t>
+      </w:r>
+      <w:r>
+        <w:rPr>
+          <w:noProof/>
+        </w:rPr>
+        <w:t xml:space="preserve">  </w:t>
+      </w:r>
+      <w:r>
+        <w:rPr>
+          <w:noProof/>
+        </w:rPr>
+        <w:t>Engine Configuration and Feature Extraction</w:t>
+      </w:r>
+      <w:r>
+        <w:rPr>
+          <w:noProof/>
+        </w:rPr>
+        <w:tab/>
+        <w:t>3</w:t>
+      </w:r>
+    </w:p>
+    <w:p>
+      <w:pPr>
+        <w:pStyle w:val="TOC2"/>
+        <w:rPr>
+          <w:noProof/>
+        </w:rPr>
+      </w:pPr>
+      <w:r>
+        <w:rPr>
+          <w:noProof/>
+        </w:rPr>
+        <w:tab/>
+      </w:r>
+      <w:r>
+        <w:rPr>
+          <w:noProof/>
+        </w:rPr>
+        <w:t xml:space="preserve">4.1.2 </w:t>
+      </w:r>
+      <w:r>
+        <w:rPr>
+          <w:noProof/>
+        </w:rPr>
+        <w:t xml:space="preserve"> </w:t>
+      </w:r>
+      <w:r>
+        <w:rPr>
+          <w:noProof/>
+        </w:rPr>
+        <w:t>Labelling and Threshold Calibration</w:t>
+      </w:r>
+      <w:r>
+        <w:rPr>
+          <w:noProof/>
+        </w:rPr>
+        <w:tab/>
+        <w:t>3</w:t>
+      </w:r>
+    </w:p>
+    <w:p>
+      <w:pPr>
+        <w:pStyle w:val="TOC2"/>
+        <w:rPr>
+          <w:noProof/>
+        </w:rPr>
+      </w:pPr>
+      <w:r>
+        <w:rPr>
+          <w:noProof/>
+        </w:rPr>
+        <w:tab/>
+      </w:r>
+      <w:r>
+        <w:rPr>
+          <w:noProof/>
+        </w:rPr>
+        <w:t>4.1.</w:t>
+      </w:r>
+      <w:r>
+        <w:rPr>
+          <w:noProof/>
+        </w:rPr>
+        <w:t>3</w:t>
+      </w:r>
+      <w:r>
+        <w:rPr>
+          <w:noProof/>
+        </w:rPr>
+        <w:t xml:space="preserve">  </w:t>
+      </w:r>
+      <w:r>
+        <w:rPr>
+          <w:noProof/>
+        </w:rPr>
+        <w:t>Batch Processing</w:t>
+      </w:r>
+      <w:r>
+        <w:rPr>
+          <w:noProof/>
+        </w:rPr>
+        <w:tab/>
+        <w:t>3</w:t>
+      </w:r>
+    </w:p>
+    <w:p>
+      <w:pPr>
+        <w:pStyle w:val="TOC2"/>
+        <w:rPr>
+          <w:noProof/>
+        </w:rPr>
+      </w:pPr>
+      <w:r>
+        <w:rPr>
+          <w:noProof/>
+        </w:rPr>
+        <w:t>4</w:t>
+      </w:r>
+      <w:r>
+        <w:rPr>
+          <w:noProof/>
+        </w:rPr>
+        <w:t xml:space="preserve">.2 </w:t>
+      </w:r>
+      <w:r>
+        <w:rPr>
+          <w:noProof/>
+        </w:rPr>
+        <w:t xml:space="preserve"> </w:t>
+      </w:r>
+      <w:r>
+        <w:rPr>
+          <w:noProof/>
+        </w:rPr>
+        <w:t>Random Forest Classifier</w:t>
+      </w:r>
+      <w:r>
+        <w:rPr>
+          <w:noProof/>
+        </w:rPr>
+        <w:tab/>
+        <w:t>3</w:t>
+      </w:r>
+    </w:p>
+    <w:p>
+      <w:pPr>
+        <w:pStyle w:val="TOC2"/>
+        <w:rPr>
+          <w:noProof/>
+        </w:rPr>
+      </w:pPr>
+      <w:r>
+        <w:rPr>
+          <w:rFonts w:asciiTheme="minorHAnsi" w:eastAsiaTheme="minorEastAsia" w:hAnsiTheme="minorHAnsi" w:cstheme="minorBidi"/>
+          <w:noProof/>
+          <w:szCs w:val="22"/>
+        </w:rPr>
+        <w:tab/>
+      </w:r>
+      <w:r>
+        <w:rPr>
+          <w:noProof/>
+        </w:rPr>
+        <w:t>4.</w:t>
+      </w:r>
+      <w:r>
+        <w:rPr>
+          <w:noProof/>
+        </w:rPr>
+        <w:t>2</w:t>
+      </w:r>
+      <w:r>
+        <w:rPr>
+          <w:noProof/>
+        </w:rPr>
+        <w:t>.1</w:t>
+      </w:r>
+      <w:r>
+        <w:rPr>
+          <w:noProof/>
+        </w:rPr>
+        <w:t xml:space="preserve">  </w:t>
+      </w:r>
+      <w:r>
+        <w:rPr>
+          <w:noProof/>
+        </w:rPr>
+        <w:t>Data Loading and Feature Selection</w:t>
+      </w:r>
+      <w:r>
+        <w:rPr>
+          <w:noProof/>
+        </w:rPr>
+        <w:tab/>
+        <w:t>3</w:t>
+      </w:r>
+    </w:p>
+    <w:p>
+      <w:pPr>
+        <w:pStyle w:val="TOC2"/>
+        <w:rPr>
+          <w:noProof/>
+        </w:rPr>
+      </w:pPr>
+      <w:r>
+        <w:rPr>
+          <w:rFonts w:asciiTheme="minorHAnsi" w:eastAsiaTheme="minorEastAsia" w:hAnsiTheme="minorHAnsi" w:cstheme="minorBidi"/>
+          <w:noProof/>
+          <w:szCs w:val="22"/>
+        </w:rPr>
+        <w:tab/>
+      </w:r>
+      <w:r>
+        <w:rPr>
+          <w:noProof/>
+        </w:rPr>
+        <w:t>4.</w:t>
+      </w:r>
+      <w:r>
+        <w:rPr>
+          <w:noProof/>
+        </w:rPr>
+        <w:t>2</w:t>
+      </w:r>
+      <w:r>
+        <w:rPr>
+          <w:noProof/>
+        </w:rPr>
+        <w:t>.</w:t>
+      </w:r>
+      <w:r>
+        <w:rPr>
+          <w:noProof/>
+        </w:rPr>
+        <w:t>2</w:t>
+      </w:r>
+      <w:r>
+        <w:rPr>
+          <w:noProof/>
+        </w:rPr>
+        <w:t xml:space="preserve">  </w:t>
+      </w:r>
+      <w:r>
+        <w:rPr>
+          <w:noProof/>
+        </w:rPr>
+        <w:t>Train-Test Split and Preprocessing</w:t>
+      </w:r>
+      <w:r>
+        <w:rPr>
+          <w:noProof/>
+        </w:rPr>
+        <w:tab/>
+        <w:t>3</w:t>
+      </w:r>
+    </w:p>
+    <w:p>
+      <w:pPr>
+        <w:pStyle w:val="TOC2"/>
+        <w:rPr>
+          <w:noProof/>
+        </w:rPr>
+      </w:pPr>
+      <w:r>
+        <w:rPr>
+          <w:rFonts w:asciiTheme="minorHAnsi" w:eastAsiaTheme="minorEastAsia" w:hAnsiTheme="minorHAnsi" w:cstheme="minorBidi"/>
+          <w:noProof/>
+          <w:szCs w:val="22"/>
+        </w:rPr>
+        <w:tab/>
+      </w:r>
+      <w:r>
+        <w:rPr>
+          <w:noProof/>
+        </w:rPr>
+        <w:t>4.</w:t>
+      </w:r>
+      <w:r>
+        <w:rPr>
+          <w:noProof/>
+        </w:rPr>
+        <w:t>2</w:t>
+      </w:r>
+      <w:r>
+        <w:rPr>
+          <w:noProof/>
+        </w:rPr>
+        <w:t>.</w:t>
+      </w:r>
+      <w:r>
+        <w:rPr>
+          <w:noProof/>
+        </w:rPr>
+        <w:t>3</w:t>
+      </w:r>
+      <w:r>
+        <w:rPr>
+          <w:noProof/>
+        </w:rPr>
+        <w:t xml:space="preserve">  </w:t>
+      </w:r>
+      <w:r>
+        <w:rPr>
+          <w:noProof/>
+        </w:rPr>
+        <w:t>Model Configuration and Training</w:t>
+      </w:r>
+      <w:r>
+        <w:rPr>
+          <w:noProof/>
+        </w:rPr>
+        <w:tab/>
+        <w:t>3</w:t>
+      </w:r>
+    </w:p>
+    <w:p>
+      <w:pPr>
+        <w:pStyle w:val="TOC2"/>
+        <w:rPr>
+          <w:noProof/>
+        </w:rPr>
+      </w:pPr>
+      <w:r>
+        <w:rPr>
+          <w:rFonts w:asciiTheme="minorHAnsi" w:eastAsiaTheme="minorEastAsia" w:hAnsiTheme="minorHAnsi" w:cstheme="minorBidi"/>
+          <w:noProof/>
+          <w:szCs w:val="22"/>
+        </w:rPr>
+        <w:tab/>
+      </w:r>
+      <w:r>
+        <w:rPr>
+          <w:noProof/>
+        </w:rPr>
+        <w:t>4.</w:t>
+      </w:r>
+      <w:r>
+        <w:rPr>
+          <w:noProof/>
+        </w:rPr>
+        <w:t>2</w:t>
+      </w:r>
+      <w:r>
+        <w:rPr>
+          <w:noProof/>
+        </w:rPr>
+        <w:t>.</w:t>
+      </w:r>
+      <w:r>
+        <w:rPr>
+          <w:noProof/>
+        </w:rPr>
+        <w:t>4</w:t>
+      </w:r>
+      <w:r>
+        <w:rPr>
+          <w:noProof/>
+        </w:rPr>
+        <w:t xml:space="preserve">  </w:t>
+      </w:r>
+      <w:r>
+        <w:rPr>
+          <w:noProof/>
+        </w:rPr>
+        <w:t>Evaluation</w:t>
+      </w:r>
+      <w:r>
+        <w:rPr>
+          <w:noProof/>
+        </w:rPr>
+        <w:tab/>
+        <w:t>3</w:t>
+      </w:r>
+    </w:p>
+    <w:p>
+      <w:pPr>
+        <w:pStyle w:val="TOC2"/>
+        <w:rPr>
+          <w:noProof/>
+        </w:rPr>
+      </w:pPr>
+      <w:r>
+        <w:rPr>
+          <w:rFonts w:asciiTheme="minorHAnsi" w:eastAsiaTheme="minorEastAsia" w:hAnsiTheme="minorHAnsi" w:cstheme="minorBidi"/>
+          <w:noProof/>
+          <w:szCs w:val="22"/>
+        </w:rPr>
+        <w:lastRenderedPageBreak/>
+        <w:tab/>
+      </w:r>
+      <w:r>
+        <w:rPr>
+          <w:noProof/>
+        </w:rPr>
+        <w:t>4.</w:t>
+      </w:r>
+      <w:r>
+        <w:rPr>
+          <w:noProof/>
+        </w:rPr>
+        <w:t>2</w:t>
+      </w:r>
+      <w:r>
+        <w:rPr>
+          <w:noProof/>
+        </w:rPr>
+        <w:t>.</w:t>
+      </w:r>
+      <w:r>
+        <w:rPr>
+          <w:noProof/>
+        </w:rPr>
+        <w:t>5</w:t>
+      </w:r>
+      <w:r>
+        <w:rPr>
+          <w:noProof/>
+        </w:rPr>
+        <w:t xml:space="preserve">  </w:t>
+      </w:r>
+      <w:r>
+        <w:rPr>
+          <w:noProof/>
+        </w:rPr>
+        <w:t>Artifact Preservation</w:t>
+      </w:r>
+      <w:r>
+        <w:rPr>
+          <w:noProof/>
+        </w:rPr>
+        <w:tab/>
+        <w:t>3</w:t>
+      </w:r>
+    </w:p>
+    <w:p>
+      <w:pPr>
+        <w:pStyle w:val="TOC2"/>
+        <w:rPr>
+          <w:noProof/>
+        </w:rPr>
+      </w:pPr>
+      <w:r>
+        <w:rPr>
+          <w:noProof/>
+        </w:rPr>
+        <w:t>4</w:t>
+      </w:r>
+      <w:r>
+        <w:rPr>
+          <w:noProof/>
+        </w:rPr>
+        <w:t>.</w:t>
+      </w:r>
+      <w:r>
+        <w:rPr>
+          <w:noProof/>
+        </w:rPr>
+        <w:t>3</w:t>
+      </w:r>
+      <w:r>
+        <w:rPr>
+          <w:noProof/>
+        </w:rPr>
+        <w:t xml:space="preserve"> </w:t>
+      </w:r>
+      <w:r>
+        <w:rPr>
+          <w:noProof/>
+        </w:rPr>
+        <w:t xml:space="preserve"> </w:t>
+      </w:r>
+      <w:r>
+        <w:rPr>
+          <w:noProof/>
+        </w:rPr>
+        <w:t>Feed-Forward Neural Network</w:t>
+      </w:r>
+      <w:r>
+        <w:rPr>
+          <w:noProof/>
+        </w:rPr>
+        <w:tab/>
+        <w:t>3</w:t>
+      </w:r>
+    </w:p>
+    <w:p>
+      <w:pPr>
+        <w:pStyle w:val="TOC2"/>
+        <w:rPr>
+          <w:noProof/>
+        </w:rPr>
+      </w:pPr>
+      <w:r>
+        <w:rPr>
+          <w:rFonts w:asciiTheme="minorHAnsi" w:eastAsiaTheme="minorEastAsia" w:hAnsiTheme="minorHAnsi" w:cstheme="minorBidi"/>
+          <w:noProof/>
+          <w:szCs w:val="22"/>
+        </w:rPr>
+        <w:tab/>
+      </w:r>
+      <w:r>
+        <w:rPr>
+          <w:noProof/>
+        </w:rPr>
+        <w:t>4.</w:t>
+      </w:r>
+      <w:r>
+        <w:rPr>
+          <w:noProof/>
+        </w:rPr>
+        <w:t>3</w:t>
+      </w:r>
+      <w:r>
+        <w:rPr>
+          <w:noProof/>
+        </w:rPr>
+        <w:t>.1</w:t>
+      </w:r>
+      <w:r>
+        <w:rPr>
+          <w:noProof/>
+        </w:rPr>
+        <w:t xml:space="preserve"> </w:t>
+      </w:r>
+      <w:r>
+        <w:rPr>
+          <w:noProof/>
+        </w:rPr>
+        <w:t xml:space="preserve"> </w:t>
+      </w:r>
+      <w:r>
+        <w:rPr>
+          <w:noProof/>
+        </w:rPr>
+        <w:t>Data Preparation</w:t>
+      </w:r>
+      <w:r>
+        <w:rPr>
+          <w:noProof/>
+        </w:rPr>
+        <w:tab/>
+        <w:t>3</w:t>
+      </w:r>
+    </w:p>
+    <w:p>
+      <w:pPr>
+        <w:pStyle w:val="TOC2"/>
+        <w:rPr>
+          <w:noProof/>
+        </w:rPr>
+      </w:pPr>
+      <w:r>
+        <w:rPr>
+          <w:rFonts w:asciiTheme="minorHAnsi" w:eastAsiaTheme="minorEastAsia" w:hAnsiTheme="minorHAnsi" w:cstheme="minorBidi"/>
+          <w:noProof/>
+          <w:szCs w:val="22"/>
+        </w:rPr>
+        <w:tab/>
+      </w:r>
+      <w:r>
+        <w:rPr>
+          <w:noProof/>
+        </w:rPr>
+        <w:t>4.</w:t>
+      </w:r>
+      <w:r>
+        <w:rPr>
+          <w:noProof/>
+        </w:rPr>
+        <w:t>3</w:t>
+      </w:r>
+      <w:r>
+        <w:rPr>
+          <w:noProof/>
+        </w:rPr>
+        <w:t>.</w:t>
+      </w:r>
+      <w:r>
+        <w:rPr>
+          <w:noProof/>
+        </w:rPr>
+        <w:t xml:space="preserve">2  </w:t>
+      </w:r>
+      <w:r>
+        <w:rPr>
+          <w:noProof/>
+        </w:rPr>
+        <w:t>Model Architecture</w:t>
+      </w:r>
+      <w:r>
+        <w:rPr>
+          <w:noProof/>
+        </w:rPr>
+        <w:tab/>
+        <w:t>3</w:t>
+      </w:r>
+    </w:p>
+    <w:p>
+      <w:pPr>
+        <w:pStyle w:val="TOC2"/>
+        <w:rPr>
+          <w:noProof/>
+        </w:rPr>
+      </w:pPr>
+      <w:r>
+        <w:rPr>
+          <w:rFonts w:asciiTheme="minorHAnsi" w:eastAsiaTheme="minorEastAsia" w:hAnsiTheme="minorHAnsi" w:cstheme="minorBidi"/>
+          <w:noProof/>
+          <w:szCs w:val="22"/>
+        </w:rPr>
+        <w:tab/>
+      </w:r>
+      <w:r>
+        <w:rPr>
+          <w:noProof/>
+        </w:rPr>
+        <w:t>4.</w:t>
+      </w:r>
+      <w:r>
+        <w:rPr>
+          <w:noProof/>
+        </w:rPr>
+        <w:t>3</w:t>
+      </w:r>
+      <w:r>
+        <w:rPr>
+          <w:noProof/>
+        </w:rPr>
+        <w:t>.</w:t>
+      </w:r>
+      <w:r>
+        <w:rPr>
+          <w:noProof/>
+        </w:rPr>
+        <w:t xml:space="preserve">3  </w:t>
+      </w:r>
+      <w:r>
+        <w:rPr>
+          <w:noProof/>
+        </w:rPr>
+        <w:t>Training Procedure</w:t>
+      </w:r>
+      <w:r>
+        <w:rPr>
+          <w:noProof/>
+        </w:rPr>
+        <w:tab/>
+        <w:t>3</w:t>
+      </w:r>
+    </w:p>
+    <w:p>
+      <w:pPr>
+        <w:pStyle w:val="TOC2"/>
+        <w:rPr>
+          <w:noProof/>
+        </w:rPr>
+      </w:pPr>
+      <w:r>
+        <w:rPr>
+          <w:rFonts w:asciiTheme="minorHAnsi" w:eastAsiaTheme="minorEastAsia" w:hAnsiTheme="minorHAnsi" w:cstheme="minorBidi"/>
+          <w:noProof/>
+          <w:szCs w:val="22"/>
+        </w:rPr>
+        <w:tab/>
+      </w:r>
+      <w:r>
+        <w:rPr>
+          <w:noProof/>
+        </w:rPr>
+        <w:t>4.</w:t>
+      </w:r>
+      <w:r>
+        <w:rPr>
+          <w:noProof/>
+        </w:rPr>
+        <w:t>3</w:t>
+      </w:r>
+      <w:r>
+        <w:rPr>
+          <w:noProof/>
+        </w:rPr>
+        <w:t>.</w:t>
+      </w:r>
+      <w:r>
+        <w:rPr>
+          <w:noProof/>
+        </w:rPr>
+        <w:t xml:space="preserve">4  </w:t>
+      </w:r>
+      <w:r>
+        <w:rPr>
+          <w:noProof/>
+        </w:rPr>
+        <w:t>Evaluation</w:t>
+      </w:r>
+      <w:r>
+        <w:rPr>
+          <w:noProof/>
+        </w:rPr>
+        <w:tab/>
+        <w:t>3</w:t>
+      </w:r>
+    </w:p>
+    <w:p>
+      <w:pPr>
+        <w:pStyle w:val="TOC2"/>
+        <w:rPr>
+          <w:noProof/>
+        </w:rPr>
+      </w:pPr>
+      <w:r>
+        <w:rPr>
+          <w:rFonts w:asciiTheme="minorHAnsi" w:eastAsiaTheme="minorEastAsia" w:hAnsiTheme="minorHAnsi" w:cstheme="minorBidi"/>
+          <w:noProof/>
+          <w:szCs w:val="22"/>
+        </w:rPr>
+        <w:tab/>
+      </w:r>
+      <w:r>
+        <w:rPr>
+          <w:noProof/>
+        </w:rPr>
+        <w:t>4.</w:t>
+      </w:r>
+      <w:r>
+        <w:rPr>
+          <w:noProof/>
+        </w:rPr>
+        <w:t>3</w:t>
+      </w:r>
+      <w:r>
+        <w:rPr>
+          <w:noProof/>
+        </w:rPr>
+        <w:t>.</w:t>
+      </w:r>
+      <w:r>
+        <w:rPr>
+          <w:noProof/>
+        </w:rPr>
+        <w:t xml:space="preserve">5  </w:t>
+      </w:r>
+      <w:r>
+        <w:rPr>
+          <w:noProof/>
+        </w:rPr>
+        <w:t>Artifact Preservation</w:t>
+      </w:r>
+      <w:r>
+        <w:rPr>
+          <w:noProof/>
+        </w:rPr>
+        <w:tab/>
+        <w:t>3</w:t>
+      </w:r>
+    </w:p>
+    <w:p>
+      <w:pPr>
+        <w:pStyle w:val="TOC2"/>
+        <w:rPr>
+          <w:noProof/>
+        </w:rPr>
+      </w:pPr>
+      <w:r>
+        <w:rPr>
+          <w:noProof/>
+        </w:rPr>
+        <w:t>4</w:t>
+      </w:r>
+      <w:r>
+        <w:rPr>
+          <w:noProof/>
+        </w:rPr>
+        <w:t>.</w:t>
+      </w:r>
+      <w:r>
+        <w:rPr>
+          <w:noProof/>
+        </w:rPr>
+        <w:t>4</w:t>
+      </w:r>
+      <w:r>
+        <w:rPr>
+          <w:noProof/>
+        </w:rPr>
+        <w:t xml:space="preserve"> </w:t>
+      </w:r>
+      <w:r>
+        <w:rPr>
+          <w:noProof/>
+        </w:rPr>
+        <w:t xml:space="preserve"> </w:t>
+      </w:r>
+      <w:r>
+        <w:rPr>
+          <w:noProof/>
+        </w:rPr>
+        <w:t>Extreme Gradient Boosting Classifier</w:t>
+      </w:r>
+      <w:r>
+        <w:rPr>
+          <w:noProof/>
+        </w:rPr>
+        <w:tab/>
+        <w:t>3</w:t>
+      </w:r>
+    </w:p>
+    <w:p>
+      <w:pPr>
+        <w:pStyle w:val="TOC2"/>
+        <w:rPr>
+          <w:noProof/>
+        </w:rPr>
+      </w:pPr>
+      <w:r>
+        <w:rPr>
+          <w:rFonts w:asciiTheme="minorHAnsi" w:eastAsiaTheme="minorEastAsia" w:hAnsiTheme="minorHAnsi" w:cstheme="minorBidi"/>
+          <w:noProof/>
+          <w:szCs w:val="22"/>
+        </w:rPr>
+        <w:tab/>
+      </w:r>
+      <w:r>
+        <w:rPr>
+          <w:noProof/>
+        </w:rPr>
+        <w:t>4.</w:t>
+      </w:r>
+      <w:r>
+        <w:rPr>
+          <w:noProof/>
+        </w:rPr>
+        <w:t>4</w:t>
+      </w:r>
+      <w:r>
+        <w:rPr>
+          <w:noProof/>
+        </w:rPr>
+        <w:t>.1</w:t>
+      </w:r>
+      <w:r>
+        <w:rPr>
+          <w:noProof/>
+        </w:rPr>
+        <w:t xml:space="preserve">  </w:t>
+      </w:r>
+      <w:r>
+        <w:rPr>
+          <w:noProof/>
+        </w:rPr>
+        <w:t>Data Loading and Feature Selection</w:t>
+      </w:r>
+      <w:r>
+        <w:rPr>
+          <w:noProof/>
+        </w:rPr>
+        <w:tab/>
+        <w:t>3</w:t>
+      </w:r>
+    </w:p>
+    <w:p>
+      <w:pPr>
+        <w:pStyle w:val="TOC2"/>
+        <w:rPr>
+          <w:noProof/>
+        </w:rPr>
+      </w:pPr>
+      <w:r>
+        <w:rPr>
+          <w:rFonts w:asciiTheme="minorHAnsi" w:eastAsiaTheme="minorEastAsia" w:hAnsiTheme="minorHAnsi" w:cstheme="minorBidi"/>
+          <w:noProof/>
+          <w:szCs w:val="22"/>
+        </w:rPr>
+        <w:tab/>
+      </w:r>
+      <w:r>
+        <w:rPr>
+          <w:noProof/>
+        </w:rPr>
+        <w:t>4.</w:t>
+      </w:r>
+      <w:r>
+        <w:rPr>
+          <w:noProof/>
+        </w:rPr>
+        <w:t>4</w:t>
+      </w:r>
+      <w:r>
+        <w:rPr>
+          <w:noProof/>
+        </w:rPr>
+        <w:t>.</w:t>
+      </w:r>
+      <w:r>
+        <w:rPr>
+          <w:noProof/>
+        </w:rPr>
+        <w:t xml:space="preserve">2  </w:t>
+      </w:r>
+      <w:r>
+        <w:rPr>
+          <w:noProof/>
+        </w:rPr>
+        <w:t>Train-Test Split and Preprocessing</w:t>
+      </w:r>
+      <w:r>
+        <w:rPr>
+          <w:noProof/>
+        </w:rPr>
+        <w:tab/>
+        <w:t>3</w:t>
+      </w:r>
+    </w:p>
+    <w:p>
+      <w:pPr>
+        <w:pStyle w:val="TOC2"/>
+        <w:rPr>
+          <w:noProof/>
+        </w:rPr>
+      </w:pPr>
+      <w:r>
+        <w:rPr>
+          <w:rFonts w:asciiTheme="minorHAnsi" w:eastAsiaTheme="minorEastAsia" w:hAnsiTheme="minorHAnsi" w:cstheme="minorBidi"/>
+          <w:noProof/>
+          <w:szCs w:val="22"/>
+        </w:rPr>
+        <w:tab/>
+      </w:r>
+      <w:r>
+        <w:rPr>
+          <w:noProof/>
+        </w:rPr>
+        <w:t>4.</w:t>
+      </w:r>
+      <w:r>
+        <w:rPr>
+          <w:noProof/>
+        </w:rPr>
+        <w:t>4</w:t>
+      </w:r>
+      <w:r>
+        <w:rPr>
+          <w:noProof/>
+        </w:rPr>
+        <w:t>.</w:t>
+      </w:r>
+      <w:r>
+        <w:rPr>
+          <w:noProof/>
+        </w:rPr>
+        <w:t xml:space="preserve">3  </w:t>
+      </w:r>
+      <w:r>
+        <w:rPr>
+          <w:noProof/>
+        </w:rPr>
+        <w:t>Model Configuration and Training</w:t>
+      </w:r>
+      <w:r>
+        <w:rPr>
+          <w:noProof/>
+        </w:rPr>
+        <w:tab/>
+        <w:t>3</w:t>
+      </w:r>
+    </w:p>
+    <w:p>
+      <w:pPr>
+        <w:pStyle w:val="TOC2"/>
+        <w:rPr>
+          <w:noProof/>
+        </w:rPr>
+      </w:pPr>
+      <w:r>
+        <w:rPr>
+          <w:rFonts w:asciiTheme="minorHAnsi" w:eastAsiaTheme="minorEastAsia" w:hAnsiTheme="minorHAnsi" w:cstheme="minorBidi"/>
+          <w:noProof/>
+          <w:szCs w:val="22"/>
+        </w:rPr>
+        <w:tab/>
+      </w:r>
+      <w:r>
+        <w:rPr>
+          <w:noProof/>
+        </w:rPr>
+        <w:t>4.</w:t>
+      </w:r>
+      <w:r>
+        <w:rPr>
+          <w:noProof/>
+        </w:rPr>
+        <w:t>4</w:t>
+      </w:r>
+      <w:r>
+        <w:rPr>
+          <w:noProof/>
+        </w:rPr>
+        <w:t>.</w:t>
+      </w:r>
+      <w:r>
+        <w:rPr>
+          <w:noProof/>
+        </w:rPr>
+        <w:t xml:space="preserve">4  </w:t>
+      </w:r>
+      <w:r>
+        <w:rPr>
+          <w:noProof/>
+        </w:rPr>
+        <w:t>Evaluation</w:t>
+      </w:r>
+      <w:r>
+        <w:rPr>
+          <w:noProof/>
+        </w:rPr>
+        <w:tab/>
+        <w:t>3</w:t>
+      </w:r>
+    </w:p>
+    <w:p>
+      <w:pPr>
+        <w:pStyle w:val="TOC2"/>
+        <w:rPr>
+          <w:noProof/>
+        </w:rPr>
+      </w:pPr>
+      <w:r>
+        <w:rPr>
+          <w:rFonts w:asciiTheme="minorHAnsi" w:eastAsiaTheme="minorEastAsia" w:hAnsiTheme="minorHAnsi" w:cstheme="minorBidi"/>
+          <w:noProof/>
+          <w:szCs w:val="22"/>
+        </w:rPr>
+        <w:tab/>
+      </w:r>
+      <w:r>
+        <w:rPr>
+          <w:noProof/>
+        </w:rPr>
+        <w:t>4.</w:t>
+      </w:r>
+      <w:r>
+        <w:rPr>
+          <w:noProof/>
+        </w:rPr>
+        <w:t>4</w:t>
+      </w:r>
+      <w:r>
+        <w:rPr>
+          <w:noProof/>
+        </w:rPr>
+        <w:t>.</w:t>
+      </w:r>
+      <w:r>
+        <w:rPr>
+          <w:noProof/>
+        </w:rPr>
+        <w:t xml:space="preserve">5  </w:t>
+      </w:r>
+      <w:r>
+        <w:rPr>
+          <w:noProof/>
+        </w:rPr>
+        <w:t>Artifact Preservation</w:t>
+      </w:r>
+      <w:r>
+        <w:rPr>
+          <w:noProof/>
+        </w:rPr>
+        <w:tab/>
+        <w:t>3</w:t>
+      </w:r>
+    </w:p>
+    <w:p>
+      <w:pPr>
+        <w:pStyle w:val="TOC2"/>
+        <w:ind w:left="0" w:firstLine="0"/>
         <w:rPr>
           <w:b/>
           <w:bCs/>
           <w:noProof/>
-          <w:lang w:val="en-US"/>
-        </w:rPr>
-        <w:t>Error! Bookmark not defined.</w:t>
+        </w:rPr>
+      </w:pPr>
+      <w:r>
+        <w:rPr>
+          <w:b/>
+          <w:bCs/>
+          <w:noProof/>
+        </w:rPr>
+        <w:t xml:space="preserve">Chapter </w:t>
+      </w:r>
+      <w:r>
+        <w:rPr>
+          <w:b/>
+          <w:bCs/>
+          <w:noProof/>
+        </w:rPr>
+        <w:t>5</w:t>
+      </w:r>
+      <w:r>
+        <w:rPr>
+          <w:b/>
+          <w:bCs/>
+          <w:noProof/>
+        </w:rPr>
+        <w:t xml:space="preserve">: </w:t>
+      </w:r>
+      <w:r>
+        <w:rPr>
+          <w:b/>
+          <w:bCs/>
+          <w:noProof/>
+        </w:rPr>
+        <w:t>Results, Evaluation, and Discussion</w:t>
+      </w:r>
+      <w:r>
+        <w:rPr>
+          <w:b/>
+          <w:bCs/>
+          <w:noProof/>
+        </w:rPr>
+        <w:tab/>
+      </w:r>
+      <w:r>
+        <w:rPr>
+          <w:b/>
+          <w:bCs/>
+          <w:noProof/>
+        </w:rPr>
+        <w:fldChar w:fldCharType="begin"/>
+      </w:r>
+      <w:r>
+        <w:rPr>
+          <w:b/>
+          <w:bCs/>
+          <w:noProof/>
+        </w:rPr>
+        <w:instrText xml:space="preserve"> PAGEREF _Toc407145094 \h </w:instrText>
+      </w:r>
+      <w:r>
+        <w:rPr>
+          <w:b/>
+          <w:bCs/>
+          <w:noProof/>
+        </w:rPr>
+      </w:r>
+      <w:r>
+        <w:rPr>
+          <w:b/>
+          <w:bCs/>
+          <w:noProof/>
+        </w:rPr>
+        <w:fldChar w:fldCharType="separate"/>
+      </w:r>
+      <w:r>
+        <w:rPr>
+          <w:b/>
+          <w:bCs/>
+          <w:noProof/>
+        </w:rPr>
+        <w:t>2</w:t>
+      </w:r>
+      <w:r>
+        <w:rPr>
+          <w:b/>
+          <w:bCs/>
+          <w:noProof/>
+        </w:rPr>
+        <w:fldChar w:fldCharType="end"/>
+      </w:r>
+    </w:p>
+    <w:p>
+      <w:pPr>
+        <w:pStyle w:val="TOC2"/>
+        <w:rPr>
+          <w:noProof/>
+        </w:rPr>
+      </w:pPr>
+      <w:r>
+        <w:rPr>
+          <w:noProof/>
+        </w:rPr>
+        <w:t>5</w:t>
+      </w:r>
+      <w:r>
+        <w:rPr>
+          <w:noProof/>
+        </w:rPr>
+        <w:t xml:space="preserve">.1 </w:t>
+      </w:r>
+      <w:r>
+        <w:rPr>
+          <w:noProof/>
+        </w:rPr>
+        <w:t xml:space="preserve"> </w:t>
+      </w:r>
+      <w:r>
+        <w:rPr>
+          <w:noProof/>
+        </w:rPr>
+        <w:t>Evaluation Methodology</w:t>
+      </w:r>
+      <w:r>
+        <w:rPr>
+          <w:noProof/>
+        </w:rPr>
+        <w:tab/>
+      </w:r>
+      <w:r>
+        <w:rPr>
+          <w:noProof/>
+        </w:rPr>
+        <w:fldChar w:fldCharType="begin"/>
+      </w:r>
+      <w:r>
+        <w:rPr>
+          <w:noProof/>
+        </w:rPr>
+        <w:instrText xml:space="preserve"> PAGEREF _Toc407145095 \h </w:instrText>
+      </w:r>
+      <w:r>
+        <w:rPr>
+          <w:noProof/>
+        </w:rPr>
+      </w:r>
+      <w:r>
+        <w:rPr>
+          <w:noProof/>
+        </w:rPr>
+        <w:fldChar w:fldCharType="separate"/>
+      </w:r>
+      <w:r>
+        <w:rPr>
+          <w:noProof/>
+        </w:rPr>
+        <w:t>2</w:t>
+      </w:r>
+      <w:r>
+        <w:rPr>
+          <w:noProof/>
+        </w:rPr>
+        <w:fldChar w:fldCharType="end"/>
+      </w:r>
+    </w:p>
+    <w:p>
+      <w:pPr>
+        <w:pStyle w:val="TOC2"/>
+        <w:rPr>
+          <w:noProof/>
+        </w:rPr>
+      </w:pPr>
+      <w:r>
+        <w:rPr>
+          <w:noProof/>
+        </w:rPr>
+        <w:t>5</w:t>
+      </w:r>
+      <w:r>
+        <w:rPr>
+          <w:noProof/>
+        </w:rPr>
+        <w:t>.</w:t>
+      </w:r>
+      <w:r>
+        <w:rPr>
+          <w:noProof/>
+        </w:rPr>
+        <w:t>2</w:t>
+      </w:r>
+      <w:r>
+        <w:rPr>
+          <w:noProof/>
+        </w:rPr>
+        <w:t xml:space="preserve"> </w:t>
+      </w:r>
+      <w:r>
+        <w:rPr>
+          <w:noProof/>
+        </w:rPr>
+        <w:t xml:space="preserve"> </w:t>
+      </w:r>
+      <w:r>
+        <w:rPr>
+          <w:noProof/>
+        </w:rPr>
+        <w:t>In-Distribution Classification Performance</w:t>
+      </w:r>
+      <w:r>
+        <w:rPr>
+          <w:noProof/>
+        </w:rPr>
+        <w:tab/>
+        <w:t>3</w:t>
+      </w:r>
+    </w:p>
+    <w:p>
+      <w:pPr>
+        <w:pStyle w:val="TOC2"/>
+        <w:rPr>
+          <w:noProof/>
+        </w:rPr>
+      </w:pPr>
+      <w:r>
+        <w:rPr>
+          <w:rFonts w:asciiTheme="minorHAnsi" w:eastAsiaTheme="minorEastAsia" w:hAnsiTheme="minorHAnsi" w:cstheme="minorBidi"/>
+          <w:noProof/>
+          <w:szCs w:val="22"/>
+        </w:rPr>
+        <w:tab/>
+      </w:r>
+      <w:r>
+        <w:rPr>
+          <w:noProof/>
+        </w:rPr>
+        <w:t>5</w:t>
+      </w:r>
+      <w:r>
+        <w:rPr>
+          <w:noProof/>
+        </w:rPr>
+        <w:t>.</w:t>
+      </w:r>
+      <w:r>
+        <w:rPr>
+          <w:noProof/>
+        </w:rPr>
+        <w:t>2</w:t>
+      </w:r>
+      <w:r>
+        <w:rPr>
+          <w:noProof/>
+        </w:rPr>
+        <w:t>.1</w:t>
+      </w:r>
+      <w:r>
+        <w:rPr>
+          <w:noProof/>
+        </w:rPr>
+        <w:t xml:space="preserve">  </w:t>
+      </w:r>
+      <w:r>
+        <w:rPr>
+          <w:noProof/>
+        </w:rPr>
+        <w:t>Random Forest Classifier</w:t>
+      </w:r>
+      <w:r>
+        <w:rPr>
+          <w:noProof/>
+        </w:rPr>
+        <w:tab/>
+        <w:t>3</w:t>
+      </w:r>
+    </w:p>
+    <w:p>
+      <w:pPr>
+        <w:pStyle w:val="TOC2"/>
+        <w:rPr>
+          <w:noProof/>
+        </w:rPr>
+      </w:pPr>
+      <w:r>
+        <w:rPr>
+          <w:rFonts w:asciiTheme="minorHAnsi" w:eastAsiaTheme="minorEastAsia" w:hAnsiTheme="minorHAnsi" w:cstheme="minorBidi"/>
+          <w:noProof/>
+          <w:szCs w:val="22"/>
+        </w:rPr>
+        <w:tab/>
+      </w:r>
+      <w:r>
+        <w:rPr>
+          <w:noProof/>
+        </w:rPr>
+        <w:t>5</w:t>
+      </w:r>
+      <w:r>
+        <w:rPr>
+          <w:noProof/>
+        </w:rPr>
+        <w:t>.</w:t>
+      </w:r>
+      <w:r>
+        <w:rPr>
+          <w:noProof/>
+        </w:rPr>
+        <w:t>2</w:t>
+      </w:r>
+      <w:r>
+        <w:rPr>
+          <w:noProof/>
+        </w:rPr>
+        <w:t>.</w:t>
+      </w:r>
+      <w:r>
+        <w:rPr>
+          <w:noProof/>
+        </w:rPr>
+        <w:t xml:space="preserve">2  </w:t>
+      </w:r>
+      <w:r>
+        <w:rPr>
+          <w:noProof/>
+        </w:rPr>
+        <w:t>Feed-Forward Neural Network</w:t>
+      </w:r>
+      <w:r>
+        <w:rPr>
+          <w:noProof/>
+        </w:rPr>
+        <w:tab/>
+        <w:t>3</w:t>
+      </w:r>
+    </w:p>
+    <w:p>
+      <w:pPr>
+        <w:pStyle w:val="TOC2"/>
+        <w:rPr>
+          <w:noProof/>
+        </w:rPr>
+      </w:pPr>
+      <w:r>
+        <w:rPr>
+          <w:rFonts w:asciiTheme="minorHAnsi" w:eastAsiaTheme="minorEastAsia" w:hAnsiTheme="minorHAnsi" w:cstheme="minorBidi"/>
+          <w:noProof/>
+          <w:szCs w:val="22"/>
+        </w:rPr>
+        <w:tab/>
+      </w:r>
+      <w:r>
+        <w:rPr>
+          <w:noProof/>
+        </w:rPr>
+        <w:t>5</w:t>
+      </w:r>
+      <w:r>
+        <w:rPr>
+          <w:noProof/>
+        </w:rPr>
+        <w:t>.</w:t>
+      </w:r>
+      <w:r>
+        <w:rPr>
+          <w:noProof/>
+        </w:rPr>
+        <w:t>2</w:t>
+      </w:r>
+      <w:r>
+        <w:rPr>
+          <w:noProof/>
+        </w:rPr>
+        <w:t>.</w:t>
+      </w:r>
+      <w:r>
+        <w:rPr>
+          <w:noProof/>
+        </w:rPr>
+        <w:t xml:space="preserve">3 </w:t>
+      </w:r>
+      <w:r>
+        <w:rPr>
+          <w:noProof/>
+        </w:rPr>
+        <w:t xml:space="preserve"> </w:t>
+      </w:r>
+      <w:r>
+        <w:rPr>
+          <w:noProof/>
+        </w:rPr>
+        <w:t>Extreme Gradient Boosting Classifier</w:t>
+      </w:r>
+      <w:r>
+        <w:rPr>
+          <w:noProof/>
+        </w:rPr>
+        <w:tab/>
+        <w:t>3</w:t>
+      </w:r>
+    </w:p>
+    <w:p>
+      <w:pPr>
+        <w:pStyle w:val="TOC2"/>
+        <w:rPr>
+          <w:noProof/>
+        </w:rPr>
+      </w:pPr>
+      <w:r>
+        <w:rPr>
+          <w:noProof/>
+        </w:rPr>
+        <w:t>5.</w:t>
+      </w:r>
+      <w:r>
+        <w:rPr>
+          <w:noProof/>
+        </w:rPr>
+        <w:t>3</w:t>
+      </w:r>
+      <w:r>
+        <w:rPr>
+          <w:noProof/>
+        </w:rPr>
+        <w:t xml:space="preserve">  </w:t>
+      </w:r>
+      <w:r>
+        <w:rPr>
+          <w:noProof/>
+        </w:rPr>
+        <w:t>Model Comparison</w:t>
+      </w:r>
+      <w:r>
+        <w:rPr>
+          <w:noProof/>
+        </w:rPr>
+        <w:tab/>
+      </w:r>
+      <w:r>
+        <w:rPr>
+          <w:noProof/>
+        </w:rPr>
+        <w:fldChar w:fldCharType="begin"/>
+      </w:r>
+      <w:r>
+        <w:rPr>
+          <w:noProof/>
+        </w:rPr>
+        <w:instrText xml:space="preserve"> PAGEREF _Toc407145095 \h </w:instrText>
+      </w:r>
+      <w:r>
+        <w:rPr>
+          <w:noProof/>
+        </w:rPr>
+      </w:r>
+      <w:r>
+        <w:rPr>
+          <w:noProof/>
+        </w:rPr>
+        <w:fldChar w:fldCharType="separate"/>
+      </w:r>
+      <w:r>
+        <w:rPr>
+          <w:noProof/>
+        </w:rPr>
+        <w:t>2</w:t>
+      </w:r>
+      <w:r>
+        <w:rPr>
+          <w:noProof/>
+        </w:rPr>
+        <w:fldChar w:fldCharType="end"/>
+      </w:r>
+    </w:p>
+    <w:p>
+      <w:pPr>
+        <w:pStyle w:val="TOC2"/>
+        <w:rPr>
+          <w:noProof/>
+        </w:rPr>
+      </w:pPr>
+      <w:r>
+        <w:rPr>
+          <w:noProof/>
+        </w:rPr>
+        <w:t>5.</w:t>
+      </w:r>
+      <w:r>
+        <w:rPr>
+          <w:noProof/>
+        </w:rPr>
+        <w:t xml:space="preserve">4  </w:t>
+      </w:r>
+      <w:r>
+        <w:rPr>
+          <w:noProof/>
+        </w:rPr>
+        <w:t>Feature Importance Analysis</w:t>
+      </w:r>
+      <w:r>
+        <w:rPr>
+          <w:noProof/>
+        </w:rPr>
+        <w:tab/>
+      </w:r>
+      <w:r>
+        <w:rPr>
+          <w:noProof/>
+        </w:rPr>
+        <w:fldChar w:fldCharType="begin"/>
+      </w:r>
+      <w:r>
+        <w:rPr>
+          <w:noProof/>
+        </w:rPr>
+        <w:instrText xml:space="preserve"> PAGEREF _Toc407145095 \h </w:instrText>
+      </w:r>
+      <w:r>
+        <w:rPr>
+          <w:noProof/>
+        </w:rPr>
+      </w:r>
+      <w:r>
+        <w:rPr>
+          <w:noProof/>
+        </w:rPr>
+        <w:fldChar w:fldCharType="separate"/>
+      </w:r>
+      <w:r>
+        <w:rPr>
+          <w:noProof/>
+        </w:rPr>
+        <w:t>2</w:t>
+      </w:r>
+      <w:r>
+        <w:rPr>
+          <w:noProof/>
+        </w:rPr>
+        <w:fldChar w:fldCharType="end"/>
+      </w:r>
+    </w:p>
+    <w:p>
+      <w:pPr>
+        <w:pStyle w:val="TOC2"/>
+        <w:rPr>
+          <w:noProof/>
+        </w:rPr>
+      </w:pPr>
+      <w:r>
+        <w:rPr>
+          <w:noProof/>
+        </w:rPr>
+        <w:t>5.</w:t>
+      </w:r>
+      <w:r>
+        <w:rPr>
+          <w:noProof/>
+        </w:rPr>
+        <w:t>5</w:t>
+      </w:r>
+      <w:r>
+        <w:rPr>
+          <w:noProof/>
+        </w:rPr>
+        <w:t xml:space="preserve">  </w:t>
+      </w:r>
+      <w:r>
+        <w:rPr>
+          <w:noProof/>
+        </w:rPr>
+        <w:t>Cross-Skill Generalisation</w:t>
+      </w:r>
+      <w:r>
+        <w:rPr>
+          <w:noProof/>
+        </w:rPr>
+        <w:tab/>
+      </w:r>
+      <w:r>
+        <w:rPr>
+          <w:noProof/>
+        </w:rPr>
+        <w:fldChar w:fldCharType="begin"/>
+      </w:r>
+      <w:r>
+        <w:rPr>
+          <w:noProof/>
+        </w:rPr>
+        <w:instrText xml:space="preserve"> PAGEREF _Toc407145095 \h </w:instrText>
+      </w:r>
+      <w:r>
+        <w:rPr>
+          <w:noProof/>
+        </w:rPr>
+      </w:r>
+      <w:r>
+        <w:rPr>
+          <w:noProof/>
+        </w:rPr>
+        <w:fldChar w:fldCharType="separate"/>
+      </w:r>
+      <w:r>
+        <w:rPr>
+          <w:noProof/>
+        </w:rPr>
+        <w:t>2</w:t>
+      </w:r>
+      <w:r>
+        <w:rPr>
+          <w:noProof/>
+        </w:rPr>
+        <w:fldChar w:fldCharType="end"/>
+      </w:r>
+    </w:p>
+    <w:p>
+      <w:pPr>
+        <w:pStyle w:val="TOC2"/>
+        <w:rPr>
+          <w:noProof/>
+        </w:rPr>
+      </w:pPr>
+      <w:r>
+        <w:rPr>
+          <w:noProof/>
+        </w:rPr>
+        <w:t>5.</w:t>
+      </w:r>
+      <w:r>
+        <w:rPr>
+          <w:noProof/>
+        </w:rPr>
+        <w:t>6</w:t>
+      </w:r>
+      <w:r>
+        <w:rPr>
+          <w:noProof/>
+        </w:rPr>
+        <w:t xml:space="preserve">  </w:t>
+      </w:r>
+      <w:r>
+        <w:rPr>
+          <w:noProof/>
+        </w:rPr>
+        <w:t>Limitations and Failure Cases</w:t>
+      </w:r>
+      <w:r>
+        <w:rPr>
+          <w:noProof/>
+        </w:rPr>
+        <w:tab/>
+      </w:r>
+      <w:r>
+        <w:rPr>
+          <w:noProof/>
+        </w:rPr>
+        <w:fldChar w:fldCharType="begin"/>
+      </w:r>
+      <w:r>
+        <w:rPr>
+          <w:noProof/>
+        </w:rPr>
+        <w:instrText xml:space="preserve"> PAGEREF _Toc407145095 \h </w:instrText>
+      </w:r>
+      <w:r>
+        <w:rPr>
+          <w:noProof/>
+        </w:rPr>
+      </w:r>
+      <w:r>
+        <w:rPr>
+          <w:noProof/>
+        </w:rPr>
+        <w:fldChar w:fldCharType="separate"/>
+      </w:r>
+      <w:r>
+        <w:rPr>
+          <w:noProof/>
+        </w:rPr>
+        <w:t>2</w:t>
+      </w:r>
+      <w:r>
+        <w:rPr>
+          <w:noProof/>
+        </w:rPr>
+        <w:fldChar w:fldCharType="end"/>
+      </w:r>
+    </w:p>
+    <w:p>
+      <w:pPr>
+        <w:pStyle w:val="TOC2"/>
+        <w:rPr>
+          <w:noProof/>
+        </w:rPr>
+      </w:pPr>
+      <w:r>
+        <w:rPr>
+          <w:noProof/>
+        </w:rPr>
+        <w:t>5.</w:t>
+      </w:r>
+      <w:r>
+        <w:rPr>
+          <w:noProof/>
+        </w:rPr>
+        <w:t>7</w:t>
+      </w:r>
+      <w:r>
+        <w:rPr>
+          <w:noProof/>
+        </w:rPr>
+        <w:t xml:space="preserve"> </w:t>
+      </w:r>
+      <w:r>
+        <w:rPr>
+          <w:noProof/>
+        </w:rPr>
+        <w:t xml:space="preserve"> </w:t>
+      </w:r>
+      <w:r>
+        <w:rPr>
+          <w:noProof/>
+        </w:rPr>
+        <w:t>Conclusions</w:t>
+      </w:r>
+      <w:r>
+        <w:rPr>
+          <w:noProof/>
+        </w:rPr>
+        <w:tab/>
+      </w:r>
+      <w:r>
+        <w:rPr>
+          <w:noProof/>
+        </w:rPr>
+        <w:fldChar w:fldCharType="begin"/>
+      </w:r>
+      <w:r>
+        <w:rPr>
+          <w:noProof/>
+        </w:rPr>
+        <w:instrText xml:space="preserve"> PAGEREF _Toc407145095 \h </w:instrText>
+      </w:r>
+      <w:r>
+        <w:rPr>
+          <w:noProof/>
+        </w:rPr>
+      </w:r>
+      <w:r>
+        <w:rPr>
+          <w:noProof/>
+        </w:rPr>
+        <w:fldChar w:fldCharType="separate"/>
+      </w:r>
+      <w:r>
+        <w:rPr>
+          <w:noProof/>
+        </w:rPr>
+        <w:t>2</w:t>
+      </w:r>
+      <w:r>
+        <w:rPr>
+          <w:noProof/>
+        </w:rPr>
+        <w:fldChar w:fldCharType="end"/>
+      </w:r>
+    </w:p>
+    <w:p>
+      <w:pPr>
+        <w:pStyle w:val="TOC2"/>
+        <w:rPr>
+          <w:noProof/>
+        </w:rPr>
+      </w:pPr>
+      <w:r>
+        <w:rPr>
+          <w:noProof/>
+        </w:rPr>
+        <w:t>5.</w:t>
+      </w:r>
+      <w:r>
+        <w:rPr>
+          <w:noProof/>
+        </w:rPr>
+        <w:t>8</w:t>
+      </w:r>
+      <w:r>
+        <w:rPr>
+          <w:noProof/>
+        </w:rPr>
+        <w:t xml:space="preserve">  </w:t>
+      </w:r>
+      <w:r>
+        <w:rPr>
+          <w:noProof/>
+        </w:rPr>
+        <w:t>Future Work</w:t>
+      </w:r>
+      <w:r>
+        <w:rPr>
+          <w:noProof/>
+        </w:rPr>
+        <w:tab/>
+      </w:r>
+      <w:r>
+        <w:rPr>
+          <w:noProof/>
+        </w:rPr>
+        <w:fldChar w:fldCharType="begin"/>
+      </w:r>
+      <w:r>
+        <w:rPr>
+          <w:noProof/>
+        </w:rPr>
+        <w:instrText xml:space="preserve"> PAGEREF _Toc407145095 \h </w:instrText>
+      </w:r>
+      <w:r>
+        <w:rPr>
+          <w:noProof/>
+        </w:rPr>
+      </w:r>
+      <w:r>
+        <w:rPr>
+          <w:noProof/>
+        </w:rPr>
+        <w:fldChar w:fldCharType="separate"/>
+      </w:r>
+      <w:r>
+        <w:rPr>
+          <w:noProof/>
+        </w:rPr>
+        <w:t>2</w:t>
       </w:r>
       <w:r>
         <w:rPr>
@@ -1379,7 +4114,7 @@
         <w:rPr>
           <w:noProof/>
         </w:rPr>
-        <w:t>Chapter 2 Tables and Figures</w:t>
+        <w:t>List of References</w:t>
       </w:r>
       <w:r>
         <w:rPr>
@@ -1397,7 +4132,7 @@
         <w:rPr>
           <w:noProof/>
         </w:rPr>
-        <w:instrText xml:space="preserve"> PAGEREF _Toc407145094 \h </w:instrText>
+        <w:instrText xml:space="preserve"> PAGEREF _Toc407145097 \h </w:instrText>
       </w:r>
       <w:r>
         <w:rPr>
@@ -1414,121 +4149,7 @@
         <w:rPr>
           <w:noProof/>
         </w:rPr>
-        <w:t>2</w:t>
-      </w:r>
-      <w:r>
-        <w:rPr>
-          <w:noProof/>
-        </w:rPr>
-        <w:fldChar w:fldCharType="end"/>
-      </w:r>
-    </w:p>
-    <w:p>
-      <w:pPr>
-        <w:pStyle w:val="TOC2"/>
-        <w:rPr>
-          <w:rFonts w:asciiTheme="minorHAnsi" w:eastAsiaTheme="minorEastAsia" w:hAnsiTheme="minorHAnsi" w:cstheme="minorBidi"/>
-          <w:noProof/>
-          <w:szCs w:val="22"/>
-        </w:rPr>
-      </w:pPr>
-      <w:r>
-        <w:rPr>
-          <w:noProof/>
-        </w:rPr>
-        <w:t>2.1  Tables using the ‘table caption’ and ‘table description’ Styles</w:t>
-      </w:r>
-      <w:r>
-        <w:rPr>
-          <w:noProof/>
-        </w:rPr>
-        <w:tab/>
-      </w:r>
-      <w:r>
-        <w:rPr>
-          <w:noProof/>
-        </w:rPr>
-        <w:fldChar w:fldCharType="begin"/>
-      </w:r>
-      <w:r>
-        <w:rPr>
-          <w:noProof/>
-        </w:rPr>
-        <w:instrText xml:space="preserve"> PAGEREF _Toc407145095 \h </w:instrText>
-      </w:r>
-      <w:r>
-        <w:rPr>
-          <w:noProof/>
-        </w:rPr>
-      </w:r>
-      <w:r>
-        <w:rPr>
-          <w:noProof/>
-        </w:rPr>
-        <w:fldChar w:fldCharType="separate"/>
-      </w:r>
-      <w:r>
-        <w:rPr>
-          <w:noProof/>
-        </w:rPr>
-        <w:t>2</w:t>
-      </w:r>
-      <w:r>
-        <w:rPr>
-          <w:noProof/>
-        </w:rPr>
-        <w:fldChar w:fldCharType="end"/>
-      </w:r>
-    </w:p>
-    <w:p>
-      <w:pPr>
-        <w:pStyle w:val="TOC2"/>
-        <w:rPr>
-          <w:rFonts w:asciiTheme="minorHAnsi" w:eastAsiaTheme="minorEastAsia" w:hAnsiTheme="minorHAnsi" w:cstheme="minorBidi"/>
-          <w:noProof/>
-          <w:szCs w:val="22"/>
-        </w:rPr>
-      </w:pPr>
-      <w:r>
-        <w:rPr>
-          <w:noProof/>
-        </w:rPr>
-        <w:t>2.2  Figures using the ‘figure caption’ and ‘figure description’ Styles</w:t>
-      </w:r>
-      <w:r>
-        <w:rPr>
-          <w:noProof/>
-        </w:rPr>
-        <w:tab/>
-      </w:r>
-      <w:r>
-        <w:rPr>
-          <w:noProof/>
-        </w:rPr>
-        <w:fldChar w:fldCharType="begin"/>
-      </w:r>
-      <w:r>
-        <w:rPr>
-          <w:noProof/>
-        </w:rPr>
-        <w:instrText xml:space="preserve"> PAGEREF _Toc407145096 \h </w:instrText>
-      </w:r>
-      <w:r>
-        <w:rPr>
-          <w:noProof/>
-        </w:rPr>
-      </w:r>
-      <w:r>
-        <w:rPr>
-          <w:noProof/>
-        </w:rPr>
-        <w:fldChar w:fldCharType="separate"/>
-      </w:r>
-      <w:r>
-        <w:rPr>
-          <w:noProof/>
-        </w:rPr>
-        <w:t>2</w:t>
+        <w:t>4</w:t>
       </w:r>
       <w:r>
         <w:rPr>
@@ -1551,7 +4172,13 @@
         <w:rPr>
           <w:noProof/>
         </w:rPr>
-        <w:t>List of References</w:t>
+        <w:t xml:space="preserve">Appendix A </w:t>
+      </w:r>
+      <w:r>
+        <w:rPr>
+          <w:noProof/>
+        </w:rPr>
+        <w:t>Self-appraisal</w:t>
       </w:r>
       <w:r>
         <w:rPr>
@@ -1569,7 +4196,7 @@
         <w:rPr>
           <w:noProof/>
         </w:rPr>
-        <w:instrText xml:space="preserve"> PAGEREF _Toc407145097 \h </w:instrText>
+        <w:instrText xml:space="preserve"> PAGEREF _Toc407145098 \h </w:instrText>
       </w:r>
       <w:r>
         <w:rPr>
@@ -1586,7 +4213,7 @@
         <w:rPr>
           <w:noProof/>
         </w:rPr>
-        <w:t>4</w:t>
+        <w:t>6</w:t>
       </w:r>
       <w:r>
         <w:rPr>
@@ -1599,23 +4226,14 @@
       <w:pPr>
         <w:pStyle w:val="TOC1"/>
         <w:rPr>
-          <w:rFonts w:asciiTheme="minorHAnsi" w:eastAsiaTheme="minorEastAsia" w:hAnsiTheme="minorHAnsi" w:cstheme="minorBidi"/>
-          <w:b w:val="0"/>
-          <w:noProof/>
-          <w:szCs w:val="22"/>
-        </w:rPr>
-      </w:pPr>
-      <w:r>
-        <w:rPr>
-          <w:noProof/>
-        </w:rPr>
-        <w:t xml:space="preserve">Appendix A </w:t>
-      </w:r>
-      <w:r>
-        <w:rPr>
-          <w:noProof/>
-        </w:rPr>
-        <w:t>Self-appraisal</w:t>
+          <w:noProof/>
+        </w:rPr>
+      </w:pPr>
+      <w:r>
+        <w:rPr>
+          <w:noProof/>
+        </w:rPr>
+        <w:t>Appendix B External materials</w:t>
       </w:r>
       <w:r>
         <w:rPr>
@@ -1658,137 +4276,6 @@
         </w:rPr>
         <w:fldChar w:fldCharType="end"/>
       </w:r>
-    </w:p>
-    <w:p>
-      <w:pPr>
-        <w:pStyle w:val="TOC2"/>
-        <w:rPr>
-          <w:rFonts w:asciiTheme="minorHAnsi" w:eastAsiaTheme="minorEastAsia" w:hAnsiTheme="minorHAnsi" w:cstheme="minorBidi"/>
-          <w:noProof/>
-          <w:szCs w:val="22"/>
-        </w:rPr>
-      </w:pPr>
-      <w:r>
-        <w:rPr>
-          <w:noProof/>
-        </w:rPr>
-        <w:t xml:space="preserve">A.1  Level 2 Heading with ‘heading 2’ </w:t>
-      </w:r>
-    </w:p>
-    <w:p>
-      <w:pPr>
-        <w:pStyle w:val="TOC3"/>
-        <w:rPr>
-          <w:rFonts w:asciiTheme="minorHAnsi" w:eastAsiaTheme="minorEastAsia" w:hAnsiTheme="minorHAnsi" w:cstheme="minorBidi"/>
-          <w:noProof/>
-          <w:szCs w:val="22"/>
-        </w:rPr>
-      </w:pPr>
-      <w:r>
-        <w:rPr>
-          <w:noProof/>
-        </w:rPr>
-        <w:t>A.1.1  Level 3 Heading with ‘heading 3’ Style</w:t>
-      </w:r>
-    </w:p>
-    <w:p>
-      <w:pPr>
-        <w:pStyle w:val="TOC4"/>
-        <w:rPr>
-          <w:noProof/>
-        </w:rPr>
-      </w:pPr>
-      <w:r>
-        <w:rPr>
-          <w:noProof/>
-        </w:rPr>
-        <w:t>A.1.1.1  Level 4 Heading with ‘heading 4’ Style</w:t>
-      </w:r>
-      <w:r>
-        <w:rPr>
-          <w:noProof/>
-        </w:rPr>
-        <w:tab/>
-      </w:r>
-    </w:p>
-    <w:p>
-      <w:pPr>
-        <w:pStyle w:val="TOC1"/>
-        <w:rPr>
-          <w:noProof/>
-        </w:rPr>
-      </w:pPr>
-      <w:r>
-        <w:rPr>
-          <w:noProof/>
-        </w:rPr>
-        <w:t>Appendix B External materials</w:t>
-      </w:r>
-      <w:r>
-        <w:rPr>
-          <w:noProof/>
-        </w:rPr>
-        <w:tab/>
-      </w:r>
-      <w:r>
-        <w:rPr>
-          <w:noProof/>
-        </w:rPr>
-        <w:fldChar w:fldCharType="begin"/>
-      </w:r>
-      <w:r>
-        <w:rPr>
-          <w:noProof/>
-        </w:rPr>
-        <w:instrText xml:space="preserve"> PAGEREF _Toc407145098 \h </w:instrText>
-      </w:r>
-      <w:r>
-        <w:rPr>
-          <w:noProof/>
-        </w:rPr>
-      </w:r>
-      <w:r>
-        <w:rPr>
-          <w:noProof/>
-        </w:rPr>
-        <w:fldChar w:fldCharType="separate"/>
-      </w:r>
-      <w:r>
-        <w:rPr>
-          <w:noProof/>
-        </w:rPr>
-        <w:t>6</w:t>
-      </w:r>
-      <w:r>
-        <w:rPr>
-          <w:noProof/>
-        </w:rPr>
-        <w:fldChar w:fldCharType="end"/>
-      </w:r>
-    </w:p>
-    <w:p>
-      <w:pPr>
-        <w:pStyle w:val="TOC2"/>
-        <w:rPr>
-          <w:rFonts w:asciiTheme="minorHAnsi" w:eastAsiaTheme="minorEastAsia" w:hAnsiTheme="minorHAnsi" w:cstheme="minorBidi"/>
-          <w:noProof/>
-          <w:szCs w:val="22"/>
-        </w:rPr>
-      </w:pPr>
-      <w:r>
-        <w:rPr>
-          <w:noProof/>
-        </w:rPr>
-        <w:t>B.1  Level 2 Heading with ‘heading 2’ Style</w:t>
-      </w:r>
-    </w:p>
-    <w:p>
-      <w:pPr>
-        <w:pStyle w:val="TOC1"/>
-        <w:rPr>
-          <w:noProof/>
-        </w:rPr>
-      </w:pPr>
     </w:p>
     <w:p>
       <w:pPr>
@@ -1815,7 +4302,6 @@
         </w:rPr>
       </w:pPr>
     </w:p>
-    <w:p/>
     <w:p>
       <w:pPr>
         <w:sectPr>
@@ -1852,129 +4338,6 @@
     </w:p>
     <w:p>
       <w:pPr>
-        <w:rPr>
-          <w:szCs w:val="22"/>
-        </w:rPr>
-      </w:pPr>
-      <w:r>
-        <w:rPr>
-          <w:szCs w:val="22"/>
-        </w:rPr>
-        <w:t>&lt;</w:t>
-      </w:r>
-      <w:r>
-        <w:rPr>
-          <w:szCs w:val="22"/>
-        </w:rPr>
-        <w:t>Recommend using</w:t>
-      </w:r>
-      <w:r>
-        <w:rPr>
-          <w:szCs w:val="22"/>
-        </w:rPr>
-        <w:t xml:space="preserve"> </w:t>
-      </w:r>
-      <w:r>
-        <w:rPr>
-          <w:szCs w:val="22"/>
-        </w:rPr>
-        <w:t xml:space="preserve">‘Heading 1’ for chapter titles, </w:t>
-      </w:r>
-      <w:r>
-        <w:rPr>
-          <w:szCs w:val="22"/>
-        </w:rPr>
-        <w:t>‘Heading 2’</w:t>
-      </w:r>
-      <w:r>
-        <w:rPr>
-          <w:szCs w:val="22"/>
-        </w:rPr>
-        <w:t xml:space="preserve"> style</w:t>
-      </w:r>
-      <w:r>
-        <w:rPr>
-          <w:szCs w:val="22"/>
-        </w:rPr>
-        <w:t xml:space="preserve"> for section headings, ‘Heading 3’ for subsection headings, and ‘Heading 4’ for sub-subsection headings</w:t>
-      </w:r>
-      <w:r>
-        <w:rPr>
-          <w:szCs w:val="22"/>
-        </w:rPr>
-        <w:t xml:space="preserve">, but whatever you choose </w:t>
-      </w:r>
-      <w:r>
-        <w:rPr>
-          <w:szCs w:val="22"/>
-        </w:rPr>
-        <w:t>you must</w:t>
-      </w:r>
-      <w:r>
-        <w:rPr>
-          <w:szCs w:val="22"/>
-        </w:rPr>
-        <w:t xml:space="preserve"> be consistent</w:t>
-      </w:r>
-      <w:r>
-        <w:rPr>
-          <w:szCs w:val="22"/>
-        </w:rPr>
-        <w:t xml:space="preserve">. Don’t forget that text </w:t>
-      </w:r>
-      <w:r>
-        <w:rPr>
-          <w:szCs w:val="22"/>
-        </w:rPr>
-        <w:t>(</w:t>
-      </w:r>
-      <w:r>
-        <w:rPr>
-          <w:szCs w:val="22"/>
-        </w:rPr>
-        <w:t>other than headings</w:t>
-      </w:r>
-      <w:r>
-        <w:rPr>
-          <w:szCs w:val="22"/>
-        </w:rPr>
-        <w:t>)</w:t>
-      </w:r>
-      <w:r>
-        <w:rPr>
-          <w:szCs w:val="22"/>
-        </w:rPr>
-        <w:t xml:space="preserve"> </w:t>
-      </w:r>
-      <w:r>
-        <w:rPr>
-          <w:szCs w:val="22"/>
-        </w:rPr>
-        <w:t xml:space="preserve">should be 11 </w:t>
-      </w:r>
-      <w:proofErr w:type="gramStart"/>
-      <w:r>
-        <w:rPr>
-          <w:szCs w:val="22"/>
-        </w:rPr>
-        <w:t>point</w:t>
-      </w:r>
-      <w:proofErr w:type="gramEnd"/>
-      <w:r>
-        <w:rPr>
-          <w:szCs w:val="22"/>
-        </w:rPr>
-        <w:t>.</w:t>
-      </w:r>
-      <w:r>
-        <w:rPr>
-          <w:szCs w:val="22"/>
-        </w:rPr>
-        <w:t>&gt;</w:t>
-      </w:r>
-    </w:p>
-    <w:p>
-      <w:pPr>
         <w:pStyle w:val="Heading2"/>
         <w:numPr>
           <w:ilvl w:val="1"/>
@@ -2541,13 +4904,7 @@
         <w:t xml:space="preserve"> (</w:t>
       </w:r>
       <w:r>
-        <w:t>Silver et al.</w:t>
-      </w:r>
-      <w:r>
-        <w:t xml:space="preserve">, </w:t>
-      </w:r>
-      <w:r>
-        <w:t>2018</w:t>
+        <w:t>Silver et al., 2018</w:t>
       </w:r>
       <w:r>
         <w:t>)</w:t>
@@ -5596,35 +7953,53 @@
         <w:rPr>
           <w:szCs w:val="22"/>
         </w:rPr>
-        <w:t xml:space="preserve">The FFNN achieved an overall accuracy of 89.8%, approximately 1.4 percentage points below the Random Forest. This gap is consistent with findings reported by </w:t>
+        <w:t>The FFNN achieved an overall accuracy of 89.8%, approximately 1.4 percentage points below the Random Forest. This gap is consistent with findings reported by Grinsztajn et al. (2022), who demonstrated that tree-based models systematically outperform neural networks on tabular datasets with heterogeneous features. The behavioural feature set used here - combining count-based ratios, engine-derived statistics, and move-type indicators - fits this profile, making the RF advantage the expected outcome.</w:t>
+      </w:r>
+    </w:p>
+    <w:p>
+      <w:pPr>
+        <w:rPr>
+          <w:szCs w:val="22"/>
+        </w:rPr>
+      </w:pPr>
+      <w:r>
+        <w:rPr>
+          <w:szCs w:val="22"/>
+        </w:rPr>
+        <w:t xml:space="preserve">The most notable pattern is the behaviour of the balanced class: recall reaches 97.1% but precision falls to 75.9%, meaning the model over-predicts balanced and draws in misclassified positional and defensive cases. This reflects the tendency of neural networks to default toward lower-confidence catch-all categories near decision boundaries. Defensive is again the weakest class at 84.9% F1, with 74 defensive samples misclassified as aggressive - a higher count than in either the Random Forest or </w:t>
       </w:r>
       <w:proofErr w:type="spellStart"/>
       <w:r>
         <w:rPr>
           <w:szCs w:val="22"/>
         </w:rPr>
-        <w:t>Grinsztajn</w:t>
+        <w:t>XGBoost</w:t>
       </w:r>
       <w:proofErr w:type="spellEnd"/>
       <w:r>
         <w:rPr>
           <w:szCs w:val="22"/>
         </w:rPr>
-        <w:t xml:space="preserve"> et al. (2022), who demonstrated that tree-based models systematically outperform neural networks on tabular datasets with heterogeneous features. The behavioural feature set used here - combining count-based ratios, engine-derived statistics, and move-type indicators - fits this profile, making the RF advantage the expected outcome.</w:t>
-      </w:r>
-    </w:p>
-    <w:p>
-      <w:pPr>
-        <w:rPr>
-          <w:szCs w:val="22"/>
-        </w:rPr>
-      </w:pPr>
-      <w:r>
-        <w:rPr>
-          <w:szCs w:val="22"/>
-        </w:rPr>
-        <w:t xml:space="preserve">The most notable pattern is the behaviour of the balanced class: recall reaches 97.1% but precision falls to 75.9%, meaning the model over-predicts balanced and draws in misclassified positional and defensive cases. This reflects the tendency of neural networks to default toward lower-confidence catch-all categories near decision boundaries. Defensive is again the weakest class at 84.9% F1, with 74 defensive samples misclassified as aggressive - a higher count than in either the Random Forest or </w:t>
-      </w:r>
+        <w:t xml:space="preserve"> confusion matrices.</w:t>
+      </w:r>
+    </w:p>
+    <w:p>
+      <w:pPr>
+        <w:pStyle w:val="Heading3"/>
+      </w:pPr>
+      <w:r>
+        <w:t xml:space="preserve">5.2.3 </w:t>
+      </w:r>
+      <w:r>
+        <w:t>Extreme Gradient Boosting Classifier</w:t>
+      </w:r>
+    </w:p>
+    <w:p>
+      <w:pPr>
+        <w:rPr>
+          <w:szCs w:val="22"/>
+        </w:rPr>
+      </w:pPr>
       <w:proofErr w:type="spellStart"/>
       <w:r>
         <w:rPr>
@@ -5637,62 +8012,28 @@
         <w:rPr>
           <w:szCs w:val="22"/>
         </w:rPr>
-        <w:t xml:space="preserve"> confusion matrices.</w:t>
-      </w:r>
-    </w:p>
-    <w:p>
-      <w:pPr>
-        <w:pStyle w:val="Heading3"/>
-      </w:pPr>
-      <w:r>
-        <w:t xml:space="preserve">5.2.3 </w:t>
-      </w:r>
-      <w:r>
-        <w:t>Extreme Gradient Boosting Classifier</w:t>
-      </w:r>
-    </w:p>
-    <w:p>
-      <w:pPr>
-        <w:rPr>
-          <w:szCs w:val="22"/>
-        </w:rPr>
-      </w:pPr>
+        <w:t xml:space="preserve"> achieved the highest overall accuracy of 96.9%, with all four classes recording F1-scores above 94%. The confusion matrix shows a marked reduction in aggressive-defensive confusions: only 19 aggressive samples were predicted as defensive, compared to 61 in the Random Forest and 74 in the FFNN. </w:t>
+      </w:r>
       <w:proofErr w:type="spellStart"/>
       <w:r>
         <w:rPr>
           <w:szCs w:val="22"/>
         </w:rPr>
-        <w:t>XGBoost</w:t>
+        <w:t>XGBoost's</w:t>
       </w:r>
       <w:proofErr w:type="spellEnd"/>
       <w:r>
         <w:rPr>
           <w:szCs w:val="22"/>
         </w:rPr>
-        <w:t xml:space="preserve"> achieved the highest overall accuracy of 96.9%, with all four classes recording F1-scores above 94%. The confusion matrix shows a marked reduction in aggressive-defensive confusions: only 19 aggressive samples were predicted as defensive, compared to 61 in the Random Forest and 74 in the FFNN. </w:t>
-      </w:r>
-      <w:proofErr w:type="spellStart"/>
-      <w:r>
-        <w:rPr>
-          <w:szCs w:val="22"/>
-        </w:rPr>
-        <w:t>XGBoost's</w:t>
-      </w:r>
-      <w:proofErr w:type="spellEnd"/>
-      <w:r>
-        <w:rPr>
-          <w:szCs w:val="22"/>
-        </w:rPr>
         <w:t xml:space="preserve"> sequential tree construction trains each subsequent estimator on the residual errors of the previous ones, concentrating learning effort on the harder class boundaries that earlier trees misclassify. The built-in L1 and L2 regularisation in the objective function also prevents overfitting on the smaller balanced class in a way that dropout regularisation alone does not achieve for the FFNN. </w:t>
       </w:r>
-      <w:proofErr w:type="gramStart"/>
-      <w:r>
-        <w:rPr>
-          <w:szCs w:val="22"/>
-        </w:rPr>
-        <w:t>Both of these</w:t>
-      </w:r>
-      <w:proofErr w:type="gramEnd"/>
+      <w:r>
+        <w:rPr>
+          <w:szCs w:val="22"/>
+        </w:rPr>
+        <w:t>Both</w:t>
+      </w:r>
       <w:r>
         <w:rPr>
           <w:szCs w:val="22"/>
@@ -6360,21 +8701,7 @@
         <w:rPr>
           <w:szCs w:val="22"/>
         </w:rPr>
-        <w:t xml:space="preserve">The 1.4 percentage point gap between RF and FFNN is consistent with the theoretical expectation from </w:t>
-      </w:r>
-      <w:proofErr w:type="spellStart"/>
-      <w:r>
-        <w:rPr>
-          <w:szCs w:val="22"/>
-        </w:rPr>
-        <w:t>Grinsztajn</w:t>
-      </w:r>
-      <w:proofErr w:type="spellEnd"/>
-      <w:r>
-        <w:rPr>
-          <w:szCs w:val="22"/>
-        </w:rPr>
-        <w:t xml:space="preserve"> et al. (2022). The 5.7 point gap between </w:t>
+        <w:t xml:space="preserve">The 1.4 percentage point gap between RF and FFNN is consistent with the theoretical expectation from Grinsztajn et al. (2022). The 5.7 point gap between </w:t>
       </w:r>
       <w:proofErr w:type="spellStart"/>
       <w:r>
@@ -7044,21 +9371,7 @@
         <w:rPr>
           <w:szCs w:val="22"/>
         </w:rPr>
-        <w:t xml:space="preserve">Third, no external ground truth exists for the labelling methodology. Confidence in the </w:t>
-      </w:r>
-      <w:proofErr w:type="gramStart"/>
-      <w:r>
-        <w:rPr>
-          <w:szCs w:val="22"/>
-        </w:rPr>
-        <w:t>labels</w:t>
-      </w:r>
-      <w:proofErr w:type="gramEnd"/>
-      <w:r>
-        <w:rPr>
-          <w:szCs w:val="22"/>
-        </w:rPr>
-        <w:t xml:space="preserve"> rests on internal evidence: a roughly balanced class distribution, cross-model agreement of approximately 87%, and feature importance rankings that align with domain knowledge. A formal user study comparing model predictions against self-reported playing styles would provide stronger validation and remains an item of future work.</w:t>
+        <w:t>Third, no external ground truth exists for the labelling methodology. Confidence in the labels rests on internal evidence: a roughly balanced class distribution, cross-model agreement of approximately 87%, and feature importance rankings that align with domain knowledge. A formal user study comparing model predictions against self-reported playing styles would provide stronger validation and remains an item of future work.</w:t>
       </w:r>
     </w:p>
     <w:p>
@@ -7079,34 +9392,32 @@
         <w:rPr>
           <w:szCs w:val="22"/>
         </w:rPr>
-        <w:t>This project set out to automatically classify chess playing styles from game data and make the results accessible through a web interface. The labelled dataset constructed in Stage 1 exhibits a balanced class distribution and high cross-model agreement, providing internal confidence in the validity of the labelling methodology despite the absence of an external benchmark.</w:t>
-      </w:r>
-    </w:p>
-    <w:p>
-      <w:pPr>
-        <w:rPr>
-          <w:szCs w:val="22"/>
-        </w:rPr>
-      </w:pPr>
-      <w:r>
-        <w:rPr>
-          <w:szCs w:val="22"/>
-        </w:rPr>
-        <w:t>The Random Forest (91.2%) outperformed the FFNN (89.8%) on the classification task, consistent with the established finding that tree-based models generalise better than neural networks on tabular data with heterogeneous features (</w:t>
-      </w:r>
-      <w:proofErr w:type="spellStart"/>
-      <w:r>
-        <w:rPr>
-          <w:szCs w:val="22"/>
-        </w:rPr>
-        <w:t>Grinsztajn</w:t>
-      </w:r>
-      <w:proofErr w:type="spellEnd"/>
-      <w:r>
-        <w:rPr>
-          <w:szCs w:val="22"/>
-        </w:rPr>
-        <w:t xml:space="preserve"> et al., 2022). </w:t>
+        <w:t xml:space="preserve">This project set out to automatically classify chess playing styles from game data and make the results accessible through a web interface. The labelled dataset constructed in Stage 1 </w:t>
+      </w:r>
+      <w:r>
+        <w:rPr>
+          <w:szCs w:val="22"/>
+        </w:rPr>
+        <w:t>shows</w:t>
+      </w:r>
+      <w:r>
+        <w:rPr>
+          <w:szCs w:val="22"/>
+        </w:rPr>
+        <w:t xml:space="preserve"> a balanced class distribution and high cross-model agreement, providing internal confidence in the validity of the labelling methodology despite the absence of an external benchmark.</w:t>
+      </w:r>
+    </w:p>
+    <w:p>
+      <w:pPr>
+        <w:rPr>
+          <w:szCs w:val="22"/>
+        </w:rPr>
+      </w:pPr>
+      <w:r>
+        <w:rPr>
+          <w:szCs w:val="22"/>
+        </w:rPr>
+        <w:t xml:space="preserve">The Random Forest (91.2%) outperformed the FFNN (89.8%) on the classification task, consistent with the established finding that tree-based models generalise better than neural networks on tabular data with heterogeneous features (Grinsztajn et al., 2022). </w:t>
       </w:r>
       <w:proofErr w:type="spellStart"/>
       <w:r>

</xml_diff>